<commit_message>
docs: add project schedule Gantt chart deliverables, recompile report PDF
Populate a TeamGantt Excel template and generate MSPDI XML/CSV exports
of the WP1-WP7 schedule matching the report's Gantt figure, and
recompile the LaTeX report to the latest revision.

Co-Authored-By: Claude Sonnet 5 <noreply@anthropic.com>
</commit_message>
<xml_diff>
--- a/final report/Spot_To_Go_Final_Report.docx
+++ b/final report/Spot_To_Go_Final_Report.docx
@@ -8,8 +8,6 @@
           <w:rFonts w:ascii="Times New Roman" w:hAnsi="Times New Roman" w:cs="Times New Roman"/>
         </w:rPr>
       </w:pPr>
-      <w:bookmarkStart w:id="0" w:name="_GoBack"/>
-      <w:bookmarkEnd w:id="0"/>
     </w:p>
     <w:p>
       <w:pPr>
@@ -22,6 +20,7 @@
     <w:p>
       <w:pPr>
         <w:pStyle w:val="Title"/>
+        <w:jc w:val="center"/>
       </w:pPr>
       <w:r>
         <w:t xml:space="preserve">Spot </w:t>
@@ -48,14 +47,25 @@
     <w:p>
       <w:pPr>
         <w:pStyle w:val="Subtitle"/>
-      </w:pPr>
-      <w:r>
-        <w:t>Maiusana Suthesan</w:t>
-      </w:r>
-    </w:p>
-    <w:p>
-      <w:pPr>
         <w:jc w:val="center"/>
+      </w:pPr>
+      <w:proofErr w:type="spellStart"/>
+      <w:r>
+        <w:t>Maiusana</w:t>
+      </w:r>
+      <w:proofErr w:type="spellEnd"/>
+      <w:r>
+        <w:t xml:space="preserve"> </w:t>
+      </w:r>
+      <w:proofErr w:type="spellStart"/>
+      <w:r>
+        <w:t>Suthesan</w:t>
+      </w:r>
+      <w:proofErr w:type="spellEnd"/>
+    </w:p>
+    <w:p>
+      <w:pPr>
+        <w:jc w:val="center"/>
         <w:rPr>
           <w:rFonts w:ascii="Times New Roman" w:hAnsi="Times New Roman" w:cs="Times New Roman"/>
         </w:rPr>
@@ -162,7 +172,13 @@
         <w:rPr>
           <w:rFonts w:ascii="Times New Roman" w:hAnsi="Times New Roman" w:cs="Times New Roman"/>
         </w:rPr>
-        <w:t>School of Computing Sciences, University of East Anglia, 2024/25</w:t>
+        <w:t xml:space="preserve">School of Computing Sciences, University </w:t>
+      </w:r>
+      <w:r>
+        <w:rPr>
+          <w:rFonts w:ascii="Times New Roman" w:hAnsi="Times New Roman" w:cs="Times New Roman"/>
+        </w:rPr>
+        <w:t>of East Anglia, 2025/26</w:t>
       </w:r>
     </w:p>
     <w:p>
@@ -175,7 +191,7 @@
           <w:szCs w:val="28"/>
         </w:rPr>
       </w:pPr>
-      <w:bookmarkStart w:id="1" w:name="statement-of-ai-usage"/>
+      <w:bookmarkStart w:id="0" w:name="statement-of-ai-usage"/>
     </w:p>
     <w:p>
       <w:pPr>
@@ -249,7 +265,23 @@
           <w:rFonts w:ascii="Times New Roman" w:hAnsi="Times New Roman" w:cs="Times New Roman"/>
           <w:highlight w:val="green"/>
         </w:rPr>
-        <w:t xml:space="preserve"> Go, an Android application that connects a live, location-aware map of nearby restaurants to a direct preview of video footage from each venue in turn. The application is coded in Kotlin with Jetpack Compose and Navigation Compose, accesses the user's location through the Fused Location Provider, renders locations via the Google Maps SDK, and requires live Firebase Authentication to unlock the experience. Video previews and directions are passed off to the relevant platform app using Android intents. This document restates the project aim and objectives, revisits the literature, describes the system design, and analyses the implementation and testing completed. There are eleven screens fully implemented and integrated, restaurant discovery now runs against live data from the Google Places API rather than a placeholder list, and the authentication process has been thoroughly tested end-to-end on a real device.</w:t>
+        <w:t xml:space="preserve"> Go, an Android application that connects a live, location-aware map of nearby restaurants to a direct preview of video footage from each venue in turn. The application is coded in </w:t>
+      </w:r>
+      <w:proofErr w:type="spellStart"/>
+      <w:r>
+        <w:rPr>
+          <w:rFonts w:ascii="Times New Roman" w:hAnsi="Times New Roman" w:cs="Times New Roman"/>
+          <w:highlight w:val="green"/>
+        </w:rPr>
+        <w:t>Kotlin</w:t>
+      </w:r>
+      <w:proofErr w:type="spellEnd"/>
+      <w:r>
+        <w:rPr>
+          <w:rFonts w:ascii="Times New Roman" w:hAnsi="Times New Roman" w:cs="Times New Roman"/>
+          <w:highlight w:val="green"/>
+        </w:rPr>
+        <w:t xml:space="preserve"> with Jetpack Compose and Navigation Compose, accesses the user's location through the Fused Location Provider, renders locations via the Google Maps SDK, and requires live Firebase Authentication to unlock the experience. Video previews and directions are passed off to the relevant platform app using Android intents. This document restates the project aim and objectives, revisits the literature, describes the system design, and analyses the implementation and testing completed. There are eleven screens fully implemented and integrated, restaurant discovery now runs against live data from the Google Places API rather than a placeholder list, and the authentication process has been thoroughly tested end-to-end on a real device.</w:t>
       </w:r>
     </w:p>
     <w:p>
@@ -350,64 +382,17 @@
           <w:szCs w:val="28"/>
         </w:rPr>
       </w:pPr>
-      <w:r>
+    </w:p>
+    <w:p>
+      <w:pPr>
+        <w:pStyle w:val="BodyText"/>
         <w:rPr>
           <w:rFonts w:ascii="Times New Roman" w:hAnsi="Times New Roman" w:cs="Times New Roman"/>
           <w:b/>
           <w:sz w:val="28"/>
           <w:szCs w:val="28"/>
         </w:rPr>
-        <w:t>Acknowledgements</w:t>
-      </w:r>
-    </w:p>
-    <w:p>
-      <w:pPr>
-        <w:pStyle w:val="FirstParagraph"/>
-        <w:rPr>
-          <w:rFonts w:ascii="Times New Roman" w:hAnsi="Times New Roman" w:cs="Times New Roman"/>
-        </w:rPr>
-      </w:pPr>
-      <w:r>
-        <w:rPr>
-          <w:rFonts w:ascii="Times New Roman" w:hAnsi="Times New Roman" w:cs="Times New Roman"/>
-        </w:rPr>
-        <w:t xml:space="preserve">I would like to express my gratitude to my project supervisor for their invaluable advice and guidance throughout the project, and, especially, for providing extremely useful feedback on the </w:t>
-      </w:r>
-      <w:r>
-        <w:rPr>
-          <w:rFonts w:ascii="Times New Roman" w:hAnsi="Times New Roman" w:cs="Times New Roman"/>
-        </w:rPr>
-        <w:lastRenderedPageBreak/>
-        <w:t>earlier draft of this report, which was instrumental for forming the structure of this report and its additions.</w:t>
-      </w:r>
-    </w:p>
-    <w:p>
-      <w:pPr>
-        <w:pStyle w:val="FirstParagraph"/>
-        <w:rPr>
-          <w:rFonts w:ascii="Times New Roman" w:hAnsi="Times New Roman" w:cs="Times New Roman"/>
-        </w:rPr>
-      </w:pPr>
-      <w:r>
-        <w:rPr>
-          <w:rFonts w:ascii="Times New Roman" w:hAnsi="Times New Roman" w:cs="Times New Roman"/>
-        </w:rPr>
-        <w:t>I would like to thank my family and friends for their patience and support during this work, as well as the Android developer community as a whole for its freely available resources and documentation.</w:t>
-      </w:r>
-    </w:p>
-    <w:p>
-      <w:pPr>
-        <w:pStyle w:val="FirstParagraph"/>
-        <w:rPr>
-          <w:rFonts w:ascii="Times New Roman" w:hAnsi="Times New Roman" w:cs="Times New Roman"/>
-        </w:rPr>
-      </w:pPr>
-      <w:r>
-        <w:rPr>
-          <w:rFonts w:ascii="Times New Roman" w:hAnsi="Times New Roman" w:cs="Times New Roman"/>
-        </w:rPr>
-        <w:t>Finally, I would like to express my gratitude to the developer tools and services that helped me build this application — to Android Studio, Google Maps/Places Platform, and Firebase services.</w:t>
-      </w:r>
+      </w:pPr>
     </w:p>
     <w:p>
       <w:pPr>
@@ -430,17 +415,58 @@
           <w:szCs w:val="28"/>
         </w:rPr>
       </w:pPr>
-    </w:p>
-    <w:p>
-      <w:pPr>
-        <w:pStyle w:val="BodyText"/>
+      <w:r>
         <w:rPr>
           <w:rFonts w:ascii="Times New Roman" w:hAnsi="Times New Roman" w:cs="Times New Roman"/>
           <w:b/>
           <w:sz w:val="28"/>
           <w:szCs w:val="28"/>
         </w:rPr>
-      </w:pPr>
+        <w:lastRenderedPageBreak/>
+        <w:t>Acknowledgements</w:t>
+      </w:r>
+    </w:p>
+    <w:p>
+      <w:pPr>
+        <w:pStyle w:val="FirstParagraph"/>
+        <w:rPr>
+          <w:rFonts w:ascii="Times New Roman" w:hAnsi="Times New Roman" w:cs="Times New Roman"/>
+        </w:rPr>
+      </w:pPr>
+      <w:r>
+        <w:rPr>
+          <w:rFonts w:ascii="Times New Roman" w:hAnsi="Times New Roman" w:cs="Times New Roman"/>
+        </w:rPr>
+        <w:t>I would like to express my gratitude to my project supervisor for their invaluable advice and guidance throughout the project, and, especially, for providing extremely useful feedback on the earlier draft of this report, which was instrumental for forming the structure of this report and its additions.</w:t>
+      </w:r>
+    </w:p>
+    <w:p>
+      <w:pPr>
+        <w:pStyle w:val="FirstParagraph"/>
+        <w:rPr>
+          <w:rFonts w:ascii="Times New Roman" w:hAnsi="Times New Roman" w:cs="Times New Roman"/>
+        </w:rPr>
+      </w:pPr>
+      <w:r>
+        <w:rPr>
+          <w:rFonts w:ascii="Times New Roman" w:hAnsi="Times New Roman" w:cs="Times New Roman"/>
+        </w:rPr>
+        <w:t>I would like to thank my family and friends for their patience and support during this work, as well as the Android developer community as a whole for its freely available resources and documentation.</w:t>
+      </w:r>
+    </w:p>
+    <w:p>
+      <w:pPr>
+        <w:pStyle w:val="FirstParagraph"/>
+        <w:rPr>
+          <w:rFonts w:ascii="Times New Roman" w:hAnsi="Times New Roman" w:cs="Times New Roman"/>
+        </w:rPr>
+      </w:pPr>
+      <w:r>
+        <w:rPr>
+          <w:rFonts w:ascii="Times New Roman" w:hAnsi="Times New Roman" w:cs="Times New Roman"/>
+        </w:rPr>
+        <w:t>Finally, I would like to express my gratitude to the developer tools and services that helped me build this application — to Android Studio, Google Maps/Places Platform, and Firebase services.</w:t>
+      </w:r>
     </w:p>
     <w:p>
       <w:pPr>
@@ -551,13 +577,47 @@
           <w:szCs w:val="28"/>
         </w:rPr>
       </w:pPr>
-      <w:r>
+    </w:p>
+    <w:p>
+      <w:pPr>
+        <w:pStyle w:val="BodyText"/>
         <w:rPr>
           <w:rFonts w:ascii="Times New Roman" w:hAnsi="Times New Roman" w:cs="Times New Roman"/>
           <w:b/>
           <w:sz w:val="28"/>
           <w:szCs w:val="28"/>
         </w:rPr>
+      </w:pPr>
+    </w:p>
+    <w:p>
+      <w:pPr>
+        <w:pStyle w:val="BodyText"/>
+        <w:rPr>
+          <w:rFonts w:ascii="Times New Roman" w:hAnsi="Times New Roman" w:cs="Times New Roman"/>
+          <w:b/>
+          <w:sz w:val="28"/>
+          <w:szCs w:val="28"/>
+        </w:rPr>
+      </w:pPr>
+    </w:p>
+    <w:p>
+      <w:pPr>
+        <w:pStyle w:val="BodyText"/>
+        <w:rPr>
+          <w:rFonts w:ascii="Times New Roman" w:hAnsi="Times New Roman" w:cs="Times New Roman"/>
+          <w:b/>
+          <w:sz w:val="28"/>
+          <w:szCs w:val="28"/>
+        </w:rPr>
+      </w:pPr>
+      <w:r>
+        <w:rPr>
+          <w:rFonts w:ascii="Times New Roman" w:hAnsi="Times New Roman" w:cs="Times New Roman"/>
+          <w:b/>
+          <w:sz w:val="28"/>
+          <w:szCs w:val="28"/>
+        </w:rPr>
+        <w:lastRenderedPageBreak/>
         <w:t>Statement of AI Usage</w:t>
       </w:r>
     </w:p>
@@ -572,14 +632,21 @@
         <w:rPr>
           <w:rFonts w:ascii="Times New Roman" w:hAnsi="Times New Roman" w:cs="Times New Roman"/>
         </w:rPr>
-        <w:t xml:space="preserve">AI tools have been used in a supportive role throughout the project for research, brainstorming, structuring my thoughts on possible technical solutions, and outlining the structure of this report. </w:t>
-      </w:r>
-      <w:r>
-        <w:rPr>
-          <w:rFonts w:ascii="Times New Roman" w:hAnsi="Times New Roman" w:cs="Times New Roman"/>
-        </w:rPr>
-        <w:lastRenderedPageBreak/>
-        <w:t xml:space="preserve">All of the written material is reviewed and written by myself and I take full responsibility for it. Separate from this document and independent of how it was written, Spot To Go uses the Google Gemini API to provide the natural-language “agentic” search bar that parses user's query into structured search filters in real-time. This is a deliberate technical decision made when designing Spot </w:t>
+        <w:t>AI tools have been used in a supportive role throughout the project for research, brainstorming, structuring my thoughts on possible technical solutions, and outlining the structure of this report. All of the written material is reviewed and written by myself and I take full responsibility for it. Separate from this document and independent of how it was written, Spot To Go uses the Google Gemini API to provide the natural-language “</w:t>
+      </w:r>
+      <w:proofErr w:type="spellStart"/>
+      <w:r>
+        <w:rPr>
+          <w:rFonts w:ascii="Times New Roman" w:hAnsi="Times New Roman" w:cs="Times New Roman"/>
+        </w:rPr>
+        <w:t>agentic</w:t>
+      </w:r>
+      <w:proofErr w:type="spellEnd"/>
+      <w:r>
+        <w:rPr>
+          <w:rFonts w:ascii="Times New Roman" w:hAnsi="Times New Roman" w:cs="Times New Roman"/>
+        </w:rPr>
+        <w:t xml:space="preserve">” search bar that parses user's query into structured search filters in real-time. This is a deliberate technical decision made when designing Spot </w:t>
       </w:r>
       <w:proofErr w:type="gramStart"/>
       <w:r>
@@ -671,10 +738,15 @@
         <w:pStyle w:val="BodyText"/>
       </w:pPr>
     </w:p>
-    <w:bookmarkEnd w:id="1" w:displacedByCustomXml="next"/>
-    <w:bookmarkStart w:id="2" w:name="introduction" w:displacedByCustomXml="next"/>
+    <w:bookmarkEnd w:id="0" w:displacedByCustomXml="next"/>
+    <w:bookmarkStart w:id="1" w:name="introduction" w:displacedByCustomXml="next"/>
     <w:sdt>
       <w:sdtPr>
+        <w:rPr>
+          <w:rFonts w:asciiTheme="minorHAnsi" w:eastAsiaTheme="minorEastAsia" w:hAnsiTheme="minorHAnsi" w:cstheme="minorBidi"/>
+          <w:sz w:val="24"/>
+          <w:szCs w:val="24"/>
+        </w:rPr>
         <w:id w:val="-929578339"/>
         <w:docPartObj>
           <w:docPartGallery w:val="Table of Contents"/>
@@ -683,12 +755,9 @@
       </w:sdtPr>
       <w:sdtEndPr>
         <w:rPr>
-          <w:rFonts w:asciiTheme="minorHAnsi" w:eastAsiaTheme="minorEastAsia" w:hAnsiTheme="minorHAnsi" w:cstheme="minorBidi"/>
           <w:b/>
           <w:bCs/>
           <w:noProof/>
-          <w:sz w:val="24"/>
-          <w:szCs w:val="24"/>
         </w:rPr>
       </w:sdtEndPr>
       <w:sdtContent>
@@ -4012,109 +4081,145 @@
       <w:pPr>
         <w:pStyle w:val="Heading1"/>
       </w:pPr>
+      <w:bookmarkStart w:id="2" w:name="_Toc237982781"/>
       <w:bookmarkStart w:id="3" w:name="aim-and-objectives"/>
-      <w:bookmarkStart w:id="4" w:name="_Toc237982781"/>
+      <w:bookmarkEnd w:id="1"/>
+      <w:r>
+        <w:lastRenderedPageBreak/>
+        <w:t>Introduction</w:t>
+      </w:r>
       <w:bookmarkEnd w:id="2"/>
       <w:r>
-        <w:t>Introduction</w:t>
+        <w:t xml:space="preserve"> </w:t>
+      </w:r>
+    </w:p>
+    <w:p>
+      <w:pPr>
+        <w:pStyle w:val="Heading1"/>
+        <w:rPr>
+          <w:rFonts w:cs="Times New Roman"/>
+        </w:rPr>
+      </w:pPr>
+      <w:bookmarkStart w:id="4" w:name="_Toc237982782"/>
+      <w:r>
+        <w:rPr>
+          <w:rFonts w:cs="Times New Roman"/>
+        </w:rPr>
+        <w:t>Overview</w:t>
       </w:r>
       <w:bookmarkEnd w:id="4"/>
       <w:r>
+        <w:rPr>
+          <w:rFonts w:cs="Times New Roman"/>
+        </w:rPr>
         <w:t xml:space="preserve"> </w:t>
       </w:r>
     </w:p>
     <w:p>
       <w:pPr>
+        <w:pStyle w:val="FirstParagraph"/>
+        <w:rPr>
+          <w:rFonts w:ascii="Times New Roman" w:hAnsi="Times New Roman" w:cs="Times New Roman"/>
+        </w:rPr>
+      </w:pPr>
+      <w:r>
+        <w:rPr>
+          <w:rFonts w:ascii="Times New Roman" w:hAnsi="Times New Roman" w:cs="Times New Roman"/>
+        </w:rPr>
+        <w:t xml:space="preserve">This report documents the design, implementation, and current progress of the “Spot </w:t>
+      </w:r>
+      <w:proofErr w:type="gramStart"/>
+      <w:r>
+        <w:rPr>
+          <w:rFonts w:ascii="Times New Roman" w:hAnsi="Times New Roman" w:cs="Times New Roman"/>
+        </w:rPr>
+        <w:t>To</w:t>
+      </w:r>
+      <w:proofErr w:type="gramEnd"/>
+      <w:r>
+        <w:rPr>
+          <w:rFonts w:ascii="Times New Roman" w:hAnsi="Times New Roman" w:cs="Times New Roman"/>
+        </w:rPr>
+        <w:t xml:space="preserve"> Go” Android application that allows users to explore nearby restaurants on a live map and watch real-life video previews of them before making a choice where to go. The report comes after the dissertation proposal and depicts the current state of the system developed rather than the one initially proposed.</w:t>
+      </w:r>
+    </w:p>
+    <w:p>
+      <w:pPr>
+        <w:pStyle w:val="Title"/>
+      </w:pPr>
+      <w:bookmarkStart w:id="5" w:name="_Toc237982783"/>
+      <w:r>
+        <w:t>Background and Context</w:t>
+      </w:r>
+      <w:bookmarkEnd w:id="5"/>
+      <w:r>
+        <w:t xml:space="preserve"> </w:t>
+      </w:r>
+    </w:p>
+    <w:p>
+      <w:pPr>
+        <w:pStyle w:val="FirstParagraph"/>
+        <w:rPr>
+          <w:rFonts w:ascii="Times New Roman" w:hAnsi="Times New Roman" w:cs="Times New Roman"/>
+        </w:rPr>
+      </w:pPr>
+      <w:r>
+        <w:rPr>
+          <w:rFonts w:ascii="Times New Roman" w:hAnsi="Times New Roman" w:cs="Times New Roman"/>
+        </w:rPr>
+        <w:t xml:space="preserve">As the devices that people use change, so do the ways in which they choose places to dine at. Nowadays, a smartphone serves as an intermediary between the diner and the decision-making process from location discovery through comparison to reading reviews and navigation to the selected place. Location-based services that provide information according to the real-world location of the device became the glue for all of these processes, while maps and place search platforms allow to expose that functionality through documented application programming interfaces (Google LLC 2024d, 2024b). Besides, the medium used to acquire and trust information about places has been changing as well. Short-form video clips that gained popularity through platforms such as </w:t>
+      </w:r>
+      <w:proofErr w:type="spellStart"/>
+      <w:r>
+        <w:rPr>
+          <w:rFonts w:ascii="Times New Roman" w:hAnsi="Times New Roman" w:cs="Times New Roman"/>
+        </w:rPr>
+        <w:t>TikTok</w:t>
+      </w:r>
+      <w:proofErr w:type="spellEnd"/>
+      <w:r>
+        <w:rPr>
+          <w:rFonts w:ascii="Times New Roman" w:hAnsi="Times New Roman" w:cs="Times New Roman"/>
+        </w:rPr>
+        <w:t xml:space="preserve">, </w:t>
+      </w:r>
+      <w:proofErr w:type="spellStart"/>
+      <w:r>
+        <w:rPr>
+          <w:rFonts w:ascii="Times New Roman" w:hAnsi="Times New Roman" w:cs="Times New Roman"/>
+        </w:rPr>
+        <w:t>Instagram</w:t>
+      </w:r>
+      <w:proofErr w:type="spellEnd"/>
+      <w:r>
+        <w:rPr>
+          <w:rFonts w:ascii="Times New Roman" w:hAnsi="Times New Roman" w:cs="Times New Roman"/>
+        </w:rPr>
+        <w:t xml:space="preserve"> Reels, and YouTube Shorts have become one of the most widely consumed media types, taking a large share of people's media time (Kemp 2024; </w:t>
+      </w:r>
+      <w:proofErr w:type="spellStart"/>
+      <w:r>
+        <w:rPr>
+          <w:rFonts w:ascii="Times New Roman" w:hAnsi="Times New Roman" w:cs="Times New Roman"/>
+        </w:rPr>
+        <w:t>Montag</w:t>
+      </w:r>
+      <w:proofErr w:type="spellEnd"/>
+      <w:r>
+        <w:rPr>
+          <w:rFonts w:ascii="Times New Roman" w:hAnsi="Times New Roman" w:cs="Times New Roman"/>
+        </w:rPr>
+        <w:t xml:space="preserve"> et al. 2021). When it comes to the decision about a restaurant to go to, fifteen seconds of real-life view of the room, plates, and people in it communicate a lot more than just an average rating.</w:t>
+      </w:r>
+    </w:p>
+    <w:p>
+      <w:pPr>
         <w:pStyle w:val="Heading1"/>
         <w:rPr>
           <w:rFonts w:cs="Times New Roman"/>
         </w:rPr>
       </w:pPr>
-      <w:bookmarkStart w:id="5" w:name="_Toc237982782"/>
-      <w:r>
-        <w:rPr>
-          <w:rFonts w:cs="Times New Roman"/>
-        </w:rPr>
-        <w:t>Overview</w:t>
-      </w:r>
-      <w:bookmarkEnd w:id="5"/>
-      <w:r>
-        <w:rPr>
-          <w:rFonts w:cs="Times New Roman"/>
-        </w:rPr>
-        <w:t xml:space="preserve"> </w:t>
-      </w:r>
-    </w:p>
-    <w:p>
-      <w:pPr>
-        <w:pStyle w:val="FirstParagraph"/>
-        <w:rPr>
-          <w:rFonts w:ascii="Times New Roman" w:hAnsi="Times New Roman" w:cs="Times New Roman"/>
-        </w:rPr>
-      </w:pPr>
-      <w:r>
-        <w:rPr>
-          <w:rFonts w:ascii="Times New Roman" w:hAnsi="Times New Roman" w:cs="Times New Roman"/>
-        </w:rPr>
-        <w:t xml:space="preserve">This report documents the design, implementation, and current progress of the “Spot </w:t>
-      </w:r>
-      <w:proofErr w:type="gramStart"/>
-      <w:r>
-        <w:rPr>
-          <w:rFonts w:ascii="Times New Roman" w:hAnsi="Times New Roman" w:cs="Times New Roman"/>
-        </w:rPr>
-        <w:t>To</w:t>
-      </w:r>
-      <w:proofErr w:type="gramEnd"/>
-      <w:r>
-        <w:rPr>
-          <w:rFonts w:ascii="Times New Roman" w:hAnsi="Times New Roman" w:cs="Times New Roman"/>
-        </w:rPr>
-        <w:t xml:space="preserve"> Go” Android application that allows users to explore nearby restaurants on a live map and watch real-life video previews of them before making a choice where to go. The report comes after the </w:t>
-      </w:r>
-      <w:r>
-        <w:rPr>
-          <w:rFonts w:ascii="Times New Roman" w:hAnsi="Times New Roman" w:cs="Times New Roman"/>
-        </w:rPr>
-        <w:lastRenderedPageBreak/>
-        <w:t>dissertation proposal and depicts the current state of the system developed rather than the one initially proposed.</w:t>
-      </w:r>
-    </w:p>
-    <w:p>
-      <w:pPr>
-        <w:pStyle w:val="Title"/>
-      </w:pPr>
-      <w:bookmarkStart w:id="6" w:name="_Toc237982783"/>
-      <w:r>
-        <w:t>Background and Context</w:t>
-      </w:r>
-      <w:bookmarkEnd w:id="6"/>
-      <w:r>
-        <w:t xml:space="preserve"> </w:t>
-      </w:r>
-    </w:p>
-    <w:p>
-      <w:pPr>
-        <w:pStyle w:val="FirstParagraph"/>
-        <w:rPr>
-          <w:rFonts w:ascii="Times New Roman" w:hAnsi="Times New Roman" w:cs="Times New Roman"/>
-        </w:rPr>
-      </w:pPr>
-      <w:r>
-        <w:rPr>
-          <w:rFonts w:ascii="Times New Roman" w:hAnsi="Times New Roman" w:cs="Times New Roman"/>
-        </w:rPr>
-        <w:t>As the devices that people use change, so do the ways in which they choose places to dine at. Nowadays, a smartphone serves as an intermediary between the diner and the decision-making process from location discovery through comparison to reading reviews and navigation to the selected place. Location-based services that provide information according to the real-world location of the device became the glue for all of these processes, while maps and place search platforms allow to expose that functionality through documented application programming interfaces (Google LLC 2024d, 2024b). Besides, the medium used to acquire and trust information about places has been changing as well. Short-form video clips that gained popularity through platforms such as TikTok, Instagram Reels, and YouTube Shorts have become one of the most widely consumed media types, taking a large share of people's media time (Kemp 2024; Montag et al. 2021). When it comes to the decision about a restaurant to go to, fifteen seconds of real-life view of the room, plates, and people in it communicate a lot more than just an average rating.</w:t>
-      </w:r>
-    </w:p>
-    <w:p>
-      <w:pPr>
-        <w:pStyle w:val="Heading1"/>
-        <w:rPr>
-          <w:rFonts w:cs="Times New Roman"/>
-        </w:rPr>
-      </w:pPr>
-      <w:bookmarkStart w:id="7" w:name="_Toc237982784"/>
+      <w:bookmarkStart w:id="6" w:name="_Toc237982784"/>
       <w:r>
         <w:rPr>
           <w:rFonts w:cs="Times New Roman"/>
@@ -4122,11 +4227,97 @@
         <w:lastRenderedPageBreak/>
         <w:t>Problem Statement</w:t>
       </w:r>
+      <w:bookmarkEnd w:id="6"/>
+      <w:r>
+        <w:rPr>
+          <w:rFonts w:cs="Times New Roman"/>
+        </w:rPr>
+        <w:t xml:space="preserve"> </w:t>
+      </w:r>
+    </w:p>
+    <w:p>
+      <w:pPr>
+        <w:pStyle w:val="Abstract"/>
+        <w:rPr>
+          <w:b/>
+        </w:rPr>
+      </w:pPr>
+      <w:r>
+        <w:rPr>
+          <w:rFonts w:ascii="Times New Roman" w:hAnsi="Times New Roman" w:cs="Times New Roman"/>
+        </w:rPr>
+        <w:t>The main issue addressed in this project lies in the discrepancy between the information about restaurants offered by discovery platforms and the impressions people receive from them. The current discovery platforms feature restaurants mostly in terms of numerical star ratings and short text reviews. They both represent a very complex experience by a single number and several sentences, fail to convey the atmosphere, portions' sizes, dishes presentation and overall impression of the place. Particularly, star ratings eliminate from the review all the details that should be taken into account, while text reviews are both inconvenient to read and easy to distrust (</w:t>
+      </w:r>
+      <w:proofErr w:type="spellStart"/>
+      <w:r>
+        <w:rPr>
+          <w:rFonts w:ascii="Times New Roman" w:hAnsi="Times New Roman" w:cs="Times New Roman"/>
+        </w:rPr>
+        <w:t>Dellarocas</w:t>
+      </w:r>
+      <w:proofErr w:type="spellEnd"/>
+      <w:r>
+        <w:rPr>
+          <w:rFonts w:ascii="Times New Roman" w:hAnsi="Times New Roman" w:cs="Times New Roman"/>
+        </w:rPr>
+        <w:t xml:space="preserve"> 2003; Cheung et al. 2009). On the other hand, short-form video has become one of the most believable and efficient ways of communication of the experience people receive in a real life, showing rather than telling it (Kaplan and </w:t>
+      </w:r>
+      <w:proofErr w:type="spellStart"/>
+      <w:r>
+        <w:rPr>
+          <w:rFonts w:ascii="Times New Roman" w:hAnsi="Times New Roman" w:cs="Times New Roman"/>
+        </w:rPr>
+        <w:t>Haenlein</w:t>
+      </w:r>
+      <w:proofErr w:type="spellEnd"/>
+      <w:r>
+        <w:rPr>
+          <w:rFonts w:ascii="Times New Roman" w:hAnsi="Times New Roman" w:cs="Times New Roman"/>
+        </w:rPr>
+        <w:t xml:space="preserve"> 2010; </w:t>
+      </w:r>
+      <w:proofErr w:type="spellStart"/>
+      <w:r>
+        <w:rPr>
+          <w:rFonts w:ascii="Times New Roman" w:hAnsi="Times New Roman" w:cs="Times New Roman"/>
+        </w:rPr>
+        <w:t>Montag</w:t>
+      </w:r>
+      <w:proofErr w:type="spellEnd"/>
+      <w:r>
+        <w:rPr>
+          <w:rFonts w:ascii="Times New Roman" w:hAnsi="Times New Roman" w:cs="Times New Roman"/>
+        </w:rPr>
+        <w:t xml:space="preserve"> et al. 2021). Yet, mainstream restaurant-discovery apps don't allow a user to combine a real video with a map and "go there" button, forcing him or her to leave the map, use a separate video app and manually search for the video. Thus, the Spot </w:t>
+      </w:r>
+      <w:proofErr w:type="gramStart"/>
+      <w:r>
+        <w:rPr>
+          <w:rFonts w:ascii="Times New Roman" w:hAnsi="Times New Roman" w:cs="Times New Roman"/>
+        </w:rPr>
+        <w:t>To</w:t>
+      </w:r>
+      <w:proofErr w:type="gramEnd"/>
+      <w:r>
+        <w:rPr>
+          <w:rFonts w:ascii="Times New Roman" w:hAnsi="Times New Roman" w:cs="Times New Roman"/>
+        </w:rPr>
+        <w:t xml:space="preserve"> Go project combines a live map of nearby restaurants and a direct access to a real video for each of them</w:t>
+      </w:r>
+      <w:r>
+        <w:t>.</w:t>
+      </w:r>
+    </w:p>
+    <w:p>
+      <w:pPr>
+        <w:pStyle w:val="Title"/>
+      </w:pPr>
+      <w:bookmarkStart w:id="7" w:name="_Toc237982785"/>
+      <w:r>
+        <w:t>Aim and Contributions</w:t>
+      </w:r>
       <w:bookmarkEnd w:id="7"/>
       <w:r>
-        <w:rPr>
-          <w:rFonts w:cs="Times New Roman"/>
-        </w:rPr>
         <w:t xml:space="preserve"> </w:t>
       </w:r>
     </w:p>
@@ -4134,58 +4325,28 @@
       <w:pPr>
         <w:pStyle w:val="Abstract"/>
         <w:rPr>
-          <w:b/>
-        </w:rPr>
-      </w:pPr>
-      <w:r>
-        <w:rPr>
-          <w:rFonts w:ascii="Times New Roman" w:hAnsi="Times New Roman" w:cs="Times New Roman"/>
-        </w:rPr>
-        <w:t xml:space="preserve">The main issue addressed in this project lies in the discrepancy between the information about restaurants offered by discovery platforms and the impressions people receive from them. The current discovery platforms feature restaurants mostly in terms of numerical star ratings and short text reviews. They both represent a very complex experience by a single number and several sentences, fail to convey the atmosphere, portions' sizes, dishes presentation and overall impression of the place. Particularly, star ratings eliminate from the review all the details that should be taken into account, while text reviews are both inconvenient to read and easy to distrust (Dellarocas 2003; Cheung et al. 2009). On the other hand, short-form video has become one of the most believable and efficient ways of communication of the experience people receive in a real life, showing rather than telling it (Kaplan and Haenlein 2010; Montag et al. 2021). Yet, mainstream restaurant-discovery apps don't allow a user to combine a real video with a map and "go there" button, forcing him or her to leave the map, use a separate video app and manually search for the video. Thus, the Spot </w:t>
-      </w:r>
-      <w:proofErr w:type="gramStart"/>
-      <w:r>
-        <w:rPr>
-          <w:rFonts w:ascii="Times New Roman" w:hAnsi="Times New Roman" w:cs="Times New Roman"/>
-        </w:rPr>
-        <w:t>To</w:t>
-      </w:r>
-      <w:proofErr w:type="gramEnd"/>
-      <w:r>
-        <w:rPr>
-          <w:rFonts w:ascii="Times New Roman" w:hAnsi="Times New Roman" w:cs="Times New Roman"/>
-        </w:rPr>
-        <w:t xml:space="preserve"> Go project combines a live map of nearby restaurants and a direct access to a real video for each of them</w:t>
-      </w:r>
-      <w:r>
-        <w:t>.</w:t>
-      </w:r>
-    </w:p>
-    <w:p>
-      <w:pPr>
-        <w:pStyle w:val="Title"/>
-      </w:pPr>
-      <w:bookmarkStart w:id="8" w:name="_Toc237982785"/>
-      <w:r>
-        <w:t>Aim and Contributions</w:t>
-      </w:r>
-      <w:bookmarkEnd w:id="8"/>
-      <w:r>
-        <w:t xml:space="preserve"> </w:t>
-      </w:r>
-    </w:p>
-    <w:p>
-      <w:pPr>
-        <w:pStyle w:val="Abstract"/>
-        <w:rPr>
-          <w:rFonts w:ascii="Times New Roman" w:hAnsi="Times New Roman" w:cs="Times New Roman"/>
-        </w:rPr>
-      </w:pPr>
-      <w:r>
-        <w:rPr>
-          <w:rFonts w:ascii="Times New Roman" w:hAnsi="Times New Roman" w:cs="Times New Roman"/>
-        </w:rPr>
-        <w:t>The aim of the project, fully specified in section 2, is to design and build an Android application that provides an integrated location-aware discovery of restaurants and video preview of them. This project contributes three practical things by meeting the aim: firstly, it develops an integrated Android application consisting of eleven screens built with modern technology stack (Kotlin and Jetpack Compose), secondly, it proves the idea of separation of UI and its data sources, allowing replacing of the placeholder data with the live Google Places API integration without redesigning any of the screens, thirdly, it provides an updated literature review and design of the application in terms of the standard UML and flowchart notation.</w:t>
+          <w:rFonts w:ascii="Times New Roman" w:hAnsi="Times New Roman" w:cs="Times New Roman"/>
+        </w:rPr>
+      </w:pPr>
+      <w:r>
+        <w:rPr>
+          <w:rFonts w:ascii="Times New Roman" w:hAnsi="Times New Roman" w:cs="Times New Roman"/>
+        </w:rPr>
+        <w:t>The aim of the project, fully specified in section 2, is to design and build an Android application that provides an integrated location-aware discovery of restaurants and video preview of them. This project contributes three practical things by meeting the aim: firstly, it develops an integrated Android application consisting of eleven screens built with modern technology stack (</w:t>
+      </w:r>
+      <w:proofErr w:type="spellStart"/>
+      <w:r>
+        <w:rPr>
+          <w:rFonts w:ascii="Times New Roman" w:hAnsi="Times New Roman" w:cs="Times New Roman"/>
+        </w:rPr>
+        <w:t>Kotlin</w:t>
+      </w:r>
+      <w:proofErr w:type="spellEnd"/>
+      <w:r>
+        <w:rPr>
+          <w:rFonts w:ascii="Times New Roman" w:hAnsi="Times New Roman" w:cs="Times New Roman"/>
+        </w:rPr>
+        <w:t xml:space="preserve"> and Jetpack Compose), secondly, it proves the idea of separation of UI and its data sources, allowing replacing of the placeholder data with the live Google Places API integration without redesigning any of the screens, thirdly, it provides an updated literature review and design of the application in terms of the standard UML and flowchart notation.</w:t>
       </w:r>
     </w:p>
     <w:p>
@@ -4205,6 +4366,15 @@
         <w:lastRenderedPageBreak/>
         <w:t>Report Structure This document restates the aim and objectives along with their current status (Section 2), revisits and updates the literature review (Section 3), describes the system designed with the help of UML and flowchart notation (Section 4) and implemented (Section 5), evaluates what has been tested (Section 6), analyses the risks and ethics in relation to the real authentication system and live API integrations (Section 7), and ends with the project schedule and what was completed in the final phase of work (Sections 8 and 9).</w:t>
       </w:r>
+      <w:r>
+        <w:rPr>
+          <w:rFonts w:ascii="Times New Roman" w:hAnsi="Times New Roman" w:cs="Times New Roman"/>
+          <w:highlight w:val="green"/>
+        </w:rPr>
+        <w:t xml:space="preserve"> </w:t>
+      </w:r>
+      <w:bookmarkStart w:id="8" w:name="_GoBack"/>
+      <w:bookmarkEnd w:id="8"/>
     </w:p>
     <w:p>
       <w:pPr>
@@ -4223,53 +4393,53 @@
           <w:rFonts w:ascii="Times New Roman" w:hAnsi="Times New Roman" w:cs="Times New Roman"/>
         </w:rPr>
       </w:pPr>
-      <w:bookmarkStart w:id="10" w:name="aim"/>
-      <w:bookmarkStart w:id="11" w:name="_Toc237982787"/>
+      <w:bookmarkStart w:id="10" w:name="_Toc237982787"/>
+      <w:bookmarkStart w:id="11" w:name="aim"/>
       <w:r>
         <w:rPr>
           <w:rFonts w:ascii="Times New Roman" w:hAnsi="Times New Roman" w:cs="Times New Roman"/>
         </w:rPr>
         <w:t>Aim</w:t>
       </w:r>
+      <w:bookmarkEnd w:id="10"/>
+    </w:p>
+    <w:p>
+      <w:pPr>
+        <w:pStyle w:val="FirstParagraph"/>
+        <w:rPr>
+          <w:rFonts w:ascii="Times New Roman" w:hAnsi="Times New Roman" w:cs="Times New Roman"/>
+        </w:rPr>
+      </w:pPr>
+      <w:r>
+        <w:rPr>
+          <w:rFonts w:ascii="Times New Roman" w:hAnsi="Times New Roman" w:cs="Times New Roman"/>
+        </w:rPr>
+        <w:t xml:space="preserve">The </w:t>
+      </w:r>
+      <w:r>
+        <w:rPr>
+          <w:rFonts w:ascii="Times New Roman" w:hAnsi="Times New Roman" w:cs="Times New Roman"/>
+        </w:rPr>
+        <w:t>aim of the project has not changed from what was stated in the proposal: to create and develop an Android application that will allow discovering nearby restaurants via interactive map-based interface and to receive video-based content related to those establishments.</w:t>
+      </w:r>
+    </w:p>
+    <w:p>
+      <w:pPr>
+        <w:pStyle w:val="Heading2"/>
+        <w:rPr>
+          <w:rFonts w:ascii="Times New Roman" w:hAnsi="Times New Roman" w:cs="Times New Roman"/>
+        </w:rPr>
+      </w:pPr>
+      <w:bookmarkStart w:id="12" w:name="_Toc237982788"/>
+      <w:bookmarkStart w:id="13" w:name="objectives-and-current-status"/>
       <w:bookmarkEnd w:id="11"/>
-    </w:p>
-    <w:p>
-      <w:pPr>
-        <w:pStyle w:val="FirstParagraph"/>
-        <w:rPr>
-          <w:rFonts w:ascii="Times New Roman" w:hAnsi="Times New Roman" w:cs="Times New Roman"/>
-        </w:rPr>
-      </w:pPr>
-      <w:r>
-        <w:rPr>
-          <w:rFonts w:ascii="Times New Roman" w:hAnsi="Times New Roman" w:cs="Times New Roman"/>
-        </w:rPr>
-        <w:t xml:space="preserve">The </w:t>
-      </w:r>
-      <w:r>
-        <w:rPr>
-          <w:rFonts w:ascii="Times New Roman" w:hAnsi="Times New Roman" w:cs="Times New Roman"/>
-        </w:rPr>
-        <w:t>aim of the project has not changed from what was stated in the proposal: to create and develop an Android application that will allow discovering nearby restaurants via interactive map-based interface and to receive video-based content related to those establishments.</w:t>
-      </w:r>
-    </w:p>
-    <w:p>
-      <w:pPr>
-        <w:pStyle w:val="Heading2"/>
-        <w:rPr>
-          <w:rFonts w:ascii="Times New Roman" w:hAnsi="Times New Roman" w:cs="Times New Roman"/>
-        </w:rPr>
-      </w:pPr>
-      <w:bookmarkStart w:id="12" w:name="objectives-and-current-status"/>
-      <w:bookmarkStart w:id="13" w:name="_Toc237982788"/>
-      <w:bookmarkEnd w:id="10"/>
       <w:r>
         <w:rPr>
           <w:rFonts w:ascii="Times New Roman" w:hAnsi="Times New Roman" w:cs="Times New Roman"/>
         </w:rPr>
         <w:t>Objectives and Current Status</w:t>
       </w:r>
-      <w:bookmarkEnd w:id="13"/>
+      <w:bookmarkEnd w:id="12"/>
     </w:p>
     <w:p>
       <w:pPr>
@@ -4414,7 +4584,21 @@
               <w:rPr>
                 <w:rFonts w:ascii="Times New Roman" w:hAnsi="Times New Roman" w:cs="Times New Roman"/>
               </w:rPr>
-              <w:t>Integrate the Google Maps SDK to render an interactive map centred on the user’s real-time GPS location.</w:t>
+              <w:t xml:space="preserve">Integrate the Google Maps SDK to render an interactive map </w:t>
+            </w:r>
+            <w:proofErr w:type="spellStart"/>
+            <w:r>
+              <w:rPr>
+                <w:rFonts w:ascii="Times New Roman" w:hAnsi="Times New Roman" w:cs="Times New Roman"/>
+              </w:rPr>
+              <w:t>centred</w:t>
+            </w:r>
+            <w:proofErr w:type="spellEnd"/>
+            <w:r>
+              <w:rPr>
+                <w:rFonts w:ascii="Times New Roman" w:hAnsi="Times New Roman" w:cs="Times New Roman"/>
+              </w:rPr>
+              <w:t xml:space="preserve"> on the user’s real-time GPS location.</w:t>
             </w:r>
           </w:p>
         </w:tc>
@@ -4614,7 +4798,21 @@
               <w:rPr>
                 <w:rFonts w:ascii="Times New Roman" w:hAnsi="Times New Roman" w:cs="Times New Roman"/>
               </w:rPr>
-              <w:t>Integrate video content from YouTube or TikTok per restaurant.</w:t>
+              <w:t xml:space="preserve">Integrate video content from YouTube or </w:t>
+            </w:r>
+            <w:proofErr w:type="spellStart"/>
+            <w:r>
+              <w:rPr>
+                <w:rFonts w:ascii="Times New Roman" w:hAnsi="Times New Roman" w:cs="Times New Roman"/>
+              </w:rPr>
+              <w:t>TikTok</w:t>
+            </w:r>
+            <w:proofErr w:type="spellEnd"/>
+            <w:r>
+              <w:rPr>
+                <w:rFonts w:ascii="Times New Roman" w:hAnsi="Times New Roman" w:cs="Times New Roman"/>
+              </w:rPr>
+              <w:t xml:space="preserve"> per restaurant.</w:t>
             </w:r>
           </w:p>
         </w:tc>
@@ -4870,17 +5068,17 @@
           <w:rFonts w:cs="Times New Roman"/>
         </w:rPr>
       </w:pPr>
-      <w:bookmarkStart w:id="14" w:name="critical-review-of-related-literature"/>
-      <w:bookmarkStart w:id="15" w:name="_Toc237982789"/>
+      <w:bookmarkStart w:id="14" w:name="_Toc237982789"/>
+      <w:bookmarkStart w:id="15" w:name="critical-review-of-related-literature"/>
       <w:bookmarkEnd w:id="3"/>
-      <w:bookmarkEnd w:id="12"/>
+      <w:bookmarkEnd w:id="13"/>
       <w:r>
         <w:rPr>
           <w:rFonts w:cs="Times New Roman"/>
         </w:rPr>
         <w:t>Critical Review of Related Literature</w:t>
       </w:r>
-      <w:bookmarkEnd w:id="15"/>
+      <w:bookmarkEnd w:id="14"/>
     </w:p>
     <w:p>
       <w:pPr>
@@ -4923,60 +5121,96 @@
           <w:rFonts w:ascii="Times New Roman" w:hAnsi="Times New Roman" w:cs="Times New Roman"/>
         </w:rPr>
       </w:pPr>
-      <w:bookmarkStart w:id="16" w:name="location-based-services"/>
-      <w:bookmarkStart w:id="17" w:name="_Toc237982790"/>
+      <w:bookmarkStart w:id="16" w:name="_Toc237982790"/>
+      <w:bookmarkStart w:id="17" w:name="location-based-services"/>
       <w:r>
         <w:rPr>
           <w:rFonts w:ascii="Times New Roman" w:hAnsi="Times New Roman" w:cs="Times New Roman"/>
         </w:rPr>
         <w:t>Location-Based Services</w:t>
       </w:r>
+      <w:bookmarkEnd w:id="16"/>
+    </w:p>
+    <w:p>
+      <w:pPr>
+        <w:pStyle w:val="FirstParagraph"/>
+        <w:rPr>
+          <w:rFonts w:ascii="Times New Roman" w:hAnsi="Times New Roman" w:cs="Times New Roman"/>
+        </w:rPr>
+      </w:pPr>
+      <w:r>
+        <w:rPr>
+          <w:rFonts w:ascii="Times New Roman" w:hAnsi="Times New Roman" w:cs="Times New Roman"/>
+        </w:rPr>
+        <w:t xml:space="preserve">Location-Based Services (LBS) are the class of applications that delivers contextual information or functionality to a user by relying on the geographic position of his/her device. According to Schiller and </w:t>
+      </w:r>
+      <w:proofErr w:type="spellStart"/>
+      <w:r>
+        <w:rPr>
+          <w:rFonts w:ascii="Times New Roman" w:hAnsi="Times New Roman" w:cs="Times New Roman"/>
+        </w:rPr>
+        <w:t>Voisard</w:t>
+      </w:r>
+      <w:proofErr w:type="spellEnd"/>
+      <w:r>
+        <w:rPr>
+          <w:rFonts w:ascii="Times New Roman" w:hAnsi="Times New Roman" w:cs="Times New Roman"/>
+        </w:rPr>
+        <w:t xml:space="preserve"> (2004), GPS positioning, mobile networks and application logic are combined to provide that type of application functionality. In turn, </w:t>
+      </w:r>
+      <w:proofErr w:type="spellStart"/>
+      <w:r>
+        <w:rPr>
+          <w:rFonts w:ascii="Times New Roman" w:hAnsi="Times New Roman" w:cs="Times New Roman"/>
+        </w:rPr>
+        <w:t>Dey</w:t>
+      </w:r>
+      <w:proofErr w:type="spellEnd"/>
+      <w:r>
+        <w:rPr>
+          <w:rFonts w:ascii="Times New Roman" w:hAnsi="Times New Roman" w:cs="Times New Roman"/>
+        </w:rPr>
+        <w:t xml:space="preserve"> (2001) defines context-aware computing as the automatic adaption of application to user's physical environment instead of manual configuration. Context-aware computing is directly implemented in the developed application: Fused Location Provider automatically retrieves user's location on the Map and Directions screens.</w:t>
+      </w:r>
+    </w:p>
+    <w:p>
+      <w:pPr>
+        <w:pStyle w:val="BodyText"/>
+        <w:rPr>
+          <w:rFonts w:ascii="Times New Roman" w:hAnsi="Times New Roman" w:cs="Times New Roman"/>
+        </w:rPr>
+      </w:pPr>
+      <w:proofErr w:type="spellStart"/>
+      <w:r>
+        <w:rPr>
+          <w:rFonts w:ascii="Times New Roman" w:hAnsi="Times New Roman" w:cs="Times New Roman"/>
+        </w:rPr>
+        <w:t>Bao</w:t>
+      </w:r>
+      <w:proofErr w:type="spellEnd"/>
+      <w:r>
+        <w:rPr>
+          <w:rFonts w:ascii="Times New Roman" w:hAnsi="Times New Roman" w:cs="Times New Roman"/>
+        </w:rPr>
+        <w:t xml:space="preserve"> </w:t>
+      </w:r>
+      <w:r>
+        <w:rPr>
+          <w:rFonts w:ascii="Times New Roman" w:hAnsi="Times New Roman" w:cs="Times New Roman"/>
+        </w:rPr>
+        <w:t>et al. (2012) proves that the combination of user's location and preferences model enhances the relevance of place-based recommendations. In the original proposal, preference model was not included and the current architecture, in which map gets the data of restaurants through a single interface of repository, allows including it later on in case it is needed.</w:t>
+      </w:r>
+    </w:p>
+    <w:p>
+      <w:pPr>
+        <w:pStyle w:val="Heading2"/>
+        <w:rPr>
+          <w:rFonts w:ascii="Times New Roman" w:hAnsi="Times New Roman" w:cs="Times New Roman"/>
+        </w:rPr>
+      </w:pPr>
+      <w:bookmarkStart w:id="18" w:name="_Toc237982791"/>
+      <w:bookmarkStart w:id="19" w:name="restaurant-recommendation-systems"/>
       <w:bookmarkEnd w:id="17"/>
-    </w:p>
-    <w:p>
-      <w:pPr>
-        <w:pStyle w:val="FirstParagraph"/>
-        <w:rPr>
-          <w:rFonts w:ascii="Times New Roman" w:hAnsi="Times New Roman" w:cs="Times New Roman"/>
-        </w:rPr>
-      </w:pPr>
-      <w:r>
-        <w:rPr>
-          <w:rFonts w:ascii="Times New Roman" w:hAnsi="Times New Roman" w:cs="Times New Roman"/>
-        </w:rPr>
-        <w:t>Location-Based Services (LBS) are the class of applications that delivers contextual information or functionality to a user by relying on the geographic position of his/her device. According to Schiller and Voisard (2004), GPS positioning, mobile networks and application logic are combined to provide that type of application functionality. In turn, Dey (2001) defines context-aware computing as the automatic adaption of application to user's physical environment instead of manual configuration. Context-aware computing is directly implemented in the developed application: Fused Location Provider automatically retrieves user's location on the Map and Directions screens.</w:t>
-      </w:r>
-    </w:p>
-    <w:p>
-      <w:pPr>
-        <w:pStyle w:val="BodyText"/>
-        <w:rPr>
-          <w:rFonts w:ascii="Times New Roman" w:hAnsi="Times New Roman" w:cs="Times New Roman"/>
-        </w:rPr>
-      </w:pPr>
-      <w:r>
-        <w:rPr>
-          <w:rFonts w:ascii="Times New Roman" w:hAnsi="Times New Roman" w:cs="Times New Roman"/>
-        </w:rPr>
-        <w:t xml:space="preserve">Bao </w:t>
-      </w:r>
-      <w:r>
-        <w:rPr>
-          <w:rFonts w:ascii="Times New Roman" w:hAnsi="Times New Roman" w:cs="Times New Roman"/>
-        </w:rPr>
-        <w:t>et al. (2012) proves that the combination of user's location and preferences model enhances the relevance of place-based recommendations. In the original proposal, preference model was not included and the current architecture, in which map gets the data of restaurants through a single interface of repository, allows including it later on in case it is needed.</w:t>
-      </w:r>
-    </w:p>
-    <w:p>
-      <w:pPr>
-        <w:pStyle w:val="Heading2"/>
-        <w:rPr>
-          <w:rFonts w:ascii="Times New Roman" w:hAnsi="Times New Roman" w:cs="Times New Roman"/>
-        </w:rPr>
-      </w:pPr>
-      <w:bookmarkStart w:id="18" w:name="restaurant-recommendation-systems"/>
-      <w:bookmarkStart w:id="19" w:name="_Toc237982791"/>
-      <w:bookmarkEnd w:id="16"/>
       <w:r>
         <w:rPr>
           <w:rFonts w:ascii="Times New Roman" w:hAnsi="Times New Roman" w:cs="Times New Roman"/>
@@ -4984,22 +5218,191 @@
         <w:lastRenderedPageBreak/>
         <w:t>Restaurant Recommendation Systems</w:t>
       </w:r>
+      <w:bookmarkEnd w:id="18"/>
+    </w:p>
+    <w:p>
+      <w:pPr>
+        <w:pStyle w:val="FirstParagraph"/>
+        <w:rPr>
+          <w:rFonts w:ascii="Times New Roman" w:hAnsi="Times New Roman" w:cs="Times New Roman"/>
+          <w:highlight w:val="green"/>
+        </w:rPr>
+      </w:pPr>
+      <w:proofErr w:type="spellStart"/>
+      <w:r>
+        <w:rPr>
+          <w:rFonts w:ascii="Times New Roman" w:hAnsi="Times New Roman" w:cs="Times New Roman"/>
+          <w:highlight w:val="green"/>
+        </w:rPr>
+        <w:t>Adomavicius</w:t>
+      </w:r>
+      <w:proofErr w:type="spellEnd"/>
+      <w:r>
+        <w:rPr>
+          <w:rFonts w:ascii="Times New Roman" w:hAnsi="Times New Roman" w:cs="Times New Roman"/>
+          <w:highlight w:val="green"/>
+        </w:rPr>
+        <w:t xml:space="preserve"> and </w:t>
+      </w:r>
+      <w:proofErr w:type="spellStart"/>
+      <w:r>
+        <w:rPr>
+          <w:rFonts w:ascii="Times New Roman" w:hAnsi="Times New Roman" w:cs="Times New Roman"/>
+          <w:highlight w:val="green"/>
+        </w:rPr>
+        <w:t>Tuzhilin</w:t>
+      </w:r>
+      <w:proofErr w:type="spellEnd"/>
+      <w:r>
+        <w:rPr>
+          <w:rFonts w:ascii="Times New Roman" w:hAnsi="Times New Roman" w:cs="Times New Roman"/>
+          <w:highlight w:val="green"/>
+        </w:rPr>
+        <w:t xml:space="preserve"> (2005) identifies three dominant paradigms of the recommendation systems: content-based filtering, collaborative filtering and hybrids of both. In the proposal, the simplified version of content-based approach was used: keyword-based search against the Google Places API. This integration is now live: the search bar filters real restaurant data returned by the Google Places API rather than a hardcoded placeholder list, as described in Section 8. The rating each restaurant carries from the Places API now provides the collaborative signal described in the proposal, without any additional logic implemented in the application itself.</w:t>
+      </w:r>
+    </w:p>
+    <w:p>
+      <w:pPr>
+        <w:pStyle w:val="Heading2"/>
+        <w:rPr>
+          <w:rFonts w:ascii="Times New Roman" w:hAnsi="Times New Roman" w:cs="Times New Roman"/>
+        </w:rPr>
+      </w:pPr>
+      <w:bookmarkStart w:id="20" w:name="_Toc237982792"/>
+      <w:bookmarkStart w:id="21" w:name="Xd7afd90e654d2aa699ba0f38cbab833a4681c1f"/>
       <w:bookmarkEnd w:id="19"/>
+      <w:r>
+        <w:rPr>
+          <w:rFonts w:ascii="Times New Roman" w:hAnsi="Times New Roman" w:cs="Times New Roman"/>
+        </w:rPr>
+        <w:t>Video-Based User-Generated Content and Consumer Decisions</w:t>
+      </w:r>
+      <w:bookmarkEnd w:id="20"/>
     </w:p>
     <w:p>
       <w:pPr>
         <w:pStyle w:val="FirstParagraph"/>
         <w:rPr>
           <w:rFonts w:ascii="Times New Roman" w:hAnsi="Times New Roman" w:cs="Times New Roman"/>
-          <w:highlight w:val="green"/>
-        </w:rPr>
-      </w:pPr>
-      <w:r>
-        <w:rPr>
-          <w:rFonts w:ascii="Times New Roman" w:hAnsi="Times New Roman" w:cs="Times New Roman"/>
-          <w:highlight w:val="green"/>
-        </w:rPr>
-        <w:t>Adomavicius and Tuzhilin (2005) identifies three dominant paradigms of the recommendation systems: content-based filtering, collaborative filtering and hybrids of both. In the proposal, the simplified version of content-based approach was used: keyword-based search against the Google Places API. This integration is now live: the search bar filters real restaurant data returned by the Google Places API rather than a hardcoded placeholder list, as described in Section 8. The rating each restaurant carries from the Places API now provides the collaborative signal described in the proposal, without any additional logic implemented in the application itself.</w:t>
+        </w:rPr>
+      </w:pPr>
+      <w:proofErr w:type="spellStart"/>
+      <w:r>
+        <w:rPr>
+          <w:rFonts w:ascii="Times New Roman" w:hAnsi="Times New Roman" w:cs="Times New Roman"/>
+        </w:rPr>
+        <w:t>Dellarocas</w:t>
+      </w:r>
+      <w:proofErr w:type="spellEnd"/>
+      <w:r>
+        <w:rPr>
+          <w:rFonts w:ascii="Times New Roman" w:hAnsi="Times New Roman" w:cs="Times New Roman"/>
+        </w:rPr>
+        <w:t xml:space="preserve"> </w:t>
+      </w:r>
+      <w:r>
+        <w:rPr>
+          <w:rFonts w:ascii="Times New Roman" w:hAnsi="Times New Roman" w:cs="Times New Roman"/>
+        </w:rPr>
+        <w:t xml:space="preserve">(2003) considers user-generated content as an extension of word-of-mouth communication in digital space with a demonstrable influence on purchasing decisions. Kaplan and </w:t>
+      </w:r>
+      <w:proofErr w:type="spellStart"/>
+      <w:r>
+        <w:rPr>
+          <w:rFonts w:ascii="Times New Roman" w:hAnsi="Times New Roman" w:cs="Times New Roman"/>
+        </w:rPr>
+        <w:t>Haenlein</w:t>
+      </w:r>
+      <w:proofErr w:type="spellEnd"/>
+      <w:r>
+        <w:rPr>
+          <w:rFonts w:ascii="Times New Roman" w:hAnsi="Times New Roman" w:cs="Times New Roman"/>
+        </w:rPr>
+        <w:t xml:space="preserve"> (2010) and Cheung et al. (2009) prove that video content, as opposed to text-based, is more trustworthy and persuasive in conveying atmosphere and experience quality of the place. Recent studies confirm that the growth of short-form video has led to the accelerated influence of that type of content: </w:t>
+      </w:r>
+      <w:proofErr w:type="spellStart"/>
+      <w:r>
+        <w:rPr>
+          <w:rFonts w:ascii="Times New Roman" w:hAnsi="Times New Roman" w:cs="Times New Roman"/>
+        </w:rPr>
+        <w:t>Montag</w:t>
+      </w:r>
+      <w:proofErr w:type="spellEnd"/>
+      <w:r>
+        <w:rPr>
+          <w:rFonts w:ascii="Times New Roman" w:hAnsi="Times New Roman" w:cs="Times New Roman"/>
+        </w:rPr>
+        <w:t xml:space="preserve"> et al. (2021) explain why </w:t>
+      </w:r>
+      <w:proofErr w:type="spellStart"/>
+      <w:r>
+        <w:rPr>
+          <w:rFonts w:ascii="Times New Roman" w:hAnsi="Times New Roman" w:cs="Times New Roman"/>
+        </w:rPr>
+        <w:t>TikTok</w:t>
+      </w:r>
+      <w:proofErr w:type="spellEnd"/>
+      <w:r>
+        <w:rPr>
+          <w:rFonts w:ascii="Times New Roman" w:hAnsi="Times New Roman" w:cs="Times New Roman"/>
+        </w:rPr>
+        <w:t xml:space="preserve"> and similar platforms capture users' attention with the help of short, authentic clips, while </w:t>
+      </w:r>
+      <w:proofErr w:type="spellStart"/>
+      <w:r>
+        <w:rPr>
+          <w:rFonts w:ascii="Times New Roman" w:hAnsi="Times New Roman" w:cs="Times New Roman"/>
+        </w:rPr>
+        <w:t>Barta</w:t>
+      </w:r>
+      <w:proofErr w:type="spellEnd"/>
+      <w:r>
+        <w:rPr>
+          <w:rFonts w:ascii="Times New Roman" w:hAnsi="Times New Roman" w:cs="Times New Roman"/>
+        </w:rPr>
+        <w:t xml:space="preserve"> et al. (2023) prove empirically that short-form video content on </w:t>
+      </w:r>
+      <w:proofErr w:type="spellStart"/>
+      <w:r>
+        <w:rPr>
+          <w:rFonts w:ascii="Times New Roman" w:hAnsi="Times New Roman" w:cs="Times New Roman"/>
+        </w:rPr>
+        <w:t>TikTok</w:t>
+      </w:r>
+      <w:proofErr w:type="spellEnd"/>
+      <w:r>
+        <w:rPr>
+          <w:rFonts w:ascii="Times New Roman" w:hAnsi="Times New Roman" w:cs="Times New Roman"/>
+        </w:rPr>
+        <w:t xml:space="preserve"> has a statistically significant influence on consumers' opinions and intentions, especially in case it appears to be genuine rather than artificial. The volume of that behavior is huge: the latest industry measurement reports name short-form video content among the most consumed categories of online content and claim it takes a substantial part of the average daily media time (Kemp 2024). Those recent sources do not contradict but rather support the original literature: the mechanism of influence described by </w:t>
+      </w:r>
+      <w:proofErr w:type="spellStart"/>
+      <w:r>
+        <w:rPr>
+          <w:rFonts w:ascii="Times New Roman" w:hAnsi="Times New Roman" w:cs="Times New Roman"/>
+        </w:rPr>
+        <w:t>Dellarocas</w:t>
+      </w:r>
+      <w:proofErr w:type="spellEnd"/>
+      <w:r>
+        <w:rPr>
+          <w:rFonts w:ascii="Times New Roman" w:hAnsi="Times New Roman" w:cs="Times New Roman"/>
+        </w:rPr>
+        <w:t xml:space="preserve"> in 2003 works the same but on much larger scale via video content. It is the main idea implemented by the app: from the restaurant detail screen a user opens the authentic video of the restaurant via a single click, and the app also provides another way to get to the </w:t>
+      </w:r>
+      <w:proofErr w:type="spellStart"/>
+      <w:r>
+        <w:rPr>
+          <w:rFonts w:ascii="Times New Roman" w:hAnsi="Times New Roman" w:cs="Times New Roman"/>
+        </w:rPr>
+        <w:t>TikTok</w:t>
+      </w:r>
+      <w:proofErr w:type="spellEnd"/>
+      <w:r>
+        <w:rPr>
+          <w:rFonts w:ascii="Times New Roman" w:hAnsi="Times New Roman" w:cs="Times New Roman"/>
+        </w:rPr>
+        <w:t xml:space="preserve"> search of the restaurant. Both actions pass to the platform that is already trusted by the user, without any attempts to reproduce video playback inside the app.</w:t>
       </w:r>
     </w:p>
     <w:p>
@@ -5009,47 +5412,9 @@
           <w:rFonts w:ascii="Times New Roman" w:hAnsi="Times New Roman" w:cs="Times New Roman"/>
         </w:rPr>
       </w:pPr>
-      <w:bookmarkStart w:id="20" w:name="Xd7afd90e654d2aa699ba0f38cbab833a4681c1f"/>
-      <w:bookmarkStart w:id="21" w:name="_Toc237982792"/>
-      <w:bookmarkEnd w:id="18"/>
-      <w:r>
-        <w:rPr>
-          <w:rFonts w:ascii="Times New Roman" w:hAnsi="Times New Roman" w:cs="Times New Roman"/>
-        </w:rPr>
-        <w:t>Video-Based User-Generated Content and Consumer Decisions</w:t>
-      </w:r>
+      <w:bookmarkStart w:id="22" w:name="_Toc237982793"/>
+      <w:bookmarkStart w:id="23" w:name="android-mobile-application-development"/>
       <w:bookmarkEnd w:id="21"/>
-    </w:p>
-    <w:p>
-      <w:pPr>
-        <w:pStyle w:val="FirstParagraph"/>
-        <w:rPr>
-          <w:rFonts w:ascii="Times New Roman" w:hAnsi="Times New Roman" w:cs="Times New Roman"/>
-        </w:rPr>
-      </w:pPr>
-      <w:r>
-        <w:rPr>
-          <w:rFonts w:ascii="Times New Roman" w:hAnsi="Times New Roman" w:cs="Times New Roman"/>
-        </w:rPr>
-        <w:t xml:space="preserve">Dellarocas </w:t>
-      </w:r>
-      <w:r>
-        <w:rPr>
-          <w:rFonts w:ascii="Times New Roman" w:hAnsi="Times New Roman" w:cs="Times New Roman"/>
-        </w:rPr>
-        <w:t>(2003) considers user-generated content as an extension of word-of-mouth communication in digital space with a demonstrable influence on purchasing decisions. Kaplan and Haenlein (2010) and Cheung et al. (2009) prove that video content, as opposed to text-based, is more trustworthy and persuasive in conveying atmosphere and experience quality of the place. Recent studies confirm that the growth of short-form video has led to the accelerated influence of that type of content: Montag et al. (2021) explain why TikTok and similar platforms capture users' attention with the help of short, authentic clips, while Barta et al. (2023) prove empirically that short-form video content on TikTok has a statistically significant influence on consumers' opinions and intentions, especially in case it appears to be genuine rather than artificial. The volume of that behavior is huge: the latest industry measurement reports name short-form video content among the most consumed categories of online content and claim it takes a substantial part of the average daily media time (Kemp 2024). Those recent sources do not contradict but rather support the original literature: the mechanism of influence described by Dellarocas in 2003 works the same but on much larger scale via video content. It is the main idea implemented by the app: from the restaurant detail screen a user opens the authentic video of the restaurant via a single click, and the app also provides another way to get to the TikTok search of the restaurant. Both actions pass to the platform that is already trusted by the user, without any attempts to reproduce video playback inside the app.</w:t>
-      </w:r>
-    </w:p>
-    <w:p>
-      <w:pPr>
-        <w:pStyle w:val="Heading2"/>
-        <w:rPr>
-          <w:rFonts w:ascii="Times New Roman" w:hAnsi="Times New Roman" w:cs="Times New Roman"/>
-        </w:rPr>
-      </w:pPr>
-      <w:bookmarkStart w:id="22" w:name="android-mobile-application-development"/>
-      <w:bookmarkStart w:id="23" w:name="_Toc237982793"/>
-      <w:bookmarkEnd w:id="20"/>
       <w:r>
         <w:rPr>
           <w:rFonts w:ascii="Times New Roman" w:hAnsi="Times New Roman" w:cs="Times New Roman"/>
@@ -5057,86 +5422,170 @@
         <w:lastRenderedPageBreak/>
         <w:t>Android Mobile Application Development</w:t>
       </w:r>
+      <w:bookmarkEnd w:id="22"/>
+    </w:p>
+    <w:p>
+      <w:pPr>
+        <w:pStyle w:val="FirstParagraph"/>
+        <w:rPr>
+          <w:rFonts w:ascii="Times New Roman" w:hAnsi="Times New Roman" w:cs="Times New Roman"/>
+        </w:rPr>
+      </w:pPr>
+      <w:r>
+        <w:rPr>
+          <w:rFonts w:ascii="Times New Roman" w:hAnsi="Times New Roman" w:cs="Times New Roman"/>
+        </w:rPr>
+        <w:t xml:space="preserve">According to Wasserman (2010), fragmentation of the devices, limited processing resources and management of application's state in screen transitions are the most frequent problems in mobile applications development. Although that analysis is still helpful in defining the problem space, the tooling has changed a lot since that time. The proposal solved the issue of application state with Activity lifecycle; in the implemented application it is solved by Jetpack Compose and Navigation Compose, which are the officially recommended Google's tools for developing native Android UI (Google LLC 2024c): each screen is a </w:t>
+      </w:r>
+      <w:proofErr w:type="spellStart"/>
+      <w:r>
+        <w:rPr>
+          <w:rFonts w:ascii="Times New Roman" w:hAnsi="Times New Roman" w:cs="Times New Roman"/>
+        </w:rPr>
+        <w:t>composable</w:t>
+      </w:r>
+      <w:proofErr w:type="spellEnd"/>
+      <w:r>
+        <w:rPr>
+          <w:rFonts w:ascii="Times New Roman" w:hAnsi="Times New Roman" w:cs="Times New Roman"/>
+        </w:rPr>
+        <w:t xml:space="preserve"> function that is managed by a single navigation host. It is a deviation from the proposal, and Section 4.1 explains the rationale behind that decision in detail. In short, the problem identified by Wasserman – the consistent state management across navigation events – is still the core design goal; the only thing that changed is the particular solution used to solve it, as it reflects current Android development practice</w:t>
+      </w:r>
+    </w:p>
+    <w:p>
+      <w:pPr>
+        <w:pStyle w:val="BodyText"/>
+        <w:rPr>
+          <w:rFonts w:ascii="Times New Roman" w:hAnsi="Times New Roman" w:cs="Times New Roman"/>
+          <w:highlight w:val="green"/>
+        </w:rPr>
+      </w:pPr>
+      <w:r>
+        <w:rPr>
+          <w:rFonts w:ascii="Times New Roman" w:hAnsi="Times New Roman" w:cs="Times New Roman"/>
+          <w:highlight w:val="green"/>
+        </w:rPr>
+        <w:t>Google Play Services suite -- Maps SDK, Fused Location Provider and Places API -- is the standardized and well-documented toolset used for implementing location-aware features in the app, as anticipated in the proposal.</w:t>
+      </w:r>
+    </w:p>
+    <w:p>
+      <w:pPr>
+        <w:pStyle w:val="Heading1"/>
+        <w:rPr>
+          <w:rFonts w:cs="Times New Roman"/>
+        </w:rPr>
+      </w:pPr>
+      <w:bookmarkStart w:id="24" w:name="_Toc237982794"/>
+      <w:bookmarkStart w:id="25" w:name="system-design"/>
+      <w:bookmarkEnd w:id="15"/>
       <w:bookmarkEnd w:id="23"/>
-    </w:p>
-    <w:p>
-      <w:pPr>
-        <w:pStyle w:val="FirstParagraph"/>
-        <w:rPr>
-          <w:rFonts w:ascii="Times New Roman" w:hAnsi="Times New Roman" w:cs="Times New Roman"/>
-        </w:rPr>
-      </w:pPr>
-      <w:r>
-        <w:rPr>
-          <w:rFonts w:ascii="Times New Roman" w:hAnsi="Times New Roman" w:cs="Times New Roman"/>
-        </w:rPr>
-        <w:t>According to Wasserman (2010), fragmentation of the devices, limited processing resources and management of application's state in screen transitions are the most frequent problems in mobile applications development. Although that analysis is still helpful in defining the problem space, the tooling has changed a lot since that time. The proposal solved the issue of application state with Activity lifecycle; in the implemented application it is solved by Jetpack Compose and Navigation Compose, which are the officially recommended Google's tools for developing native Android UI (Google LLC 2024c): each screen is a composable function that is managed by a single navigation host. It is a deviation from the proposal, and Section 4.1 explains the rationale behind that decision in detail. In short, the problem identified by Wasserman – the consistent state management across navigation events – is still the core design goal; the only thing that changed is the particular solution used to solve it, as it reflects current Android development practice</w:t>
-      </w:r>
+      <w:r>
+        <w:rPr>
+          <w:rFonts w:cs="Times New Roman"/>
+        </w:rPr>
+        <w:t>System Design</w:t>
+      </w:r>
+      <w:bookmarkEnd w:id="24"/>
+    </w:p>
+    <w:p>
+      <w:pPr>
+        <w:pStyle w:val="Heading2"/>
+        <w:rPr>
+          <w:rFonts w:ascii="Times New Roman" w:hAnsi="Times New Roman" w:cs="Times New Roman"/>
+        </w:rPr>
+      </w:pPr>
+      <w:bookmarkStart w:id="26" w:name="_Toc237982795"/>
+      <w:bookmarkStart w:id="27" w:name="application-architecture"/>
+      <w:r>
+        <w:rPr>
+          <w:rFonts w:ascii="Times New Roman" w:hAnsi="Times New Roman" w:cs="Times New Roman"/>
+        </w:rPr>
+        <w:t>Application Architecture</w:t>
+      </w:r>
+      <w:bookmarkEnd w:id="26"/>
     </w:p>
     <w:p>
       <w:pPr>
         <w:pStyle w:val="BodyText"/>
         <w:rPr>
           <w:rFonts w:ascii="Times New Roman" w:hAnsi="Times New Roman" w:cs="Times New Roman"/>
-          <w:highlight w:val="green"/>
-        </w:rPr>
-      </w:pPr>
-      <w:r>
-        <w:rPr>
-          <w:rFonts w:ascii="Times New Roman" w:hAnsi="Times New Roman" w:cs="Times New Roman"/>
-          <w:highlight w:val="green"/>
-        </w:rPr>
-        <w:t>Google Play Services suite -- Maps SDK, Fused Location Provider and Places API -- is the standardized and well-documented toolset used for implementing location-aware features in the app, as anticipated in the proposal.</w:t>
-      </w:r>
-    </w:p>
-    <w:p>
-      <w:pPr>
-        <w:pStyle w:val="Heading1"/>
-        <w:rPr>
-          <w:rFonts w:cs="Times New Roman"/>
-        </w:rPr>
-      </w:pPr>
-      <w:bookmarkStart w:id="24" w:name="system-design"/>
-      <w:bookmarkStart w:id="25" w:name="_Toc237982794"/>
-      <w:bookmarkEnd w:id="14"/>
-      <w:bookmarkEnd w:id="22"/>
-      <w:r>
-        <w:rPr>
-          <w:rFonts w:cs="Times New Roman"/>
-        </w:rPr>
-        <w:t>System Design</w:t>
-      </w:r>
-      <w:bookmarkEnd w:id="25"/>
-    </w:p>
-    <w:p>
-      <w:pPr>
-        <w:pStyle w:val="Heading2"/>
-        <w:rPr>
-          <w:rFonts w:ascii="Times New Roman" w:hAnsi="Times New Roman" w:cs="Times New Roman"/>
-        </w:rPr>
-      </w:pPr>
-      <w:bookmarkStart w:id="26" w:name="application-architecture"/>
-      <w:bookmarkStart w:id="27" w:name="_Toc237982795"/>
-      <w:r>
-        <w:rPr>
-          <w:rFonts w:ascii="Times New Roman" w:hAnsi="Times New Roman" w:cs="Times New Roman"/>
-        </w:rPr>
-        <w:t>Application Architecture</w:t>
-      </w:r>
-      <w:bookmarkEnd w:id="27"/>
-    </w:p>
-    <w:p>
-      <w:pPr>
-        <w:pStyle w:val="BodyText"/>
-        <w:rPr>
-          <w:rFonts w:ascii="Times New Roman" w:hAnsi="Times New Roman" w:cs="Times New Roman"/>
-        </w:rPr>
-      </w:pPr>
-      <w:r>
-        <w:rPr>
-          <w:rFonts w:ascii="Times New Roman" w:hAnsi="Times New Roman" w:cs="Times New Roman"/>
-        </w:rPr>
-        <w:t xml:space="preserve">According to the proposal, the architecture of the app was expected to be based on Java language and single Activity per screen pattern. The implemented application relies on Kotlin and Jetpack Compose, in which every screen is a composable function inside one Activity (MainActivity) and is connected via a single Navigation Compose host. It is a conscious deviation from the original plan, made for three reasons. First, Kotlin is explicitly mentioned as an acceptable language in the project brief, so the change does not introduce any scope risks. Second, Compose is the current recommended toolkit for developing Android UI and its use demonstrates familiarity with present-day Android development practice instead of outdated one. Third, and most practically, Compose's state-driven model proved itself to be the easiest way to solve the </w:t>
+        </w:rPr>
+      </w:pPr>
+      <w:r>
+        <w:rPr>
+          <w:rFonts w:ascii="Times New Roman" w:hAnsi="Times New Roman" w:cs="Times New Roman"/>
+        </w:rPr>
+        <w:t xml:space="preserve">According to the proposal, the architecture of the app was expected to be based on Java language and single Activity per screen pattern. The implemented application relies on </w:t>
+      </w:r>
+      <w:proofErr w:type="spellStart"/>
+      <w:r>
+        <w:rPr>
+          <w:rFonts w:ascii="Times New Roman" w:hAnsi="Times New Roman" w:cs="Times New Roman"/>
+        </w:rPr>
+        <w:t>Kotlin</w:t>
+      </w:r>
+      <w:proofErr w:type="spellEnd"/>
+      <w:r>
+        <w:rPr>
+          <w:rFonts w:ascii="Times New Roman" w:hAnsi="Times New Roman" w:cs="Times New Roman"/>
+        </w:rPr>
+        <w:t xml:space="preserve"> and Jetpack Compose, in which every screen is a </w:t>
+      </w:r>
+      <w:proofErr w:type="spellStart"/>
+      <w:r>
+        <w:rPr>
+          <w:rFonts w:ascii="Times New Roman" w:hAnsi="Times New Roman" w:cs="Times New Roman"/>
+        </w:rPr>
+        <w:t>composable</w:t>
+      </w:r>
+      <w:proofErr w:type="spellEnd"/>
+      <w:r>
+        <w:rPr>
+          <w:rFonts w:ascii="Times New Roman" w:hAnsi="Times New Roman" w:cs="Times New Roman"/>
+        </w:rPr>
+        <w:t xml:space="preserve"> function inside one Activity (</w:t>
+      </w:r>
+      <w:proofErr w:type="spellStart"/>
+      <w:r>
+        <w:rPr>
+          <w:rFonts w:ascii="Times New Roman" w:hAnsi="Times New Roman" w:cs="Times New Roman"/>
+        </w:rPr>
+        <w:t>MainActivity</w:t>
+      </w:r>
+      <w:proofErr w:type="spellEnd"/>
+      <w:r>
+        <w:rPr>
+          <w:rFonts w:ascii="Times New Roman" w:hAnsi="Times New Roman" w:cs="Times New Roman"/>
+        </w:rPr>
+        <w:t xml:space="preserve">) and is connected via a single Navigation Compose host. It is a conscious deviation from the original plan, made for three reasons. First, </w:t>
+      </w:r>
+      <w:proofErr w:type="spellStart"/>
+      <w:r>
+        <w:rPr>
+          <w:rFonts w:ascii="Times New Roman" w:hAnsi="Times New Roman" w:cs="Times New Roman"/>
+        </w:rPr>
+        <w:t>Kotlin</w:t>
+      </w:r>
+      <w:proofErr w:type="spellEnd"/>
+      <w:r>
+        <w:rPr>
+          <w:rFonts w:ascii="Times New Roman" w:hAnsi="Times New Roman" w:cs="Times New Roman"/>
+        </w:rPr>
+        <w:t xml:space="preserve"> is explicitly mentioned as an acceptable language in the project brief, so the change does not introduce any scope risks. Second, Compose is the current recommended toolkit for developing Android UI and its use demonstrates familiarity with present-day Android development practice instead of outdated one. Third, and most practically, </w:t>
+      </w:r>
+      <w:proofErr w:type="spellStart"/>
+      <w:r>
+        <w:rPr>
+          <w:rFonts w:ascii="Times New Roman" w:hAnsi="Times New Roman" w:cs="Times New Roman"/>
+        </w:rPr>
+        <w:t>Compose's</w:t>
+      </w:r>
+      <w:proofErr w:type="spellEnd"/>
+      <w:r>
+        <w:rPr>
+          <w:rFonts w:ascii="Times New Roman" w:hAnsi="Times New Roman" w:cs="Times New Roman"/>
+        </w:rPr>
+        <w:t xml:space="preserve"> state-driven model proved itself to be the easiest way to solve the </w:t>
       </w:r>
       <w:r>
         <w:rPr>
@@ -5157,7 +5606,49 @@
         <w:rPr>
           <w:rFonts w:ascii="Times New Roman" w:hAnsi="Times New Roman" w:cs="Times New Roman"/>
         </w:rPr>
-        <w:t>Figure 1 shows the original hand-drawn prototype that the screen set was designed against. Eleven screens have been implemented in total: a Splash screen, Login and Registration, Home screen, the Map, Restaurant Detail, Video screen, TikTok link screen, Directions, Contact Us and Privacy Policy screen. The latter four screens – TikTok link screen, Contact Us and Privacy Policy screen – exceed the original six screens set; they have been added to give the video feature a second, working path (TikTok as well as YouTube) and to meet regular expectations of a published app (contact channel and privacy statement) without changing the core flow of the original prototype.</w:t>
+        <w:t xml:space="preserve">Figure 1 shows the original hand-drawn prototype that the screen set was designed against. Eleven screens have been implemented in total: a Splash screen, Login and Registration, Home screen, the Map, Restaurant Detail, Video screen, </w:t>
+      </w:r>
+      <w:proofErr w:type="spellStart"/>
+      <w:r>
+        <w:rPr>
+          <w:rFonts w:ascii="Times New Roman" w:hAnsi="Times New Roman" w:cs="Times New Roman"/>
+        </w:rPr>
+        <w:t>TikTok</w:t>
+      </w:r>
+      <w:proofErr w:type="spellEnd"/>
+      <w:r>
+        <w:rPr>
+          <w:rFonts w:ascii="Times New Roman" w:hAnsi="Times New Roman" w:cs="Times New Roman"/>
+        </w:rPr>
+        <w:t xml:space="preserve"> link screen, Directions, Contact Us and Privacy Policy screen. The latter four screens – </w:t>
+      </w:r>
+      <w:proofErr w:type="spellStart"/>
+      <w:r>
+        <w:rPr>
+          <w:rFonts w:ascii="Times New Roman" w:hAnsi="Times New Roman" w:cs="Times New Roman"/>
+        </w:rPr>
+        <w:t>TikTok</w:t>
+      </w:r>
+      <w:proofErr w:type="spellEnd"/>
+      <w:r>
+        <w:rPr>
+          <w:rFonts w:ascii="Times New Roman" w:hAnsi="Times New Roman" w:cs="Times New Roman"/>
+        </w:rPr>
+        <w:t xml:space="preserve"> link screen, Contact Us and Privacy Policy screen – exceed the original six screens set; they have been added to give the video feature a second, working path (</w:t>
+      </w:r>
+      <w:proofErr w:type="spellStart"/>
+      <w:r>
+        <w:rPr>
+          <w:rFonts w:ascii="Times New Roman" w:hAnsi="Times New Roman" w:cs="Times New Roman"/>
+        </w:rPr>
+        <w:t>TikTok</w:t>
+      </w:r>
+      <w:proofErr w:type="spellEnd"/>
+      <w:r>
+        <w:rPr>
+          <w:rFonts w:ascii="Times New Roman" w:hAnsi="Times New Roman" w:cs="Times New Roman"/>
+        </w:rPr>
+        <w:t xml:space="preserve"> as well as YouTube) and to meet regular expectations of a published app (contact channel and privacy statement) without changing the core flow of the original prototype.</w:t>
       </w:r>
     </w:p>
     <w:p>
@@ -5340,9 +5831,9 @@
           <w:rFonts w:ascii="Times New Roman" w:hAnsi="Times New Roman" w:cs="Times New Roman"/>
         </w:rPr>
       </w:pPr>
-      <w:bookmarkStart w:id="30" w:name="use-case-model-uml"/>
-      <w:bookmarkStart w:id="31" w:name="_Toc237982796"/>
-      <w:bookmarkEnd w:id="26"/>
+      <w:bookmarkStart w:id="30" w:name="_Toc237982796"/>
+      <w:bookmarkStart w:id="31" w:name="use-case-model-uml"/>
+      <w:bookmarkEnd w:id="27"/>
       <w:bookmarkEnd w:id="29"/>
       <w:r>
         <w:rPr>
@@ -5350,7 +5841,7 @@
         </w:rPr>
         <w:t>Use Case Model (UML)</w:t>
       </w:r>
-      <w:bookmarkEnd w:id="31"/>
+      <w:bookmarkEnd w:id="30"/>
     </w:p>
     <w:p>
       <w:pPr>
@@ -5363,7 +5854,21 @@
         <w:rPr>
           <w:rFonts w:ascii="Times New Roman" w:hAnsi="Times New Roman" w:cs="Times New Roman"/>
         </w:rPr>
-        <w:t>Prior to describing the architecture of the system, it is appropriate to clarify exactly what it enables a user to do. This is done in Figure 3 using a UML use case diagram, where a single human actor, the User, interacts with seven use cases, surrounded by the system boundary, while three secondary actors representing the three external services – Firebase, Google Maps, and YouTube/TikTok – are required in order to provide the desired functionality.</w:t>
+        <w:t>Prior to describing the architecture of the system, it is appropriate to clarify exactly what it enables a user to do. This is done in Figure 3 using a UML use case diagram, where a single human actor, the User, interacts with seven use cases, surrounded by the system boundary, while three secondary actors representing the three external services – Firebase, Google Maps, and YouTube/</w:t>
+      </w:r>
+      <w:proofErr w:type="spellStart"/>
+      <w:r>
+        <w:rPr>
+          <w:rFonts w:ascii="Times New Roman" w:hAnsi="Times New Roman" w:cs="Times New Roman"/>
+        </w:rPr>
+        <w:t>TikTok</w:t>
+      </w:r>
+      <w:proofErr w:type="spellEnd"/>
+      <w:r>
+        <w:rPr>
+          <w:rFonts w:ascii="Times New Roman" w:hAnsi="Times New Roman" w:cs="Times New Roman"/>
+        </w:rPr>
+        <w:t xml:space="preserve"> – are required in order to provide the desired functionality.</w:t>
       </w:r>
     </w:p>
     <w:p>
@@ -5435,7 +5940,21 @@
         <w:rPr>
           <w:rFonts w:ascii="Times New Roman" w:hAnsi="Times New Roman" w:cs="Times New Roman"/>
         </w:rPr>
-        <w:t>UML use case diagram: the User as primary actor, with Firebase, Maps, and YouTube/TikTok as secondary actors.</w:t>
+        <w:t>UML use case diagram: the User as primary actor, with Firebase, Maps, and YouTube/</w:t>
+      </w:r>
+      <w:proofErr w:type="spellStart"/>
+      <w:r>
+        <w:rPr>
+          <w:rFonts w:ascii="Times New Roman" w:hAnsi="Times New Roman" w:cs="Times New Roman"/>
+        </w:rPr>
+        <w:t>TikTok</w:t>
+      </w:r>
+      <w:proofErr w:type="spellEnd"/>
+      <w:r>
+        <w:rPr>
+          <w:rFonts w:ascii="Times New Roman" w:hAnsi="Times New Roman" w:cs="Times New Roman"/>
+        </w:rPr>
+        <w:t xml:space="preserve"> as secondary actors.</w:t>
       </w:r>
     </w:p>
     <w:p>
@@ -5445,9 +5964,9 @@
           <w:rFonts w:ascii="Times New Roman" w:hAnsi="Times New Roman" w:cs="Times New Roman"/>
         </w:rPr>
       </w:pPr>
-      <w:bookmarkStart w:id="33" w:name="class-design-uml"/>
-      <w:bookmarkStart w:id="34" w:name="_Toc237982797"/>
-      <w:bookmarkEnd w:id="30"/>
+      <w:bookmarkStart w:id="33" w:name="_Toc237982797"/>
+      <w:bookmarkStart w:id="34" w:name="class-design-uml"/>
+      <w:bookmarkEnd w:id="31"/>
       <w:bookmarkEnd w:id="32"/>
       <w:r>
         <w:rPr>
@@ -5455,7 +5974,7 @@
         </w:rPr>
         <w:t>Class Design (UML)</w:t>
       </w:r>
-      <w:bookmarkEnd w:id="34"/>
+      <w:bookmarkEnd w:id="33"/>
     </w:p>
     <w:p>
       <w:pPr>
@@ -5468,7 +5987,105 @@
         <w:rPr>
           <w:rFonts w:ascii="Times New Roman" w:hAnsi="Times New Roman" w:cs="Times New Roman"/>
         </w:rPr>
-        <w:t>Figure 4 presents the same system as a class diagram, depicting only those classes that encapsulate the behaviour. The MainActivity class stores the navigation graph and a single shared selectedRestaurant state that is consumed by the three screens in question. As the two repositories, AuthRepository and RestaurantRepository are the only classes that communicate with the outside world, the latter returns Restaurant objects – a simple data class that each discovery screen consumes. Such design highlights the key architectural decision that has been made: screens do not depend on RestaurantRepository implementation and its data source, rather, they depend on the RestaurantRepository interface and the Restaurant type.</w:t>
+        <w:t xml:space="preserve">Figure 4 presents the same system as a class diagram, depicting only those classes that encapsulate the </w:t>
+      </w:r>
+      <w:proofErr w:type="spellStart"/>
+      <w:r>
+        <w:rPr>
+          <w:rFonts w:ascii="Times New Roman" w:hAnsi="Times New Roman" w:cs="Times New Roman"/>
+        </w:rPr>
+        <w:t>behaviour</w:t>
+      </w:r>
+      <w:proofErr w:type="spellEnd"/>
+      <w:r>
+        <w:rPr>
+          <w:rFonts w:ascii="Times New Roman" w:hAnsi="Times New Roman" w:cs="Times New Roman"/>
+        </w:rPr>
+        <w:t xml:space="preserve">. The </w:t>
+      </w:r>
+      <w:proofErr w:type="spellStart"/>
+      <w:r>
+        <w:rPr>
+          <w:rFonts w:ascii="Times New Roman" w:hAnsi="Times New Roman" w:cs="Times New Roman"/>
+        </w:rPr>
+        <w:t>MainActivity</w:t>
+      </w:r>
+      <w:proofErr w:type="spellEnd"/>
+      <w:r>
+        <w:rPr>
+          <w:rFonts w:ascii="Times New Roman" w:hAnsi="Times New Roman" w:cs="Times New Roman"/>
+        </w:rPr>
+        <w:t xml:space="preserve"> class stores the navigation graph and a single shared </w:t>
+      </w:r>
+      <w:proofErr w:type="spellStart"/>
+      <w:r>
+        <w:rPr>
+          <w:rFonts w:ascii="Times New Roman" w:hAnsi="Times New Roman" w:cs="Times New Roman"/>
+        </w:rPr>
+        <w:t>selectedRestaurant</w:t>
+      </w:r>
+      <w:proofErr w:type="spellEnd"/>
+      <w:r>
+        <w:rPr>
+          <w:rFonts w:ascii="Times New Roman" w:hAnsi="Times New Roman" w:cs="Times New Roman"/>
+        </w:rPr>
+        <w:t xml:space="preserve"> state that is consumed by the three screens in question. As the two repositories, </w:t>
+      </w:r>
+      <w:proofErr w:type="spellStart"/>
+      <w:r>
+        <w:rPr>
+          <w:rFonts w:ascii="Times New Roman" w:hAnsi="Times New Roman" w:cs="Times New Roman"/>
+        </w:rPr>
+        <w:t>AuthRepository</w:t>
+      </w:r>
+      <w:proofErr w:type="spellEnd"/>
+      <w:r>
+        <w:rPr>
+          <w:rFonts w:ascii="Times New Roman" w:hAnsi="Times New Roman" w:cs="Times New Roman"/>
+        </w:rPr>
+        <w:t xml:space="preserve"> and </w:t>
+      </w:r>
+      <w:proofErr w:type="spellStart"/>
+      <w:r>
+        <w:rPr>
+          <w:rFonts w:ascii="Times New Roman" w:hAnsi="Times New Roman" w:cs="Times New Roman"/>
+        </w:rPr>
+        <w:t>RestaurantRepository</w:t>
+      </w:r>
+      <w:proofErr w:type="spellEnd"/>
+      <w:r>
+        <w:rPr>
+          <w:rFonts w:ascii="Times New Roman" w:hAnsi="Times New Roman" w:cs="Times New Roman"/>
+        </w:rPr>
+        <w:t xml:space="preserve"> are the only classes that communicate with the outside world, the latter returns Restaurant objects – a simple data class that each discovery screen consumes. Such design highlights the key architectural decision that has been made: screens do not depend on </w:t>
+      </w:r>
+      <w:proofErr w:type="spellStart"/>
+      <w:r>
+        <w:rPr>
+          <w:rFonts w:ascii="Times New Roman" w:hAnsi="Times New Roman" w:cs="Times New Roman"/>
+        </w:rPr>
+        <w:t>RestaurantRepository</w:t>
+      </w:r>
+      <w:proofErr w:type="spellEnd"/>
+      <w:r>
+        <w:rPr>
+          <w:rFonts w:ascii="Times New Roman" w:hAnsi="Times New Roman" w:cs="Times New Roman"/>
+        </w:rPr>
+        <w:t xml:space="preserve"> implementation and its data source, rather, they depend on the </w:t>
+      </w:r>
+      <w:proofErr w:type="spellStart"/>
+      <w:r>
+        <w:rPr>
+          <w:rFonts w:ascii="Times New Roman" w:hAnsi="Times New Roman" w:cs="Times New Roman"/>
+        </w:rPr>
+        <w:t>RestaurantRepository</w:t>
+      </w:r>
+      <w:proofErr w:type="spellEnd"/>
+      <w:r>
+        <w:rPr>
+          <w:rFonts w:ascii="Times New Roman" w:hAnsi="Times New Roman" w:cs="Times New Roman"/>
+        </w:rPr>
+        <w:t xml:space="preserve"> interface and the Restaurant type.</w:t>
       </w:r>
     </w:p>
     <w:p>
@@ -5542,6 +6159,7 @@
         </w:rPr>
         <w:t xml:space="preserve">UML class diagram: screens depend on the </w:t>
       </w:r>
+      <w:proofErr w:type="spellStart"/>
       <w:r>
         <w:rPr>
           <w:rStyle w:val="VerbatimChar"/>
@@ -5549,6 +6167,7 @@
         </w:rPr>
         <w:t>RestaurantRepository</w:t>
       </w:r>
+      <w:proofErr w:type="spellEnd"/>
       <w:r>
         <w:rPr>
           <w:rFonts w:ascii="Times New Roman" w:hAnsi="Times New Roman" w:cs="Times New Roman"/>
@@ -5563,9 +6182,9 @@
           <w:rFonts w:ascii="Times New Roman" w:hAnsi="Times New Roman" w:cs="Times New Roman"/>
         </w:rPr>
       </w:pPr>
-      <w:bookmarkStart w:id="36" w:name="software-architecture"/>
-      <w:bookmarkStart w:id="37" w:name="_Toc237982798"/>
-      <w:bookmarkEnd w:id="33"/>
+      <w:bookmarkStart w:id="36" w:name="_Toc237982798"/>
+      <w:bookmarkStart w:id="37" w:name="software-architecture"/>
+      <w:bookmarkEnd w:id="34"/>
       <w:bookmarkEnd w:id="35"/>
       <w:r>
         <w:rPr>
@@ -5573,7 +6192,7 @@
         </w:rPr>
         <w:t>Software Architecture</w:t>
       </w:r>
-      <w:bookmarkEnd w:id="37"/>
+      <w:bookmarkEnd w:id="36"/>
     </w:p>
     <w:p>
       <w:pPr>
@@ -5680,9 +6299,9 @@
           <w:rFonts w:ascii="Times New Roman" w:hAnsi="Times New Roman" w:cs="Times New Roman"/>
         </w:rPr>
       </w:pPr>
-      <w:bookmarkStart w:id="39" w:name="data-flow"/>
-      <w:bookmarkStart w:id="40" w:name="_Toc237982799"/>
-      <w:bookmarkEnd w:id="36"/>
+      <w:bookmarkStart w:id="39" w:name="_Toc237982799"/>
+      <w:bookmarkStart w:id="40" w:name="data-flow"/>
+      <w:bookmarkEnd w:id="37"/>
       <w:bookmarkEnd w:id="38"/>
       <w:r>
         <w:rPr>
@@ -5690,7 +6309,7 @@
         </w:rPr>
         <w:t>Data Flow</w:t>
       </w:r>
-      <w:bookmarkEnd w:id="40"/>
+      <w:bookmarkEnd w:id="39"/>
     </w:p>
     <w:p>
       <w:pPr>
@@ -5785,9 +6404,9 @@
           <w:rFonts w:ascii="Times New Roman" w:hAnsi="Times New Roman" w:cs="Times New Roman"/>
         </w:rPr>
       </w:pPr>
-      <w:bookmarkStart w:id="42" w:name="application-flowchart"/>
-      <w:bookmarkStart w:id="43" w:name="_Toc237982800"/>
-      <w:bookmarkEnd w:id="39"/>
+      <w:bookmarkStart w:id="42" w:name="_Toc237982800"/>
+      <w:bookmarkStart w:id="43" w:name="application-flowchart"/>
+      <w:bookmarkEnd w:id="40"/>
       <w:bookmarkEnd w:id="41"/>
       <w:r>
         <w:rPr>
@@ -5795,7 +6414,7 @@
         </w:rPr>
         <w:t>Application Flowchart</w:t>
       </w:r>
-      <w:bookmarkEnd w:id="43"/>
+      <w:bookmarkEnd w:id="42"/>
     </w:p>
     <w:p>
       <w:pPr>
@@ -5808,7 +6427,35 @@
         <w:rPr>
           <w:rFonts w:ascii="Times New Roman" w:hAnsi="Times New Roman" w:cs="Times New Roman"/>
         </w:rPr>
-        <w:t xml:space="preserve">Whereas the data flow diagram in Figure 6 shows what data flows between components, the flowchart in Figure 7 visualises the control flow the user goes through at runtime in standard notation. The rounded terminators indicate the start and two exit points, the rectangles represent the processing steps and the diamonds represent decision making performed by the application. This allows one to highlight the conditional logic in particular gates: whether a valid session exists (determining whether the user will reach Home or be redirected to login) and whether the location permission is granted (determining whether the map will be centred </w:t>
+        <w:t xml:space="preserve">Whereas the data flow diagram in Figure 6 shows what data flows between components, the flowchart in Figure 7 </w:t>
+      </w:r>
+      <w:proofErr w:type="spellStart"/>
+      <w:r>
+        <w:rPr>
+          <w:rFonts w:ascii="Times New Roman" w:hAnsi="Times New Roman" w:cs="Times New Roman"/>
+        </w:rPr>
+        <w:t>visualises</w:t>
+      </w:r>
+      <w:proofErr w:type="spellEnd"/>
+      <w:r>
+        <w:rPr>
+          <w:rFonts w:ascii="Times New Roman" w:hAnsi="Times New Roman" w:cs="Times New Roman"/>
+        </w:rPr>
+        <w:t xml:space="preserve"> the control flow the user goes through at runtime in standard notation. The rounded terminators indicate the start and two exit points, the rectangles represent the processing steps and the diamonds represent decision making performed by the application. This allows one to highlight the conditional logic in particular gates: whether a valid session exists (determining whether the user will reach Home or be redirected to login) and whether the location permission is granted (determining whether the map will be </w:t>
+      </w:r>
+      <w:proofErr w:type="spellStart"/>
+      <w:r>
+        <w:rPr>
+          <w:rFonts w:ascii="Times New Roman" w:hAnsi="Times New Roman" w:cs="Times New Roman"/>
+        </w:rPr>
+        <w:t>centred</w:t>
+      </w:r>
+      <w:proofErr w:type="spellEnd"/>
+      <w:r>
+        <w:rPr>
+          <w:rFonts w:ascii="Times New Roman" w:hAnsi="Times New Roman" w:cs="Times New Roman"/>
+        </w:rPr>
+        <w:t xml:space="preserve"> </w:t>
       </w:r>
       <w:proofErr w:type="gramStart"/>
       <w:r>
@@ -5904,10 +6551,10 @@
           <w:rFonts w:cs="Times New Roman"/>
         </w:rPr>
       </w:pPr>
-      <w:bookmarkStart w:id="45" w:name="implementation"/>
-      <w:bookmarkStart w:id="46" w:name="_Toc237982801"/>
-      <w:bookmarkEnd w:id="24"/>
-      <w:bookmarkEnd w:id="42"/>
+      <w:bookmarkStart w:id="45" w:name="_Toc237982801"/>
+      <w:bookmarkStart w:id="46" w:name="implementation"/>
+      <w:bookmarkEnd w:id="25"/>
+      <w:bookmarkEnd w:id="43"/>
       <w:bookmarkEnd w:id="44"/>
       <w:r>
         <w:rPr>
@@ -5915,7 +6562,7 @@
         </w:rPr>
         <w:t>Implementation</w:t>
       </w:r>
-      <w:bookmarkEnd w:id="46"/>
+      <w:bookmarkEnd w:id="45"/>
     </w:p>
     <w:p>
       <w:pPr>
@@ -5924,15 +6571,15 @@
           <w:rFonts w:ascii="Times New Roman" w:hAnsi="Times New Roman" w:cs="Times New Roman"/>
         </w:rPr>
       </w:pPr>
-      <w:bookmarkStart w:id="47" w:name="screens"/>
-      <w:bookmarkStart w:id="48" w:name="_Toc237982802"/>
+      <w:bookmarkStart w:id="47" w:name="_Toc237982802"/>
+      <w:bookmarkStart w:id="48" w:name="screens"/>
       <w:r>
         <w:rPr>
           <w:rFonts w:ascii="Times New Roman" w:hAnsi="Times New Roman" w:cs="Times New Roman"/>
         </w:rPr>
         <w:t>Screens</w:t>
       </w:r>
-      <w:bookmarkEnd w:id="48"/>
+      <w:bookmarkEnd w:id="47"/>
     </w:p>
     <w:p>
       <w:pPr>
@@ -5973,7 +6620,21 @@
         <w:rPr>
           <w:rFonts w:ascii="Times New Roman" w:hAnsi="Times New Roman" w:cs="Times New Roman"/>
         </w:rPr>
-        <w:t xml:space="preserve">. The bottom row contains screens that are accessed through branching out of the path in the top row: Registration screen branching off the Login screen, and Contact Us and Privacy Policy off Home, and Video, TikTok and Directions off Detail screens, each with a "reached from..." note in its caption </w:t>
+        <w:t xml:space="preserve">. The bottom row contains screens that are accessed through branching out of the path in the top row: Registration screen branching off the Login screen, and Contact Us and Privacy Policy off Home, and Video, </w:t>
+      </w:r>
+      <w:proofErr w:type="spellStart"/>
+      <w:r>
+        <w:rPr>
+          <w:rFonts w:ascii="Times New Roman" w:hAnsi="Times New Roman" w:cs="Times New Roman"/>
+        </w:rPr>
+        <w:t>TikTok</w:t>
+      </w:r>
+      <w:proofErr w:type="spellEnd"/>
+      <w:r>
+        <w:rPr>
+          <w:rFonts w:ascii="Times New Roman" w:hAnsi="Times New Roman" w:cs="Times New Roman"/>
+        </w:rPr>
+        <w:t xml:space="preserve"> and Directions off Detail screens, each with a "reached from..." note in its caption </w:t>
       </w:r>
       <w:r>
         <w:rPr>
@@ -6464,7 +7125,43 @@
                 <w:i/>
                 <w:iCs/>
               </w:rPr>
-              <w:t xml:space="preserve">Map centred on the user’s real GPS location, showing nearby restaurants as tappable </w:t>
+              <w:t xml:space="preserve">Map </w:t>
+            </w:r>
+            <w:proofErr w:type="spellStart"/>
+            <w:r>
+              <w:rPr>
+                <w:rFonts w:ascii="Times New Roman" w:hAnsi="Times New Roman" w:cs="Times New Roman"/>
+                <w:i/>
+                <w:iCs/>
+              </w:rPr>
+              <w:t>centred</w:t>
+            </w:r>
+            <w:proofErr w:type="spellEnd"/>
+            <w:r>
+              <w:rPr>
+                <w:rFonts w:ascii="Times New Roman" w:hAnsi="Times New Roman" w:cs="Times New Roman"/>
+                <w:i/>
+                <w:iCs/>
+              </w:rPr>
+              <w:t xml:space="preserve"> on the user’s real GPS location, showing nearby restaurants as </w:t>
+            </w:r>
+            <w:proofErr w:type="spellStart"/>
+            <w:r>
+              <w:rPr>
+                <w:rFonts w:ascii="Times New Roman" w:hAnsi="Times New Roman" w:cs="Times New Roman"/>
+                <w:i/>
+                <w:iCs/>
+              </w:rPr>
+              <w:t>tappable</w:t>
+            </w:r>
+            <w:proofErr w:type="spellEnd"/>
+            <w:r>
+              <w:rPr>
+                <w:rFonts w:ascii="Times New Roman" w:hAnsi="Times New Roman" w:cs="Times New Roman"/>
+                <w:i/>
+                <w:iCs/>
+              </w:rPr>
+              <w:t xml:space="preserve"> </w:t>
             </w:r>
             <w:r>
               <w:rPr>
@@ -6847,7 +7544,25 @@
                 <w:i/>
                 <w:iCs/>
               </w:rPr>
-              <w:t>Privacy Policy screen summarising how location data and account details are used and stored. (Fro</w:t>
+              <w:t xml:space="preserve">Privacy Policy screen </w:t>
+            </w:r>
+            <w:proofErr w:type="spellStart"/>
+            <w:r>
+              <w:rPr>
+                <w:rFonts w:ascii="Times New Roman" w:hAnsi="Times New Roman" w:cs="Times New Roman"/>
+                <w:i/>
+                <w:iCs/>
+              </w:rPr>
+              <w:t>summarising</w:t>
+            </w:r>
+            <w:proofErr w:type="spellEnd"/>
+            <w:r>
+              <w:rPr>
+                <w:rFonts w:ascii="Times New Roman" w:hAnsi="Times New Roman" w:cs="Times New Roman"/>
+                <w:i/>
+                <w:iCs/>
+              </w:rPr>
+              <w:t xml:space="preserve"> how location data and account details are used and stored. (Fro</w:t>
             </w:r>
             <w:r>
               <w:rPr>
@@ -7054,13 +7769,41 @@
               </w:rPr>
               <w:br/>
             </w:r>
+            <w:proofErr w:type="spellStart"/>
             <w:r>
               <w:rPr>
                 <w:rFonts w:ascii="Times New Roman" w:hAnsi="Times New Roman" w:cs="Times New Roman"/>
                 <w:i/>
                 <w:iCs/>
               </w:rPr>
-              <w:t>TikTok link screen, styled like a post, opening a TikTok search for the restaurant.</w:t>
+              <w:t>TikTok</w:t>
+            </w:r>
+            <w:proofErr w:type="spellEnd"/>
+            <w:r>
+              <w:rPr>
+                <w:rFonts w:ascii="Times New Roman" w:hAnsi="Times New Roman" w:cs="Times New Roman"/>
+                <w:i/>
+                <w:iCs/>
+              </w:rPr>
+              <w:t xml:space="preserve"> link screen, styled like a post, opening a </w:t>
+            </w:r>
+            <w:proofErr w:type="spellStart"/>
+            <w:r>
+              <w:rPr>
+                <w:rFonts w:ascii="Times New Roman" w:hAnsi="Times New Roman" w:cs="Times New Roman"/>
+                <w:i/>
+                <w:iCs/>
+              </w:rPr>
+              <w:t>TikTok</w:t>
+            </w:r>
+            <w:proofErr w:type="spellEnd"/>
+            <w:r>
+              <w:rPr>
+                <w:rFonts w:ascii="Times New Roman" w:hAnsi="Times New Roman" w:cs="Times New Roman"/>
+                <w:i/>
+                <w:iCs/>
+              </w:rPr>
+              <w:t xml:space="preserve"> search for the restaurant.</w:t>
             </w:r>
           </w:p>
         </w:tc>
@@ -7172,9 +7915,9 @@
           <w:rFonts w:ascii="Times New Roman" w:hAnsi="Times New Roman" w:cs="Times New Roman"/>
         </w:rPr>
       </w:pPr>
-      <w:bookmarkStart w:id="50" w:name="location-and-mapping"/>
-      <w:bookmarkStart w:id="51" w:name="_Toc237982803"/>
-      <w:bookmarkEnd w:id="47"/>
+      <w:bookmarkStart w:id="50" w:name="_Toc237982803"/>
+      <w:bookmarkStart w:id="51" w:name="location-and-mapping"/>
+      <w:bookmarkEnd w:id="48"/>
       <w:bookmarkEnd w:id="49"/>
       <w:r>
         <w:rPr>
@@ -7182,32 +7925,74 @@
         </w:rPr>
         <w:t>Location and Mapping</w:t>
       </w:r>
+      <w:bookmarkEnd w:id="50"/>
+    </w:p>
+    <w:p>
+      <w:pPr>
+        <w:pStyle w:val="FirstParagraph"/>
+        <w:rPr>
+          <w:rFonts w:ascii="Times New Roman" w:hAnsi="Times New Roman" w:cs="Times New Roman"/>
+        </w:rPr>
+      </w:pPr>
+      <w:r>
+        <w:rPr>
+          <w:rFonts w:ascii="Times New Roman" w:hAnsi="Times New Roman" w:cs="Times New Roman"/>
+        </w:rPr>
+        <w:t>The Map screen uses Fused Location Provider (</w:t>
+      </w:r>
+      <w:proofErr w:type="spellStart"/>
+      <w:r>
+        <w:rPr>
+          <w:rFonts w:ascii="Times New Roman" w:hAnsi="Times New Roman" w:cs="Times New Roman"/>
+        </w:rPr>
+        <w:t>FusedLocationProviderClient</w:t>
+      </w:r>
+      <w:proofErr w:type="spellEnd"/>
+      <w:r>
+        <w:rPr>
+          <w:rFonts w:ascii="Times New Roman" w:hAnsi="Times New Roman" w:cs="Times New Roman"/>
+        </w:rPr>
+        <w:t>) – Google’s recommendation on obtaining the device location in Android applications (Google LLC 2024b). It reads the device's last known location after requesting the ACCESS_FINE_LOCATION runtime permission through Accompanist Permissions library. The actual rendering of the map is done using the Maps Compose library (</w:t>
+      </w:r>
+      <w:proofErr w:type="spellStart"/>
+      <w:r>
+        <w:rPr>
+          <w:rFonts w:ascii="Times New Roman" w:hAnsi="Times New Roman" w:cs="Times New Roman"/>
+        </w:rPr>
+        <w:t>com.google.maps.android.compose</w:t>
+      </w:r>
+      <w:proofErr w:type="spellEnd"/>
+      <w:r>
+        <w:rPr>
+          <w:rFonts w:ascii="Times New Roman" w:hAnsi="Times New Roman" w:cs="Times New Roman"/>
+        </w:rPr>
+        <w:t xml:space="preserve">), wrapping the native Google Maps SDK into the </w:t>
+      </w:r>
+      <w:proofErr w:type="spellStart"/>
+      <w:r>
+        <w:rPr>
+          <w:rFonts w:ascii="Times New Roman" w:hAnsi="Times New Roman" w:cs="Times New Roman"/>
+        </w:rPr>
+        <w:t>composable</w:t>
+      </w:r>
+      <w:proofErr w:type="spellEnd"/>
+      <w:r>
+        <w:rPr>
+          <w:rFonts w:ascii="Times New Roman" w:hAnsi="Times New Roman" w:cs="Times New Roman"/>
+        </w:rPr>
+        <w:t>. Each restaurant is displayed as a marker containing restaurant name and a combination of its cuisine and rating; clicking on the marker brings up the Restaurant Detail screen for that restaurant. Directions screen is implemented in the same way independently; therefore, if the user's location changed in the meanwhile, directions are calculated based on the updated information.</w:t>
+      </w:r>
+    </w:p>
+    <w:p>
+      <w:pPr>
+        <w:pStyle w:val="Heading2"/>
+        <w:rPr>
+          <w:rFonts w:ascii="Times New Roman" w:hAnsi="Times New Roman" w:cs="Times New Roman"/>
+        </w:rPr>
+      </w:pPr>
+      <w:bookmarkStart w:id="52" w:name="_Toc237982804"/>
+      <w:bookmarkStart w:id="53" w:name="restaurant-data"/>
       <w:bookmarkEnd w:id="51"/>
-    </w:p>
-    <w:p>
-      <w:pPr>
-        <w:pStyle w:val="FirstParagraph"/>
-        <w:rPr>
-          <w:rFonts w:ascii="Times New Roman" w:hAnsi="Times New Roman" w:cs="Times New Roman"/>
-        </w:rPr>
-      </w:pPr>
-      <w:r>
-        <w:rPr>
-          <w:rFonts w:ascii="Times New Roman" w:hAnsi="Times New Roman" w:cs="Times New Roman"/>
-        </w:rPr>
-        <w:t>The Map screen uses Fused Location Provider (FusedLocationProviderClient) – Google’s recommendation on obtaining the device location in Android applications (Google LLC 2024b). It reads the device's last known location after requesting the ACCESS_FINE_LOCATION runtime permission through Accompanist Permissions library. The actual rendering of the map is done using the Maps Compose library (com.google.maps.android.compose), wrapping the native Google Maps SDK into the composable. Each restaurant is displayed as a marker containing restaurant name and a combination of its cuisine and rating; clicking on the marker brings up the Restaurant Detail screen for that restaurant. Directions screen is implemented in the same way independently; therefore, if the user's location changed in the meanwhile, directions are calculated based on the updated information.</w:t>
-      </w:r>
-    </w:p>
-    <w:p>
-      <w:pPr>
-        <w:pStyle w:val="Heading2"/>
-        <w:rPr>
-          <w:rFonts w:ascii="Times New Roman" w:hAnsi="Times New Roman" w:cs="Times New Roman"/>
-        </w:rPr>
-      </w:pPr>
-      <w:bookmarkStart w:id="52" w:name="restaurant-data"/>
-      <w:bookmarkStart w:id="53" w:name="_Toc237982804"/>
-      <w:bookmarkEnd w:id="50"/>
       <w:r>
         <w:rPr>
           <w:rFonts w:ascii="Times New Roman" w:hAnsi="Times New Roman" w:cs="Times New Roman"/>
@@ -7215,22 +8000,160 @@
         <w:lastRenderedPageBreak/>
         <w:t>Restaurant Data</w:t>
       </w:r>
+      <w:bookmarkEnd w:id="52"/>
+    </w:p>
+    <w:p>
+      <w:pPr>
+        <w:pStyle w:val="FirstParagraph"/>
+        <w:rPr>
+          <w:rFonts w:ascii="Times New Roman" w:hAnsi="Times New Roman" w:cs="Times New Roman"/>
+          <w:highlight w:val="green"/>
+        </w:rPr>
+      </w:pPr>
+      <w:r>
+        <w:rPr>
+          <w:rFonts w:ascii="Times New Roman" w:hAnsi="Times New Roman" w:cs="Times New Roman"/>
+          <w:highlight w:val="green"/>
+        </w:rPr>
+        <w:t xml:space="preserve">Restaurant data is now provided by </w:t>
+      </w:r>
+      <w:proofErr w:type="spellStart"/>
+      <w:r>
+        <w:rPr>
+          <w:rFonts w:ascii="Times New Roman" w:hAnsi="Times New Roman" w:cs="Times New Roman"/>
+          <w:highlight w:val="green"/>
+        </w:rPr>
+        <w:t>PlacesRepository</w:t>
+      </w:r>
+      <w:proofErr w:type="spellEnd"/>
+      <w:r>
+        <w:rPr>
+          <w:rFonts w:ascii="Times New Roman" w:hAnsi="Times New Roman" w:cs="Times New Roman"/>
+          <w:highlight w:val="green"/>
+        </w:rPr>
+        <w:t xml:space="preserve">, which calls the Google Places API (New) directly: Nearby Search for the map's initial list, Text Search for the search bar. Each result carries the restaurant's real name, a cuisine derived from the Places API's </w:t>
+      </w:r>
+      <w:proofErr w:type="spellStart"/>
+      <w:r>
+        <w:rPr>
+          <w:rFonts w:ascii="Times New Roman" w:hAnsi="Times New Roman" w:cs="Times New Roman"/>
+          <w:highlight w:val="green"/>
+        </w:rPr>
+        <w:t>primaryType</w:t>
+      </w:r>
+      <w:proofErr w:type="spellEnd"/>
+      <w:r>
+        <w:rPr>
+          <w:rFonts w:ascii="Times New Roman" w:hAnsi="Times New Roman" w:cs="Times New Roman"/>
+          <w:highlight w:val="green"/>
+        </w:rPr>
+        <w:t xml:space="preserve"> field (with a small curated mapping to a demo video for five common cuisines, and a YouTube search link as a fallback for the rest), rating, computed distance from the user's real coordinates, address, and location. </w:t>
+      </w:r>
+      <w:proofErr w:type="spellStart"/>
+      <w:r>
+        <w:rPr>
+          <w:rFonts w:ascii="Times New Roman" w:hAnsi="Times New Roman" w:cs="Times New Roman"/>
+          <w:highlight w:val="green"/>
+        </w:rPr>
+        <w:t>PlacesRepository</w:t>
+      </w:r>
+      <w:proofErr w:type="spellEnd"/>
+      <w:r>
+        <w:rPr>
+          <w:rFonts w:ascii="Times New Roman" w:hAnsi="Times New Roman" w:cs="Times New Roman"/>
+          <w:highlight w:val="green"/>
+        </w:rPr>
+        <w:t xml:space="preserve"> replaced the original </w:t>
+      </w:r>
+      <w:proofErr w:type="spellStart"/>
+      <w:r>
+        <w:rPr>
+          <w:rFonts w:ascii="Times New Roman" w:hAnsi="Times New Roman" w:cs="Times New Roman"/>
+          <w:highlight w:val="green"/>
+        </w:rPr>
+        <w:t>RestaurantRepository</w:t>
+      </w:r>
+      <w:proofErr w:type="spellEnd"/>
+      <w:r>
+        <w:rPr>
+          <w:rFonts w:ascii="Times New Roman" w:hAnsi="Times New Roman" w:cs="Times New Roman"/>
+          <w:highlight w:val="green"/>
+        </w:rPr>
+        <w:t>, which returned a fixed in-memory list of five placeholder restaurants; because both were consumed by the Map screen through the same interface, the swap required no changes to the Map screen itself, exactly as intended by the architecture described in Section 4.3.</w:t>
+      </w:r>
+    </w:p>
+    <w:p>
+      <w:pPr>
+        <w:pStyle w:val="Heading2"/>
+        <w:rPr>
+          <w:rFonts w:ascii="Times New Roman" w:hAnsi="Times New Roman" w:cs="Times New Roman"/>
+        </w:rPr>
+      </w:pPr>
+      <w:bookmarkStart w:id="54" w:name="_Toc237982805"/>
+      <w:bookmarkStart w:id="55" w:name="video-and-directions"/>
       <w:bookmarkEnd w:id="53"/>
+      <w:r>
+        <w:rPr>
+          <w:rFonts w:ascii="Times New Roman" w:hAnsi="Times New Roman" w:cs="Times New Roman"/>
+        </w:rPr>
+        <w:t>Video and Directions</w:t>
+      </w:r>
+      <w:bookmarkEnd w:id="54"/>
     </w:p>
     <w:p>
       <w:pPr>
         <w:pStyle w:val="FirstParagraph"/>
         <w:rPr>
           <w:rFonts w:ascii="Times New Roman" w:hAnsi="Times New Roman" w:cs="Times New Roman"/>
-          <w:highlight w:val="green"/>
-        </w:rPr>
-      </w:pPr>
-      <w:r>
-        <w:rPr>
-          <w:rFonts w:ascii="Times New Roman" w:hAnsi="Times New Roman" w:cs="Times New Roman"/>
-          <w:highlight w:val="green"/>
-        </w:rPr>
-        <w:t>Restaurant data is now provided by PlacesRepository, which calls the Google Places API (New) directly: Nearby Search for the map's initial list, Text Search for the search bar. Each result carries the restaurant's real name, a cuisine derived from the Places API's primaryType field (with a small curated mapping to a demo video for five common cuisines, and a YouTube search link as a fallback for the rest), rating, computed distance from the user's real coordinates, address, and location. PlacesRepository replaced the original RestaurantRepository, which returned a fixed in-memory list of five placeholder restaurants; because both were consumed by the Map screen through the same interface, the swap required no changes to the Map screen itself, exactly as intended by the architecture described in Section 4.3.</w:t>
+        </w:rPr>
+      </w:pPr>
+      <w:r>
+        <w:rPr>
+          <w:rFonts w:ascii="Times New Roman" w:hAnsi="Times New Roman" w:cs="Times New Roman"/>
+        </w:rPr>
+        <w:t xml:space="preserve">Instead of implementing video playback inside the application using </w:t>
+      </w:r>
+      <w:proofErr w:type="spellStart"/>
+      <w:r>
+        <w:rPr>
+          <w:rFonts w:ascii="Times New Roman" w:hAnsi="Times New Roman" w:cs="Times New Roman"/>
+        </w:rPr>
+        <w:t>WebView</w:t>
+      </w:r>
+      <w:proofErr w:type="spellEnd"/>
+      <w:r>
+        <w:rPr>
+          <w:rFonts w:ascii="Times New Roman" w:hAnsi="Times New Roman" w:cs="Times New Roman"/>
+        </w:rPr>
+        <w:t xml:space="preserve">, the Video screen dispatches the URL of the YouTube video through an Android Intent with action ACTION_VIEW; the OS, in turn, either opens the YouTube app with such a URL, or a browser. Second button on the same screen leads to the </w:t>
+      </w:r>
+      <w:proofErr w:type="spellStart"/>
+      <w:r>
+        <w:rPr>
+          <w:rFonts w:ascii="Times New Roman" w:hAnsi="Times New Roman" w:cs="Times New Roman"/>
+        </w:rPr>
+        <w:t>TikTok</w:t>
+      </w:r>
+      <w:proofErr w:type="spellEnd"/>
+      <w:r>
+        <w:rPr>
+          <w:rFonts w:ascii="Times New Roman" w:hAnsi="Times New Roman" w:cs="Times New Roman"/>
+        </w:rPr>
+        <w:t xml:space="preserve"> Link screen, styled to look like a post, which opens the </w:t>
+      </w:r>
+      <w:proofErr w:type="spellStart"/>
+      <w:r>
+        <w:rPr>
+          <w:rFonts w:ascii="Times New Roman" w:hAnsi="Times New Roman" w:cs="Times New Roman"/>
+        </w:rPr>
+        <w:t>TikTok</w:t>
+      </w:r>
+      <w:proofErr w:type="spellEnd"/>
+      <w:r>
+        <w:rPr>
+          <w:rFonts w:ascii="Times New Roman" w:hAnsi="Times New Roman" w:cs="Times New Roman"/>
+        </w:rPr>
+        <w:t xml:space="preserve"> search for the restaurant's name with the same mechanism. Directions screen follows an identical pattern: it builds the Google Maps URL from the user's coordinates and the restaurant's coordinates, encoding the chosen transportation mode (car, bus or walk), and dispatches it through ACTION_VIEW in order for the Google Maps app to open with the turn-by-turn directions set already.</w:t>
       </w:r>
     </w:p>
     <w:p>
@@ -7240,48 +8163,16 @@
           <w:rFonts w:ascii="Times New Roman" w:hAnsi="Times New Roman" w:cs="Times New Roman"/>
         </w:rPr>
       </w:pPr>
-      <w:bookmarkStart w:id="54" w:name="video-and-directions"/>
-      <w:bookmarkStart w:id="55" w:name="_Toc237982805"/>
-      <w:bookmarkEnd w:id="52"/>
-      <w:r>
-        <w:rPr>
-          <w:rFonts w:ascii="Times New Roman" w:hAnsi="Times New Roman" w:cs="Times New Roman"/>
-        </w:rPr>
-        <w:t>Video and Directions</w:t>
-      </w:r>
+      <w:bookmarkStart w:id="56" w:name="_Toc237982806"/>
+      <w:bookmarkStart w:id="57" w:name="authentication"/>
       <w:bookmarkEnd w:id="55"/>
-    </w:p>
-    <w:p>
-      <w:pPr>
-        <w:pStyle w:val="FirstParagraph"/>
-        <w:rPr>
-          <w:rFonts w:ascii="Times New Roman" w:hAnsi="Times New Roman" w:cs="Times New Roman"/>
-        </w:rPr>
-      </w:pPr>
-      <w:r>
-        <w:rPr>
-          <w:rFonts w:ascii="Times New Roman" w:hAnsi="Times New Roman" w:cs="Times New Roman"/>
-        </w:rPr>
-        <w:t>Instead of implementing video playback inside the application using WebView, the Video screen dispatches the URL of the YouTube video through an Android Intent with action ACTION_VIEW; the OS, in turn, either opens the YouTube app with such a URL, or a browser. Second button on the same screen leads to the TikTok Link screen, styled to look like a post, which opens the TikTok search for the restaurant's name with the same mechanism. Directions screen follows an identical pattern: it builds the Google Maps URL from the user's coordinates and the restaurant's coordinates, encoding the chosen transportation mode (car, bus or walk), and dispatches it through ACTION_VIEW in order for the Google Maps app to open with the turn-by-turn directions set already.</w:t>
-      </w:r>
-    </w:p>
-    <w:p>
-      <w:pPr>
-        <w:pStyle w:val="Heading2"/>
-        <w:rPr>
-          <w:rFonts w:ascii="Times New Roman" w:hAnsi="Times New Roman" w:cs="Times New Roman"/>
-        </w:rPr>
-      </w:pPr>
-      <w:bookmarkStart w:id="56" w:name="authentication"/>
-      <w:bookmarkStart w:id="57" w:name="_Toc237982806"/>
-      <w:bookmarkEnd w:id="54"/>
       <w:r>
         <w:rPr>
           <w:rFonts w:ascii="Times New Roman" w:hAnsi="Times New Roman" w:cs="Times New Roman"/>
         </w:rPr>
         <w:t>Authentication</w:t>
       </w:r>
-      <w:bookmarkEnd w:id="57"/>
+      <w:bookmarkEnd w:id="56"/>
     </w:p>
     <w:p>
       <w:pPr>
@@ -7294,7 +8185,49 @@
         <w:rPr>
           <w:rFonts w:ascii="Times New Roman" w:hAnsi="Times New Roman" w:cs="Times New Roman"/>
         </w:rPr>
-        <w:t>Login and registration are backed by Firebase Authentication (Google LLC 2024a) through the AuthRepository, providing register, login, logout and isLoggedIn calls. Registration creates the Firebase user with email and password and assigns the user's display name; login logs an existing user in with the same procedure. Map screen checks isLoggedIn itself and redirects to Login screen if there is no active session, so that the map – and everything accessible from it – becomes gated behind an actual sign-in process rather than a hardcoded credentials check as proposed initially. This feature has been tested end-to-end on a physical Android device: registering a new account, automatic sign-in and accessing the map.</w:t>
+        <w:t xml:space="preserve">Login and registration are backed by Firebase Authentication (Google LLC 2024a) through the </w:t>
+      </w:r>
+      <w:proofErr w:type="spellStart"/>
+      <w:r>
+        <w:rPr>
+          <w:rFonts w:ascii="Times New Roman" w:hAnsi="Times New Roman" w:cs="Times New Roman"/>
+        </w:rPr>
+        <w:t>AuthRepository</w:t>
+      </w:r>
+      <w:proofErr w:type="spellEnd"/>
+      <w:r>
+        <w:rPr>
+          <w:rFonts w:ascii="Times New Roman" w:hAnsi="Times New Roman" w:cs="Times New Roman"/>
+        </w:rPr>
+        <w:t xml:space="preserve">, providing register, login, logout and </w:t>
+      </w:r>
+      <w:proofErr w:type="spellStart"/>
+      <w:r>
+        <w:rPr>
+          <w:rFonts w:ascii="Times New Roman" w:hAnsi="Times New Roman" w:cs="Times New Roman"/>
+        </w:rPr>
+        <w:t>isLoggedIn</w:t>
+      </w:r>
+      <w:proofErr w:type="spellEnd"/>
+      <w:r>
+        <w:rPr>
+          <w:rFonts w:ascii="Times New Roman" w:hAnsi="Times New Roman" w:cs="Times New Roman"/>
+        </w:rPr>
+        <w:t xml:space="preserve"> calls. Registration creates the Firebase user with email and password and assigns the user's display name; login logs an existing user in with the same procedure. Map screen checks </w:t>
+      </w:r>
+      <w:proofErr w:type="spellStart"/>
+      <w:r>
+        <w:rPr>
+          <w:rFonts w:ascii="Times New Roman" w:hAnsi="Times New Roman" w:cs="Times New Roman"/>
+        </w:rPr>
+        <w:t>isLoggedIn</w:t>
+      </w:r>
+      <w:proofErr w:type="spellEnd"/>
+      <w:r>
+        <w:rPr>
+          <w:rFonts w:ascii="Times New Roman" w:hAnsi="Times New Roman" w:cs="Times New Roman"/>
+        </w:rPr>
+        <w:t xml:space="preserve"> itself and redirects to Login screen if there is no active session, so that the map – and everything accessible from it – becomes gated behind an actual sign-in process rather than a hardcoded credentials check as proposed initially. This feature has been tested end-to-end on a physical Android device: registering a new account, automatic sign-in and accessing the map.</w:t>
       </w:r>
     </w:p>
     <w:p>
@@ -7396,9 +8329,9 @@
           <w:rFonts w:ascii="Times New Roman" w:hAnsi="Times New Roman" w:cs="Times New Roman"/>
         </w:rPr>
       </w:pPr>
-      <w:bookmarkStart w:id="59" w:name="navigation-and-state"/>
-      <w:bookmarkStart w:id="60" w:name="_Toc237982807"/>
-      <w:bookmarkEnd w:id="56"/>
+      <w:bookmarkStart w:id="59" w:name="_Toc237982807"/>
+      <w:bookmarkStart w:id="60" w:name="navigation-and-state"/>
+      <w:bookmarkEnd w:id="57"/>
       <w:bookmarkEnd w:id="58"/>
       <w:r>
         <w:rPr>
@@ -7406,39 +8339,67 @@
         </w:rPr>
         <w:t>Navigation and State</w:t>
       </w:r>
+      <w:bookmarkEnd w:id="59"/>
+    </w:p>
+    <w:p>
+      <w:pPr>
+        <w:pStyle w:val="FirstParagraph"/>
+        <w:rPr>
+          <w:rFonts w:ascii="Times New Roman" w:hAnsi="Times New Roman" w:cs="Times New Roman"/>
+        </w:rPr>
+      </w:pPr>
+      <w:r>
+        <w:rPr>
+          <w:rFonts w:ascii="Times New Roman" w:hAnsi="Times New Roman" w:cs="Times New Roman"/>
+        </w:rPr>
+        <w:t xml:space="preserve">All eleven screens are connected within a common Navigation Compose host, which is set up in </w:t>
+      </w:r>
+      <w:proofErr w:type="spellStart"/>
+      <w:r>
+        <w:rPr>
+          <w:rFonts w:ascii="Times New Roman" w:hAnsi="Times New Roman" w:cs="Times New Roman"/>
+        </w:rPr>
+        <w:t>MainActivity</w:t>
+      </w:r>
+      <w:proofErr w:type="spellEnd"/>
+      <w:r>
+        <w:rPr>
+          <w:rFonts w:ascii="Times New Roman" w:hAnsi="Times New Roman" w:cs="Times New Roman"/>
+        </w:rPr>
+        <w:t xml:space="preserve">, with the splash screen as the start destination. Instead of passing the selected restaurant as a navigation argument on each route separately, the app maintains it as a single shared Compose state at the navigation level, updated each time a restaurant is selected from the map. Detail, Video, </w:t>
+      </w:r>
+      <w:proofErr w:type="spellStart"/>
+      <w:r>
+        <w:rPr>
+          <w:rFonts w:ascii="Times New Roman" w:hAnsi="Times New Roman" w:cs="Times New Roman"/>
+        </w:rPr>
+        <w:t>TikTok</w:t>
+      </w:r>
+      <w:proofErr w:type="spellEnd"/>
+      <w:r>
+        <w:rPr>
+          <w:rFonts w:ascii="Times New Roman" w:hAnsi="Times New Roman" w:cs="Times New Roman"/>
+        </w:rPr>
+        <w:t>, and Directions screens read from this same value, meaning the selected restaurant persists through navigating between them.</w:t>
+      </w:r>
+    </w:p>
+    <w:p>
+      <w:pPr>
+        <w:pStyle w:val="Heading2"/>
+        <w:rPr>
+          <w:rFonts w:ascii="Times New Roman" w:hAnsi="Times New Roman" w:cs="Times New Roman"/>
+        </w:rPr>
+      </w:pPr>
+      <w:bookmarkStart w:id="61" w:name="_Toc237982808"/>
+      <w:bookmarkStart w:id="62" w:name="deviations-from-the-original-proposal"/>
       <w:bookmarkEnd w:id="60"/>
-    </w:p>
-    <w:p>
-      <w:pPr>
-        <w:pStyle w:val="FirstParagraph"/>
-        <w:rPr>
-          <w:rFonts w:ascii="Times New Roman" w:hAnsi="Times New Roman" w:cs="Times New Roman"/>
-        </w:rPr>
-      </w:pPr>
-      <w:r>
-        <w:rPr>
-          <w:rFonts w:ascii="Times New Roman" w:hAnsi="Times New Roman" w:cs="Times New Roman"/>
-        </w:rPr>
-        <w:t>All eleven screens are connected within a common Navigation Compose host, which is set up in MainActivity, with the splash screen as the start destination. Instead of passing the selected restaurant as a navigation argument on each route separately, the app maintains it as a single shared Compose state at the navigation level, updated each time a restaurant is selected from the map. Detail, Video, TikTok, and Directions screens read from this same value, meaning the selected restaurant persists through navigating between them.</w:t>
-      </w:r>
-    </w:p>
-    <w:p>
-      <w:pPr>
-        <w:pStyle w:val="Heading2"/>
-        <w:rPr>
-          <w:rFonts w:ascii="Times New Roman" w:hAnsi="Times New Roman" w:cs="Times New Roman"/>
-        </w:rPr>
-      </w:pPr>
-      <w:bookmarkStart w:id="61" w:name="deviations-from-the-original-proposal"/>
-      <w:bookmarkStart w:id="62" w:name="_Toc237982808"/>
-      <w:bookmarkEnd w:id="59"/>
       <w:r>
         <w:rPr>
           <w:rFonts w:ascii="Times New Roman" w:hAnsi="Times New Roman" w:cs="Times New Roman"/>
         </w:rPr>
         <w:t>Deviations from the Original Proposal</w:t>
       </w:r>
-      <w:bookmarkEnd w:id="62"/>
+      <w:bookmarkEnd w:id="61"/>
     </w:p>
     <w:p>
       <w:pPr>
@@ -7465,15 +8426,31 @@
         </w:rPr>
       </w:pPr>
       <w:bookmarkStart w:id="63" w:name="testing-and-evaluation"/>
-      <w:bookmarkEnd w:id="45"/>
-      <w:bookmarkEnd w:id="61"/>
+      <w:bookmarkEnd w:id="46"/>
+      <w:bookmarkEnd w:id="62"/>
       <w:r>
         <w:rPr>
           <w:rFonts w:ascii="Times New Roman" w:hAnsi="Times New Roman" w:cs="Times New Roman"/>
           <w:b/>
         </w:rPr>
         <w:lastRenderedPageBreak/>
-        <w:t>The use of Kotlin and Jetpack Compose instead of Java and Activities.</w:t>
+        <w:t xml:space="preserve">The use of </w:t>
+      </w:r>
+      <w:proofErr w:type="spellStart"/>
+      <w:r>
+        <w:rPr>
+          <w:rFonts w:ascii="Times New Roman" w:hAnsi="Times New Roman" w:cs="Times New Roman"/>
+          <w:b/>
+        </w:rPr>
+        <w:t>Kotlin</w:t>
+      </w:r>
+      <w:proofErr w:type="spellEnd"/>
+      <w:r>
+        <w:rPr>
+          <w:rFonts w:ascii="Times New Roman" w:hAnsi="Times New Roman" w:cs="Times New Roman"/>
+          <w:b/>
+        </w:rPr>
+        <w:t xml:space="preserve"> and Jetpack Compose instead of Java and Activities.</w:t>
       </w:r>
       <w:r>
         <w:rPr>
@@ -7523,13 +8500,57 @@
           <w:rFonts w:ascii="Times New Roman" w:hAnsi="Times New Roman" w:cs="Times New Roman"/>
           <w:b/>
         </w:rPr>
-        <w:t>The playback of video in intents instead of an embedded WebView.</w:t>
-      </w:r>
-      <w:r>
-        <w:rPr>
-          <w:rFonts w:ascii="Times New Roman" w:hAnsi="Times New Roman" w:cs="Times New Roman"/>
-        </w:rPr>
-        <w:t xml:space="preserve"> Handing video playback over to the user’s YouTube and TikTok apps is easier to implement, matches the way of consuming video content that most Android users are used to, and doesn’t involve the complexity of integrating and dealing with additional permissions of WebView.</w:t>
+        <w:t xml:space="preserve">The playback of video in intents instead of an embedded </w:t>
+      </w:r>
+      <w:proofErr w:type="spellStart"/>
+      <w:r>
+        <w:rPr>
+          <w:rFonts w:ascii="Times New Roman" w:hAnsi="Times New Roman" w:cs="Times New Roman"/>
+          <w:b/>
+        </w:rPr>
+        <w:t>WebView</w:t>
+      </w:r>
+      <w:proofErr w:type="spellEnd"/>
+      <w:r>
+        <w:rPr>
+          <w:rFonts w:ascii="Times New Roman" w:hAnsi="Times New Roman" w:cs="Times New Roman"/>
+          <w:b/>
+        </w:rPr>
+        <w:t>.</w:t>
+      </w:r>
+      <w:r>
+        <w:rPr>
+          <w:rFonts w:ascii="Times New Roman" w:hAnsi="Times New Roman" w:cs="Times New Roman"/>
+        </w:rPr>
+        <w:t xml:space="preserve"> Handing video playback over to the user’s YouTube and </w:t>
+      </w:r>
+      <w:proofErr w:type="spellStart"/>
+      <w:r>
+        <w:rPr>
+          <w:rFonts w:ascii="Times New Roman" w:hAnsi="Times New Roman" w:cs="Times New Roman"/>
+        </w:rPr>
+        <w:t>TikTok</w:t>
+      </w:r>
+      <w:proofErr w:type="spellEnd"/>
+      <w:r>
+        <w:rPr>
+          <w:rFonts w:ascii="Times New Roman" w:hAnsi="Times New Roman" w:cs="Times New Roman"/>
+        </w:rPr>
+        <w:t xml:space="preserve"> apps is easier to implement, matches the way of consuming video content that most Android users are used to, and doesn’t involve the complexity of integrating and dealing with additional permissions of </w:t>
+      </w:r>
+      <w:proofErr w:type="spellStart"/>
+      <w:r>
+        <w:rPr>
+          <w:rFonts w:ascii="Times New Roman" w:hAnsi="Times New Roman" w:cs="Times New Roman"/>
+        </w:rPr>
+        <w:t>WebView</w:t>
+      </w:r>
+      <w:proofErr w:type="spellEnd"/>
+      <w:r>
+        <w:rPr>
+          <w:rFonts w:ascii="Times New Roman" w:hAnsi="Times New Roman" w:cs="Times New Roman"/>
+        </w:rPr>
+        <w:t>.</w:t>
       </w:r>
     </w:p>
     <w:p>
@@ -7580,15 +8601,15 @@
           <w:rFonts w:ascii="Times New Roman" w:hAnsi="Times New Roman" w:cs="Times New Roman"/>
         </w:rPr>
       </w:pPr>
-      <w:bookmarkStart w:id="65" w:name="functional-testing"/>
-      <w:bookmarkStart w:id="66" w:name="_Toc237982810"/>
+      <w:bookmarkStart w:id="65" w:name="_Toc237982810"/>
+      <w:bookmarkStart w:id="66" w:name="functional-testing"/>
       <w:r>
         <w:rPr>
           <w:rFonts w:ascii="Times New Roman" w:hAnsi="Times New Roman" w:cs="Times New Roman"/>
         </w:rPr>
         <w:t>Functional Testing</w:t>
       </w:r>
-      <w:bookmarkEnd w:id="66"/>
+      <w:bookmarkEnd w:id="65"/>
     </w:p>
     <w:p>
       <w:pPr>
@@ -7601,7 +8622,21 @@
         <w:rPr>
           <w:rFonts w:ascii="Times New Roman" w:hAnsi="Times New Roman" w:cs="Times New Roman"/>
         </w:rPr>
-        <w:t xml:space="preserve">The testing process done so far involves a device-level test for the core flow together with an additional test suite created in conjunction with the Places API integration, and not a separate objective-oriented test plan. At the device level, the core flow that includes opening the app, creating an account, signing into the account automatically, seeing the map, clicking on the restaurant detail screen, playing the video there, and getting directions has been tested and performs as expected. The automated test suite consists of ten JUnit tests that test the filtering </w:t>
+        <w:t xml:space="preserve">The testing process done so far involves a device-level test for the core flow together with an additional test suite created in conjunction with the Places API integration, and not a separate objective-oriented test plan. At the device level, the core flow that includes opening the app, creating an account, signing into the account automatically, seeing the map, clicking on the restaurant detail screen, playing the video there, and getting directions has been tested and performs as expected. The automated test suite consists of ten </w:t>
+      </w:r>
+      <w:proofErr w:type="spellStart"/>
+      <w:r>
+        <w:rPr>
+          <w:rFonts w:ascii="Times New Roman" w:hAnsi="Times New Roman" w:cs="Times New Roman"/>
+        </w:rPr>
+        <w:t>JUnit</w:t>
+      </w:r>
+      <w:proofErr w:type="spellEnd"/>
+      <w:r>
+        <w:rPr>
+          <w:rFonts w:ascii="Times New Roman" w:hAnsi="Times New Roman" w:cs="Times New Roman"/>
+        </w:rPr>
+        <w:t xml:space="preserve"> tests that test the filtering </w:t>
       </w:r>
       <w:r>
         <w:rPr>
@@ -7640,7 +8675,21 @@
         <w:rPr>
           <w:rFonts w:ascii="Times New Roman" w:hAnsi="Times New Roman" w:cs="Times New Roman"/>
         </w:rPr>
-        <w:t>The on-screen keyboard covered the password field on Login and Registration screens; solved by setting imePadding so the form can scroll away from the keyboard.</w:t>
+        <w:t xml:space="preserve">The on-screen keyboard covered the password field on Login and Registration screens; solved by setting </w:t>
+      </w:r>
+      <w:proofErr w:type="spellStart"/>
+      <w:r>
+        <w:rPr>
+          <w:rFonts w:ascii="Times New Roman" w:hAnsi="Times New Roman" w:cs="Times New Roman"/>
+        </w:rPr>
+        <w:t>imePadding</w:t>
+      </w:r>
+      <w:proofErr w:type="spellEnd"/>
+      <w:r>
+        <w:rPr>
+          <w:rFonts w:ascii="Times New Roman" w:hAnsi="Times New Roman" w:cs="Times New Roman"/>
+        </w:rPr>
+        <w:t xml:space="preserve"> so the form can scroll away from the keyboard.</w:t>
       </w:r>
     </w:p>
     <w:p>
@@ -7694,7 +8743,21 @@
         <w:rPr>
           <w:rFonts w:ascii="Times New Roman" w:hAnsi="Times New Roman" w:cs="Times New Roman"/>
         </w:rPr>
-        <w:t>The navigation bar of the Home screen offered an option “Login” even if the user was already logged in; solved by making both navigation bars use the same isLoggedIn state.</w:t>
+        <w:t xml:space="preserve">The navigation bar of the Home screen offered an option “Login” even if the user was already logged in; solved by making both navigation bars use the same </w:t>
+      </w:r>
+      <w:proofErr w:type="spellStart"/>
+      <w:r>
+        <w:rPr>
+          <w:rFonts w:ascii="Times New Roman" w:hAnsi="Times New Roman" w:cs="Times New Roman"/>
+        </w:rPr>
+        <w:t>isLoggedIn</w:t>
+      </w:r>
+      <w:proofErr w:type="spellEnd"/>
+      <w:r>
+        <w:rPr>
+          <w:rFonts w:ascii="Times New Roman" w:hAnsi="Times New Roman" w:cs="Times New Roman"/>
+        </w:rPr>
+        <w:t xml:space="preserve"> state.</w:t>
       </w:r>
     </w:p>
     <w:p>
@@ -7712,7 +8775,21 @@
         <w:rPr>
           <w:rFonts w:ascii="Times New Roman" w:hAnsi="Times New Roman" w:cs="Times New Roman"/>
         </w:rPr>
-        <w:t>The "Continue as Guest" option on the Login screen completely bypassed Firebase Auth and, once the Map screen was gated behind signing in, put guest users in an infinite redirect loop; this button has been removed. The Login screen screenshot in Figure 8 has been taken before the fix and still features the button, which has been removed from the app.</w:t>
+        <w:t xml:space="preserve">The "Continue as Guest" option on the Login screen completely bypassed Firebase </w:t>
+      </w:r>
+      <w:proofErr w:type="spellStart"/>
+      <w:r>
+        <w:rPr>
+          <w:rFonts w:ascii="Times New Roman" w:hAnsi="Times New Roman" w:cs="Times New Roman"/>
+        </w:rPr>
+        <w:t>Auth</w:t>
+      </w:r>
+      <w:proofErr w:type="spellEnd"/>
+      <w:r>
+        <w:rPr>
+          <w:rFonts w:ascii="Times New Roman" w:hAnsi="Times New Roman" w:cs="Times New Roman"/>
+        </w:rPr>
+        <w:t xml:space="preserve"> and, once the Map screen was gated behind signing in, put guest users in an infinite redirect loop; this button has been removed. The Login screen screenshot in Figure 8 has been taken before the fix and still features the button, which has been removed from the app.</w:t>
       </w:r>
     </w:p>
     <w:p>
@@ -7722,16 +8799,16 @@
           <w:rFonts w:ascii="Times New Roman" w:hAnsi="Times New Roman" w:cs="Times New Roman"/>
         </w:rPr>
       </w:pPr>
-      <w:bookmarkStart w:id="67" w:name="usability-considerations"/>
-      <w:bookmarkStart w:id="68" w:name="_Toc237982811"/>
-      <w:bookmarkEnd w:id="65"/>
+      <w:bookmarkStart w:id="67" w:name="_Toc237982811"/>
+      <w:bookmarkStart w:id="68" w:name="usability-considerations"/>
+      <w:bookmarkEnd w:id="66"/>
       <w:r>
         <w:rPr>
           <w:rFonts w:ascii="Times New Roman" w:hAnsi="Times New Roman" w:cs="Times New Roman"/>
         </w:rPr>
         <w:t>Usability Considerations</w:t>
       </w:r>
-      <w:bookmarkEnd w:id="68"/>
+      <w:bookmarkEnd w:id="67"/>
     </w:p>
     <w:p>
       <w:pPr>
@@ -7762,17 +8839,198 @@
           <w:rFonts w:cs="Times New Roman"/>
         </w:rPr>
       </w:pPr>
-      <w:bookmarkStart w:id="69" w:name="analysis-of-risks-and-ethical-issues"/>
-      <w:bookmarkStart w:id="70" w:name="_Toc237982812"/>
+      <w:bookmarkStart w:id="69" w:name="_Toc237982812"/>
+      <w:bookmarkStart w:id="70" w:name="analysis-of-risks-and-ethical-issues"/>
       <w:bookmarkEnd w:id="63"/>
-      <w:bookmarkEnd w:id="67"/>
+      <w:bookmarkEnd w:id="68"/>
       <w:r>
         <w:rPr>
           <w:rFonts w:cs="Times New Roman"/>
         </w:rPr>
         <w:t>Analysis of Risks and Ethical Issues</w:t>
       </w:r>
+      <w:bookmarkEnd w:id="69"/>
+    </w:p>
+    <w:p>
+      <w:pPr>
+        <w:pStyle w:val="Heading2"/>
+        <w:rPr>
+          <w:rFonts w:ascii="Times New Roman" w:hAnsi="Times New Roman" w:cs="Times New Roman"/>
+        </w:rPr>
+      </w:pPr>
+      <w:bookmarkStart w:id="71" w:name="_Toc237982813"/>
+      <w:bookmarkStart w:id="72" w:name="technical-risks"/>
+      <w:r>
+        <w:rPr>
+          <w:rFonts w:ascii="Times New Roman" w:hAnsi="Times New Roman" w:cs="Times New Roman"/>
+        </w:rPr>
+        <w:t>Technical Risks</w:t>
+      </w:r>
+      <w:bookmarkEnd w:id="71"/>
+    </w:p>
+    <w:p>
+      <w:pPr>
+        <w:pStyle w:val="FirstParagraph"/>
+        <w:rPr>
+          <w:rFonts w:ascii="Times New Roman" w:hAnsi="Times New Roman" w:cs="Times New Roman"/>
+          <w:highlight w:val="green"/>
+        </w:rPr>
+      </w:pPr>
+      <w:r>
+        <w:rPr>
+          <w:rFonts w:ascii="Times New Roman" w:hAnsi="Times New Roman" w:cs="Times New Roman"/>
+        </w:rPr>
+        <w:t xml:space="preserve">As explained in the proposal, Google Places API request limit risk is now an active one due to the fact that the application now uses the Places API (New) in order to retrieve both the initial list of nearby restaurants on the map, as well as perform live search based on typed letters in the search field (Section 8). It is mitigated in accordance with the original plan: the searches are </w:t>
+      </w:r>
+      <w:proofErr w:type="spellStart"/>
+      <w:r>
+        <w:rPr>
+          <w:rFonts w:ascii="Times New Roman" w:hAnsi="Times New Roman" w:cs="Times New Roman"/>
+        </w:rPr>
+        <w:t>debounced</w:t>
+      </w:r>
+      <w:proofErr w:type="spellEnd"/>
+      <w:r>
+        <w:rPr>
+          <w:rFonts w:ascii="Times New Roman" w:hAnsi="Times New Roman" w:cs="Times New Roman"/>
+        </w:rPr>
+        <w:t xml:space="preserve"> by 600 milliseconds to prevent the firing of a call with each key press, and development/demonstration uses well within the quota provided by the API.</w:t>
+      </w:r>
+    </w:p>
+    <w:p>
+      <w:pPr>
+        <w:pStyle w:val="BodyText"/>
+        <w:rPr>
+          <w:rFonts w:ascii="Times New Roman" w:hAnsi="Times New Roman" w:cs="Times New Roman"/>
+          <w:color w:val="000000" w:themeColor="text1"/>
+        </w:rPr>
+      </w:pPr>
+      <w:r>
+        <w:rPr>
+          <w:rFonts w:ascii="Times New Roman" w:hAnsi="Times New Roman" w:cs="Times New Roman"/>
+          <w:color w:val="000000" w:themeColor="text1"/>
+        </w:rPr>
+        <w:t>The risk that the linked video content may get removed or become unavailable still applies to the five video URLs hard-coded into the app, and it is mitigated in the same way as discussed in the proposal — by choosing stable, popular videos for demonstration purposes.</w:t>
+      </w:r>
+    </w:p>
+    <w:p>
+      <w:pPr>
+        <w:pStyle w:val="BodyText"/>
+        <w:rPr>
+          <w:rFonts w:ascii="Times New Roman" w:hAnsi="Times New Roman" w:cs="Times New Roman"/>
+          <w:color w:val="000000" w:themeColor="text1"/>
+        </w:rPr>
+      </w:pPr>
+      <w:r>
+        <w:rPr>
+          <w:rFonts w:ascii="Times New Roman" w:hAnsi="Times New Roman" w:cs="Times New Roman"/>
+          <w:color w:val="000000" w:themeColor="text1"/>
+        </w:rPr>
+        <w:t>Device fragmentation still matters. So far, the app has targeted a minimum API level of 24 and a target API level of 36, which covers a vast majority of active Android devices; so far, the testing has been done on one physical device, and testing across a wider variety of screen sizes and OS versions is yet to be done.</w:t>
+      </w:r>
+    </w:p>
+    <w:p>
+      <w:pPr>
+        <w:pStyle w:val="Heading2"/>
+        <w:rPr>
+          <w:rFonts w:ascii="Times New Roman" w:hAnsi="Times New Roman" w:cs="Times New Roman"/>
+        </w:rPr>
+      </w:pPr>
+      <w:bookmarkStart w:id="73" w:name="_Toc237982814"/>
+      <w:bookmarkStart w:id="74" w:name="ethical-considerations"/>
+      <w:bookmarkEnd w:id="72"/>
+      <w:r>
+        <w:rPr>
+          <w:rFonts w:ascii="Times New Roman" w:hAnsi="Times New Roman" w:cs="Times New Roman"/>
+        </w:rPr>
+        <w:t>Ethical Considerations</w:t>
+      </w:r>
+      <w:bookmarkEnd w:id="73"/>
+    </w:p>
+    <w:p>
+      <w:pPr>
+        <w:pStyle w:val="FirstParagraph"/>
+        <w:rPr>
+          <w:rFonts w:ascii="Times New Roman" w:hAnsi="Times New Roman" w:cs="Times New Roman"/>
+          <w:color w:val="000000" w:themeColor="text1"/>
+        </w:rPr>
+      </w:pPr>
+      <w:r>
+        <w:rPr>
+          <w:rFonts w:ascii="Times New Roman" w:hAnsi="Times New Roman" w:cs="Times New Roman"/>
+          <w:color w:val="000000" w:themeColor="text1"/>
+        </w:rPr>
+        <w:t>This section is the one most affected by the deviation discussed in Section 5.7. The proposal stated that logging in would be a demonstration-only feature and would collect no real personal data. However, the implemented app makes use of Firebase Authentication and thus collects a real email address and password of each user who creates an account. This changes the ethical considerations of the project and needs to be stated clearly.</w:t>
+      </w:r>
+      <w:bookmarkStart w:id="75" w:name="current-progress-and-remaining-work"/>
       <w:bookmarkEnd w:id="70"/>
+      <w:bookmarkEnd w:id="74"/>
+    </w:p>
+    <w:p>
+      <w:pPr>
+        <w:pStyle w:val="FirstParagraph"/>
+        <w:rPr>
+          <w:rFonts w:ascii="Times New Roman" w:hAnsi="Times New Roman" w:cs="Times New Roman"/>
+          <w:color w:val="000000" w:themeColor="text1"/>
+        </w:rPr>
+      </w:pPr>
+      <w:r>
+        <w:rPr>
+          <w:rFonts w:ascii="Times New Roman" w:hAnsi="Times New Roman" w:cs="Times New Roman"/>
+        </w:rPr>
+        <w:t xml:space="preserve">As far as the actual risk posed by this change, it is minimal and very carefully controlled. First off, Firebase Authentication is a managed identity service provided by Google, where passwords are never stored in, or processed by the application itself, nor is there any further collection or </w:t>
+      </w:r>
+      <w:r>
+        <w:rPr>
+          <w:rFonts w:ascii="Times New Roman" w:hAnsi="Times New Roman" w:cs="Times New Roman"/>
+        </w:rPr>
+        <w:lastRenderedPageBreak/>
+        <w:t xml:space="preserve">storage of personal data aside from the email address and display name that is necessary to log into an account. There is no </w:t>
+      </w:r>
+      <w:proofErr w:type="spellStart"/>
+      <w:r>
+        <w:rPr>
+          <w:rFonts w:ascii="Times New Roman" w:hAnsi="Times New Roman" w:cs="Times New Roman"/>
+        </w:rPr>
+        <w:t>Firestore</w:t>
+      </w:r>
+      <w:proofErr w:type="spellEnd"/>
+      <w:r>
+        <w:rPr>
+          <w:rFonts w:ascii="Times New Roman" w:hAnsi="Times New Roman" w:cs="Times New Roman"/>
+        </w:rPr>
+        <w:t xml:space="preserve"> database, and no other store of personal data that exists on the application. Location data is temporarily used for one thing only – it is sent to the Google Places API for a list of nearby restaurants, and for </w:t>
+      </w:r>
+      <w:proofErr w:type="spellStart"/>
+      <w:r>
+        <w:rPr>
+          <w:rFonts w:ascii="Times New Roman" w:hAnsi="Times New Roman" w:cs="Times New Roman"/>
+        </w:rPr>
+        <w:t>centring</w:t>
+      </w:r>
+      <w:proofErr w:type="spellEnd"/>
+      <w:r>
+        <w:rPr>
+          <w:rFonts w:ascii="Times New Roman" w:hAnsi="Times New Roman" w:cs="Times New Roman"/>
+        </w:rPr>
+        <w:t xml:space="preserve"> the map. In addition, a text-based search query is sent to the Gemini API, but nothing else happens to either piece of information aside from sending it in the API requests. Since no actual human data or accounts are ever involved in testing, as it uses only the developer’s own test accounts and does not include any analytics or third-party trackers outside of the aforementioned two requests, this change does not necessitate an actual formal ethics approval; however, it should be noted that any future testing using real human data or location information should only involve consenting testers, aware that a real account is created and that their coordinates and search query are sent to Google's Places and Gemini APIs.</w:t>
+      </w:r>
+    </w:p>
+    <w:p>
+      <w:pPr>
+        <w:pStyle w:val="Heading1"/>
+        <w:rPr>
+          <w:rFonts w:cs="Times New Roman"/>
+        </w:rPr>
+      </w:pPr>
+      <w:bookmarkStart w:id="76" w:name="_Toc237982815"/>
+      <w:r>
+        <w:rPr>
+          <w:rFonts w:cs="Times New Roman"/>
+        </w:rPr>
+        <w:t>Current Progress and Remaining Work</w:t>
+      </w:r>
+      <w:bookmarkEnd w:id="76"/>
     </w:p>
     <w:p>
       <w:pPr>
@@ -7781,154 +9039,15 @@
           <w:rFonts w:ascii="Times New Roman" w:hAnsi="Times New Roman" w:cs="Times New Roman"/>
         </w:rPr>
       </w:pPr>
-      <w:bookmarkStart w:id="71" w:name="technical-risks"/>
-      <w:bookmarkStart w:id="72" w:name="_Toc237982813"/>
-      <w:r>
-        <w:rPr>
-          <w:rFonts w:ascii="Times New Roman" w:hAnsi="Times New Roman" w:cs="Times New Roman"/>
-        </w:rPr>
-        <w:t>Technical Risks</w:t>
-      </w:r>
-      <w:bookmarkEnd w:id="72"/>
-    </w:p>
-    <w:p>
-      <w:pPr>
-        <w:pStyle w:val="FirstParagraph"/>
-        <w:rPr>
-          <w:rFonts w:ascii="Times New Roman" w:hAnsi="Times New Roman" w:cs="Times New Roman"/>
-          <w:highlight w:val="green"/>
-        </w:rPr>
-      </w:pPr>
-      <w:r>
-        <w:rPr>
-          <w:rFonts w:ascii="Times New Roman" w:hAnsi="Times New Roman" w:cs="Times New Roman"/>
-        </w:rPr>
-        <w:t>As explained in the proposal, Google Places API request limit risk is now an active one due to the fact that the application now uses the Places API (New) in order to retrieve both the initial list of nearby restaurants on the map, as well as perform live search based on typed letters in the search field (Section 8). It is mitigated in accordance with the original plan: the searches are debounced by 600 milliseconds to prevent the firing of a call with each key press, and development/demonstration uses well within the quota provided by the API.</w:t>
-      </w:r>
-    </w:p>
-    <w:p>
-      <w:pPr>
-        <w:pStyle w:val="BodyText"/>
-        <w:rPr>
-          <w:rFonts w:ascii="Times New Roman" w:hAnsi="Times New Roman" w:cs="Times New Roman"/>
-          <w:color w:val="000000" w:themeColor="text1"/>
-        </w:rPr>
-      </w:pPr>
-      <w:r>
-        <w:rPr>
-          <w:rFonts w:ascii="Times New Roman" w:hAnsi="Times New Roman" w:cs="Times New Roman"/>
-          <w:color w:val="000000" w:themeColor="text1"/>
-        </w:rPr>
-        <w:t>The risk that the linked video content may get removed or become unavailable still applies to the five video URLs hard-coded into the app, and it is mitigated in the same way as discussed in the proposal — by choosing stable, popular videos for demonstration purposes.</w:t>
-      </w:r>
-    </w:p>
-    <w:p>
-      <w:pPr>
-        <w:pStyle w:val="BodyText"/>
-        <w:rPr>
-          <w:rFonts w:ascii="Times New Roman" w:hAnsi="Times New Roman" w:cs="Times New Roman"/>
-          <w:color w:val="000000" w:themeColor="text1"/>
-        </w:rPr>
-      </w:pPr>
-      <w:r>
-        <w:rPr>
-          <w:rFonts w:ascii="Times New Roman" w:hAnsi="Times New Roman" w:cs="Times New Roman"/>
-          <w:color w:val="000000" w:themeColor="text1"/>
-        </w:rPr>
-        <w:t>Device fragmentation still matters. So far, the app has targeted a minimum API level of 24 and a target API level of 36, which covers a vast majority of active Android devices; so far, the testing has been done on one physical device, and testing across a wider variety of screen sizes and OS versions is yet to be done.</w:t>
-      </w:r>
-    </w:p>
-    <w:p>
-      <w:pPr>
-        <w:pStyle w:val="Heading2"/>
-        <w:rPr>
-          <w:rFonts w:ascii="Times New Roman" w:hAnsi="Times New Roman" w:cs="Times New Roman"/>
-        </w:rPr>
-      </w:pPr>
-      <w:bookmarkStart w:id="73" w:name="ethical-considerations"/>
-      <w:bookmarkStart w:id="74" w:name="_Toc237982814"/>
-      <w:bookmarkEnd w:id="71"/>
-      <w:r>
-        <w:rPr>
-          <w:rFonts w:ascii="Times New Roman" w:hAnsi="Times New Roman" w:cs="Times New Roman"/>
-        </w:rPr>
-        <w:t>Ethical Considerations</w:t>
-      </w:r>
-      <w:bookmarkEnd w:id="74"/>
-    </w:p>
-    <w:p>
-      <w:pPr>
-        <w:pStyle w:val="FirstParagraph"/>
-        <w:rPr>
-          <w:rFonts w:ascii="Times New Roman" w:hAnsi="Times New Roman" w:cs="Times New Roman"/>
-          <w:color w:val="000000" w:themeColor="text1"/>
-        </w:rPr>
-      </w:pPr>
-      <w:r>
-        <w:rPr>
-          <w:rFonts w:ascii="Times New Roman" w:hAnsi="Times New Roman" w:cs="Times New Roman"/>
-          <w:color w:val="000000" w:themeColor="text1"/>
-        </w:rPr>
-        <w:t>This section is the one most affected by the deviation discussed in Section 5.7. The proposal stated that logging in would be a demonstration-only feature and would collect no real personal data. However, the implemented app makes use of Firebase Authentication and thus collects a real email address and password of each user who creates an account. This changes the ethical considerations of the project and needs to be stated clearly.</w:t>
-      </w:r>
-      <w:bookmarkStart w:id="75" w:name="current-progress-and-remaining-work"/>
-      <w:bookmarkEnd w:id="69"/>
-      <w:bookmarkEnd w:id="73"/>
-    </w:p>
-    <w:p>
-      <w:pPr>
-        <w:pStyle w:val="FirstParagraph"/>
-        <w:rPr>
-          <w:rFonts w:ascii="Times New Roman" w:hAnsi="Times New Roman" w:cs="Times New Roman"/>
-          <w:color w:val="000000" w:themeColor="text1"/>
-        </w:rPr>
-      </w:pPr>
-      <w:r>
-        <w:rPr>
-          <w:rFonts w:ascii="Times New Roman" w:hAnsi="Times New Roman" w:cs="Times New Roman"/>
-        </w:rPr>
-        <w:t xml:space="preserve">As far as the actual risk posed by this change, it is minimal and very carefully controlled. First off, Firebase Authentication is a managed identity service provided by Google, where passwords are never stored in, or processed by the application itself, nor is there any further collection or </w:t>
-      </w:r>
-      <w:r>
-        <w:rPr>
-          <w:rFonts w:ascii="Times New Roman" w:hAnsi="Times New Roman" w:cs="Times New Roman"/>
-        </w:rPr>
-        <w:lastRenderedPageBreak/>
-        <w:t>storage of personal data aside from the email address and display name that is necessary to log into an account. There is no Firestore database, and no other store of personal data that exists on the application. Location data is temporarily used for one thing only – it is sent to the Google Places API for a list of nearby restaurants, and for centring the map. In addition, a text-based search query is sent to the Gemini API, but nothing else happens to either piece of information aside from sending it in the API requests. Since no actual human data or accounts are ever involved in testing, as it uses only the developer’s own test accounts and does not include any analytics or third-party trackers outside of the aforementioned two requests, this change does not necessitate an actual formal ethics approval; however, it should be noted that any future testing using real human data or location information should only involve consenting testers, aware that a real account is created and that their coordinates and search query are sent to Google's Places and Gemini APIs.</w:t>
-      </w:r>
-    </w:p>
-    <w:p>
-      <w:pPr>
-        <w:pStyle w:val="Heading1"/>
-        <w:rPr>
-          <w:rFonts w:cs="Times New Roman"/>
-        </w:rPr>
-      </w:pPr>
-      <w:bookmarkStart w:id="76" w:name="_Toc237982815"/>
-      <w:r>
-        <w:rPr>
-          <w:rFonts w:cs="Times New Roman"/>
-        </w:rPr>
-        <w:t>Current Progress and Remaining Work</w:t>
-      </w:r>
-      <w:bookmarkEnd w:id="76"/>
-    </w:p>
-    <w:p>
-      <w:pPr>
-        <w:pStyle w:val="Heading2"/>
-        <w:rPr>
-          <w:rFonts w:ascii="Times New Roman" w:hAnsi="Times New Roman" w:cs="Times New Roman"/>
-        </w:rPr>
-      </w:pPr>
-      <w:bookmarkStart w:id="77" w:name="project-schedule"/>
-      <w:bookmarkStart w:id="78" w:name="_Toc237982816"/>
+      <w:bookmarkStart w:id="77" w:name="_Toc237982816"/>
+      <w:bookmarkStart w:id="78" w:name="project-schedule"/>
       <w:r>
         <w:rPr>
           <w:rFonts w:ascii="Times New Roman" w:hAnsi="Times New Roman" w:cs="Times New Roman"/>
         </w:rPr>
         <w:t>Project Schedule</w:t>
       </w:r>
-      <w:bookmarkEnd w:id="78"/>
+      <w:bookmarkEnd w:id="77"/>
     </w:p>
     <w:p>
       <w:pPr>
@@ -8053,9 +9172,9 @@
           <w:rFonts w:ascii="Times New Roman" w:hAnsi="Times New Roman" w:cs="Times New Roman"/>
         </w:rPr>
       </w:pPr>
-      <w:bookmarkStart w:id="80" w:name="summary-of-progress"/>
-      <w:bookmarkStart w:id="81" w:name="_Toc237982817"/>
-      <w:bookmarkEnd w:id="77"/>
+      <w:bookmarkStart w:id="80" w:name="_Toc237982817"/>
+      <w:bookmarkStart w:id="81" w:name="summary-of-progress"/>
+      <w:bookmarkEnd w:id="78"/>
       <w:bookmarkEnd w:id="79"/>
       <w:r>
         <w:rPr>
@@ -8063,37 +9182,87 @@
         </w:rPr>
         <w:t>Summary of Progress</w:t>
       </w:r>
+      <w:bookmarkEnd w:id="80"/>
+    </w:p>
+    <w:p>
+      <w:pPr>
+        <w:pStyle w:val="FirstParagraph"/>
+        <w:rPr>
+          <w:rFonts w:ascii="Times New Roman" w:hAnsi="Times New Roman" w:cs="Times New Roman"/>
+        </w:rPr>
+      </w:pPr>
+      <w:r>
+        <w:rPr>
+          <w:rFonts w:ascii="Times New Roman" w:hAnsi="Times New Roman" w:cs="Times New Roman"/>
+        </w:rPr>
+        <w:t>All eleven planned screens are implemented and connected through a single navigation flow. The map renders live using the device’s real GPS location and the Google Maps SDK. Firebase Authentication is live and has been tested end-to-end on a physical device, including the UX fixes listed in Section 6.1. Video and directions both work by handing off to external apps through Android intents, and the search bar filters the currently loaded restaurant list in real time.</w:t>
+      </w:r>
+    </w:p>
+    <w:p>
+      <w:pPr>
+        <w:pStyle w:val="FirstParagraph"/>
+        <w:rPr>
+          <w:rFonts w:ascii="Times New Roman" w:hAnsi="Times New Roman" w:cs="Times New Roman"/>
+          <w:highlight w:val="green"/>
+        </w:rPr>
+      </w:pPr>
+      <w:bookmarkStart w:id="82" w:name="remaining-work"/>
       <w:bookmarkEnd w:id="81"/>
-    </w:p>
-    <w:p>
-      <w:pPr>
-        <w:pStyle w:val="FirstParagraph"/>
-        <w:rPr>
-          <w:rFonts w:ascii="Times New Roman" w:hAnsi="Times New Roman" w:cs="Times New Roman"/>
-        </w:rPr>
-      </w:pPr>
-      <w:r>
-        <w:rPr>
-          <w:rFonts w:ascii="Times New Roman" w:hAnsi="Times New Roman" w:cs="Times New Roman"/>
-        </w:rPr>
-        <w:t>All eleven planned screens are implemented and connected through a single navigation flow. The map renders live using the device’s real GPS location and the Google Maps SDK. Firebase Authentication is live and has been tested end-to-end on a physical device, including the UX fixes listed in Section 6.1. Video and directions both work by handing off to external apps through Android intents, and the search bar filters the currently loaded restaurant list in real time.</w:t>
-      </w:r>
-    </w:p>
-    <w:p>
-      <w:pPr>
-        <w:pStyle w:val="FirstParagraph"/>
-        <w:rPr>
-          <w:rFonts w:ascii="Times New Roman" w:hAnsi="Times New Roman" w:cs="Times New Roman"/>
-          <w:highlight w:val="green"/>
-        </w:rPr>
-      </w:pPr>
-      <w:bookmarkStart w:id="82" w:name="remaining-work"/>
-      <w:bookmarkEnd w:id="80"/>
-      <w:r>
-        <w:rPr>
-          <w:rFonts w:ascii="Times New Roman" w:hAnsi="Times New Roman" w:cs="Times New Roman"/>
-        </w:rPr>
-        <w:t xml:space="preserve">RestaurantRepository's hardcoded list has been switched to PlacesRepository, which uses the Google Places API (New) in both Nearby Search and Text Search to retrieve real, live restaurant data close to the user's actual location for both marker display and the search bar. The search bar itself has also gained a debounced (600 ms) live search using the Places Text Search API, in </w:t>
+      <w:proofErr w:type="spellStart"/>
+      <w:r>
+        <w:rPr>
+          <w:rFonts w:ascii="Times New Roman" w:hAnsi="Times New Roman" w:cs="Times New Roman"/>
+        </w:rPr>
+        <w:t>RestaurantRepository's</w:t>
+      </w:r>
+      <w:proofErr w:type="spellEnd"/>
+      <w:r>
+        <w:rPr>
+          <w:rFonts w:ascii="Times New Roman" w:hAnsi="Times New Roman" w:cs="Times New Roman"/>
+        </w:rPr>
+        <w:t xml:space="preserve"> hardcoded list has been switched to </w:t>
+      </w:r>
+      <w:proofErr w:type="spellStart"/>
+      <w:r>
+        <w:rPr>
+          <w:rFonts w:ascii="Times New Roman" w:hAnsi="Times New Roman" w:cs="Times New Roman"/>
+        </w:rPr>
+        <w:t>PlacesRepository</w:t>
+      </w:r>
+      <w:proofErr w:type="spellEnd"/>
+      <w:r>
+        <w:rPr>
+          <w:rFonts w:ascii="Times New Roman" w:hAnsi="Times New Roman" w:cs="Times New Roman"/>
+        </w:rPr>
+        <w:t xml:space="preserve">, which uses the Google Places API (New) in both Nearby Search and Text Search to retrieve real, live restaurant data close to the user's actual location for both marker display and the search bar. The search bar itself has also gained a </w:t>
+      </w:r>
+      <w:proofErr w:type="spellStart"/>
+      <w:r>
+        <w:rPr>
+          <w:rFonts w:ascii="Times New Roman" w:hAnsi="Times New Roman" w:cs="Times New Roman"/>
+        </w:rPr>
+        <w:t>debounced</w:t>
+      </w:r>
+      <w:proofErr w:type="spellEnd"/>
+      <w:r>
+        <w:rPr>
+          <w:rFonts w:ascii="Times New Roman" w:hAnsi="Times New Roman" w:cs="Times New Roman"/>
+        </w:rPr>
+        <w:t xml:space="preserve"> (600 </w:t>
+      </w:r>
+      <w:proofErr w:type="spellStart"/>
+      <w:r>
+        <w:rPr>
+          <w:rFonts w:ascii="Times New Roman" w:hAnsi="Times New Roman" w:cs="Times New Roman"/>
+        </w:rPr>
+        <w:t>ms</w:t>
+      </w:r>
+      <w:proofErr w:type="spellEnd"/>
+      <w:r>
+        <w:rPr>
+          <w:rFonts w:ascii="Times New Roman" w:hAnsi="Times New Roman" w:cs="Times New Roman"/>
+        </w:rPr>
+        <w:t xml:space="preserve">) live search using the Places Text Search API, in </w:t>
       </w:r>
       <w:r>
         <w:rPr>
@@ -8241,189 +9410,225 @@
           <w:rFonts w:cs="Times New Roman"/>
         </w:rPr>
       </w:pPr>
-      <w:bookmarkStart w:id="84" w:name="conclusion"/>
-      <w:bookmarkStart w:id="85" w:name="_Toc237982819"/>
+      <w:bookmarkStart w:id="84" w:name="_Toc237982819"/>
+      <w:bookmarkStart w:id="85" w:name="conclusion"/>
       <w:bookmarkEnd w:id="75"/>
       <w:bookmarkEnd w:id="82"/>
-      <w:r>
+    </w:p>
+    <w:p>
+      <w:pPr>
+        <w:pStyle w:val="Heading1"/>
         <w:rPr>
           <w:rFonts w:cs="Times New Roman"/>
         </w:rPr>
+      </w:pPr>
+      <w:r>
+        <w:rPr>
+          <w:rFonts w:cs="Times New Roman"/>
+        </w:rPr>
         <w:t>Conclusion</w:t>
       </w:r>
+      <w:bookmarkEnd w:id="84"/>
+    </w:p>
+    <w:p>
+      <w:pPr>
+        <w:pStyle w:val="BodyText"/>
+        <w:rPr>
+          <w:rFonts w:ascii="Times New Roman" w:hAnsi="Times New Roman" w:cs="Times New Roman"/>
+        </w:rPr>
+      </w:pPr>
+      <w:r>
+        <w:rPr>
+          <w:rFonts w:ascii="Times New Roman" w:hAnsi="Times New Roman" w:cs="Times New Roman"/>
+        </w:rPr>
+        <w:t xml:space="preserve">Spot </w:t>
+      </w:r>
+      <w:proofErr w:type="gramStart"/>
+      <w:r>
+        <w:rPr>
+          <w:rFonts w:ascii="Times New Roman" w:hAnsi="Times New Roman" w:cs="Times New Roman"/>
+        </w:rPr>
+        <w:t>To</w:t>
+      </w:r>
+      <w:proofErr w:type="gramEnd"/>
+      <w:r>
+        <w:rPr>
+          <w:rFonts w:ascii="Times New Roman" w:hAnsi="Times New Roman" w:cs="Times New Roman"/>
+        </w:rPr>
+        <w:t xml:space="preserve"> Go has gone from a simple idea to a fully functional Android application. All the screens from the initial prototype have been built, designed uniformly and combined into one tested navigation flow; real authentication controls have been put in place before the map screen to limit access to it; the map itself shows the actual location of the user and real restaurants nearby as retrieved from the Google Places API, every one of which can be previewed in a real video or get directions to by just tapping the respective button; and the search bar can be used to interpret natural language queries about the aforementioned live restaurant data. All the objectives outlined in Section 2 have been fulfilled; and due to the architecture being composed of a single interface of the </w:t>
+      </w:r>
+      <w:proofErr w:type="spellStart"/>
+      <w:r>
+        <w:rPr>
+          <w:rFonts w:ascii="Times New Roman" w:hAnsi="Times New Roman" w:cs="Times New Roman"/>
+        </w:rPr>
+        <w:t>RestaurantRepository</w:t>
+      </w:r>
+      <w:proofErr w:type="spellEnd"/>
+      <w:r>
+        <w:rPr>
+          <w:rFonts w:ascii="Times New Roman" w:hAnsi="Times New Roman" w:cs="Times New Roman"/>
+        </w:rPr>
+        <w:t xml:space="preserve"> behind the Map screen, going from the placeholder data to the real one did not require rebuilding the already-built screens.</w:t>
+      </w:r>
+    </w:p>
+    <w:p>
+      <w:pPr>
+        <w:pStyle w:val="BodyText"/>
+        <w:rPr>
+          <w:rFonts w:ascii="Times New Roman" w:hAnsi="Times New Roman" w:cs="Times New Roman"/>
+        </w:rPr>
+      </w:pPr>
+      <w:r>
+        <w:rPr>
+          <w:rFonts w:ascii="Times New Roman" w:hAnsi="Times New Roman" w:cs="Times New Roman"/>
+        </w:rPr>
+        <w:t xml:space="preserve">The heuristic evaluation (Section 6.2) and an automated </w:t>
+      </w:r>
+      <w:proofErr w:type="spellStart"/>
+      <w:r>
+        <w:rPr>
+          <w:rFonts w:ascii="Times New Roman" w:hAnsi="Times New Roman" w:cs="Times New Roman"/>
+        </w:rPr>
+        <w:t>testsuite</w:t>
+      </w:r>
+      <w:proofErr w:type="spellEnd"/>
+      <w:r>
+        <w:rPr>
+          <w:rFonts w:ascii="Times New Roman" w:hAnsi="Times New Roman" w:cs="Times New Roman"/>
+        </w:rPr>
+        <w:t xml:space="preserve"> (Section 6.1) included when integrating the Places API have given sufficient reason to trust the functionality of the application. The participant-based usability testing, listed as future work in Section 8.3, remains the natural next step to verify that confidence with real users' </w:t>
+      </w:r>
+      <w:proofErr w:type="spellStart"/>
+      <w:r>
+        <w:rPr>
+          <w:rFonts w:ascii="Times New Roman" w:hAnsi="Times New Roman" w:cs="Times New Roman"/>
+        </w:rPr>
+        <w:t>behaviour</w:t>
+      </w:r>
+      <w:proofErr w:type="spellEnd"/>
+    </w:p>
+    <w:p>
+      <w:pPr>
+        <w:pStyle w:val="BodyText"/>
+        <w:rPr>
+          <w:rFonts w:ascii="Times New Roman" w:hAnsi="Times New Roman" w:cs="Times New Roman"/>
+        </w:rPr>
+      </w:pPr>
+    </w:p>
+    <w:p>
+      <w:pPr>
+        <w:pStyle w:val="BodyText"/>
+        <w:rPr>
+          <w:rFonts w:ascii="Times New Roman" w:hAnsi="Times New Roman" w:cs="Times New Roman"/>
+        </w:rPr>
+      </w:pPr>
+    </w:p>
+    <w:p>
+      <w:pPr>
+        <w:pStyle w:val="BodyText"/>
+        <w:rPr>
+          <w:rFonts w:ascii="Times New Roman" w:hAnsi="Times New Roman" w:cs="Times New Roman"/>
+        </w:rPr>
+      </w:pPr>
+    </w:p>
+    <w:p>
+      <w:pPr>
+        <w:pStyle w:val="BodyText"/>
+        <w:rPr>
+          <w:rFonts w:ascii="Times New Roman" w:hAnsi="Times New Roman" w:cs="Times New Roman"/>
+        </w:rPr>
+      </w:pPr>
+    </w:p>
+    <w:p>
+      <w:pPr>
+        <w:pStyle w:val="BodyText"/>
+        <w:rPr>
+          <w:rFonts w:ascii="Times New Roman" w:hAnsi="Times New Roman" w:cs="Times New Roman"/>
+        </w:rPr>
+      </w:pPr>
+    </w:p>
+    <w:p>
+      <w:pPr>
+        <w:pStyle w:val="BodyText"/>
+        <w:rPr>
+          <w:rFonts w:ascii="Times New Roman" w:hAnsi="Times New Roman" w:cs="Times New Roman"/>
+        </w:rPr>
+      </w:pPr>
+    </w:p>
+    <w:p>
+      <w:pPr>
+        <w:pStyle w:val="BodyText"/>
+        <w:rPr>
+          <w:rFonts w:ascii="Times New Roman" w:hAnsi="Times New Roman" w:cs="Times New Roman"/>
+        </w:rPr>
+      </w:pPr>
+    </w:p>
+    <w:p>
+      <w:pPr>
+        <w:pStyle w:val="BodyText"/>
+        <w:rPr>
+          <w:rFonts w:ascii="Times New Roman" w:hAnsi="Times New Roman" w:cs="Times New Roman"/>
+        </w:rPr>
+      </w:pPr>
+    </w:p>
+    <w:p>
+      <w:pPr>
+        <w:pStyle w:val="BodyText"/>
+        <w:rPr>
+          <w:rFonts w:ascii="Times New Roman" w:hAnsi="Times New Roman" w:cs="Times New Roman"/>
+        </w:rPr>
+      </w:pPr>
+    </w:p>
+    <w:p>
+      <w:pPr>
+        <w:pStyle w:val="BodyText"/>
+        <w:rPr>
+          <w:rFonts w:ascii="Times New Roman" w:hAnsi="Times New Roman" w:cs="Times New Roman"/>
+        </w:rPr>
+      </w:pPr>
+    </w:p>
+    <w:p>
+      <w:pPr>
+        <w:pStyle w:val="BodyText"/>
+        <w:rPr>
+          <w:rFonts w:ascii="Times New Roman" w:hAnsi="Times New Roman" w:cs="Times New Roman"/>
+        </w:rPr>
+      </w:pPr>
+    </w:p>
+    <w:p>
+      <w:pPr>
+        <w:pStyle w:val="BodyText"/>
+        <w:rPr>
+          <w:rFonts w:ascii="Times New Roman" w:hAnsi="Times New Roman" w:cs="Times New Roman"/>
+        </w:rPr>
+      </w:pPr>
+    </w:p>
+    <w:p>
+      <w:pPr>
+        <w:pStyle w:val="BodyText"/>
+        <w:rPr>
+          <w:rFonts w:ascii="Times New Roman" w:hAnsi="Times New Roman" w:cs="Times New Roman"/>
+        </w:rPr>
+      </w:pPr>
+    </w:p>
+    <w:p>
+      <w:pPr>
+        <w:pStyle w:val="Heading1"/>
+        <w:rPr>
+          <w:rFonts w:cs="Times New Roman"/>
+        </w:rPr>
+      </w:pPr>
+      <w:bookmarkStart w:id="86" w:name="_Toc237982820"/>
+      <w:bookmarkStart w:id="87" w:name="bibliography"/>
       <w:bookmarkEnd w:id="85"/>
-    </w:p>
-    <w:p>
-      <w:pPr>
-        <w:pStyle w:val="BodyText"/>
-        <w:rPr>
-          <w:rFonts w:ascii="Times New Roman" w:hAnsi="Times New Roman" w:cs="Times New Roman"/>
-        </w:rPr>
-      </w:pPr>
-      <w:r>
-        <w:rPr>
-          <w:rFonts w:ascii="Times New Roman" w:hAnsi="Times New Roman" w:cs="Times New Roman"/>
-        </w:rPr>
-        <w:t xml:space="preserve">Spot </w:t>
-      </w:r>
-      <w:proofErr w:type="gramStart"/>
-      <w:r>
-        <w:rPr>
-          <w:rFonts w:ascii="Times New Roman" w:hAnsi="Times New Roman" w:cs="Times New Roman"/>
-        </w:rPr>
-        <w:t>To</w:t>
-      </w:r>
-      <w:proofErr w:type="gramEnd"/>
-      <w:r>
-        <w:rPr>
-          <w:rFonts w:ascii="Times New Roman" w:hAnsi="Times New Roman" w:cs="Times New Roman"/>
-        </w:rPr>
-        <w:t xml:space="preserve"> Go has gone from a simple idea to a fully functional Android application. All the screens from the initial prototype have been built, designed uniformly and combined into one tested navigation flow; real authentication controls have been put in place before the map screen to limit access to it; the map itself shows the actual location of the user and real restaurants </w:t>
-      </w:r>
-      <w:r>
-        <w:rPr>
-          <w:rFonts w:ascii="Times New Roman" w:hAnsi="Times New Roman" w:cs="Times New Roman"/>
-        </w:rPr>
-        <w:lastRenderedPageBreak/>
-        <w:t>nearby as retrieved from the Google Places API, every one of which can be previewed in a real video or get directions to by just tapping the respective button; and the search bar can be used to interpret natural language queries about the aforementioned live restaurant data. All the objectives outlined in Section 2 have been fulfilled; and due to the architecture being composed of a single interface of the RestaurantRepository behind the Map screen, going from the placeholder data to the real one did not require rebuilding the already-built screens.</w:t>
-      </w:r>
-    </w:p>
-    <w:p>
-      <w:pPr>
-        <w:pStyle w:val="BodyText"/>
-        <w:rPr>
-          <w:rFonts w:ascii="Times New Roman" w:hAnsi="Times New Roman" w:cs="Times New Roman"/>
-        </w:rPr>
-      </w:pPr>
-      <w:r>
-        <w:rPr>
-          <w:rFonts w:ascii="Times New Roman" w:hAnsi="Times New Roman" w:cs="Times New Roman"/>
-        </w:rPr>
-        <w:t>The heuristic evaluation (Section 6.2) and an automated testsuite (Section 6.1) included when integrating the Places API have given sufficient reason to trust the functionality of the application. The participant-based usability testing, listed as future work in Section 8.3, remains the natural next step to verify that confidence with real users' behaviour</w:t>
-      </w:r>
-    </w:p>
-    <w:p>
-      <w:pPr>
-        <w:pStyle w:val="BodyText"/>
-        <w:rPr>
-          <w:rFonts w:ascii="Times New Roman" w:hAnsi="Times New Roman" w:cs="Times New Roman"/>
-        </w:rPr>
-      </w:pPr>
-    </w:p>
-    <w:p>
-      <w:pPr>
-        <w:pStyle w:val="BodyText"/>
-        <w:rPr>
-          <w:rFonts w:ascii="Times New Roman" w:hAnsi="Times New Roman" w:cs="Times New Roman"/>
-        </w:rPr>
-      </w:pPr>
-    </w:p>
-    <w:p>
-      <w:pPr>
-        <w:pStyle w:val="BodyText"/>
-        <w:rPr>
-          <w:rFonts w:ascii="Times New Roman" w:hAnsi="Times New Roman" w:cs="Times New Roman"/>
-        </w:rPr>
-      </w:pPr>
-    </w:p>
-    <w:p>
-      <w:pPr>
-        <w:pStyle w:val="BodyText"/>
-        <w:rPr>
-          <w:rFonts w:ascii="Times New Roman" w:hAnsi="Times New Roman" w:cs="Times New Roman"/>
-        </w:rPr>
-      </w:pPr>
-    </w:p>
-    <w:p>
-      <w:pPr>
-        <w:pStyle w:val="BodyText"/>
-        <w:rPr>
-          <w:rFonts w:ascii="Times New Roman" w:hAnsi="Times New Roman" w:cs="Times New Roman"/>
-        </w:rPr>
-      </w:pPr>
-    </w:p>
-    <w:p>
-      <w:pPr>
-        <w:pStyle w:val="BodyText"/>
-        <w:rPr>
-          <w:rFonts w:ascii="Times New Roman" w:hAnsi="Times New Roman" w:cs="Times New Roman"/>
-        </w:rPr>
-      </w:pPr>
-    </w:p>
-    <w:p>
-      <w:pPr>
-        <w:pStyle w:val="BodyText"/>
-        <w:rPr>
-          <w:rFonts w:ascii="Times New Roman" w:hAnsi="Times New Roman" w:cs="Times New Roman"/>
-        </w:rPr>
-      </w:pPr>
-    </w:p>
-    <w:p>
-      <w:pPr>
-        <w:pStyle w:val="BodyText"/>
-        <w:rPr>
-          <w:rFonts w:ascii="Times New Roman" w:hAnsi="Times New Roman" w:cs="Times New Roman"/>
-        </w:rPr>
-      </w:pPr>
-    </w:p>
-    <w:p>
-      <w:pPr>
-        <w:pStyle w:val="BodyText"/>
-        <w:rPr>
-          <w:rFonts w:ascii="Times New Roman" w:hAnsi="Times New Roman" w:cs="Times New Roman"/>
-        </w:rPr>
-      </w:pPr>
-    </w:p>
-    <w:p>
-      <w:pPr>
-        <w:pStyle w:val="BodyText"/>
-        <w:rPr>
-          <w:rFonts w:ascii="Times New Roman" w:hAnsi="Times New Roman" w:cs="Times New Roman"/>
-        </w:rPr>
-      </w:pPr>
-    </w:p>
-    <w:p>
-      <w:pPr>
-        <w:pStyle w:val="BodyText"/>
-        <w:rPr>
-          <w:rFonts w:ascii="Times New Roman" w:hAnsi="Times New Roman" w:cs="Times New Roman"/>
-        </w:rPr>
-      </w:pPr>
-    </w:p>
-    <w:p>
-      <w:pPr>
-        <w:pStyle w:val="BodyText"/>
-        <w:rPr>
-          <w:rFonts w:ascii="Times New Roman" w:hAnsi="Times New Roman" w:cs="Times New Roman"/>
-        </w:rPr>
-      </w:pPr>
-    </w:p>
-    <w:p>
-      <w:pPr>
-        <w:pStyle w:val="BodyText"/>
-        <w:rPr>
-          <w:rFonts w:ascii="Times New Roman" w:hAnsi="Times New Roman" w:cs="Times New Roman"/>
-        </w:rPr>
-      </w:pPr>
-    </w:p>
-    <w:p>
-      <w:pPr>
-        <w:pStyle w:val="Heading1"/>
+      <w:r>
         <w:rPr>
           <w:rFonts w:cs="Times New Roman"/>
         </w:rPr>
-      </w:pPr>
-      <w:bookmarkStart w:id="86" w:name="bibliography"/>
-      <w:bookmarkStart w:id="87" w:name="_Toc237982820"/>
-      <w:bookmarkEnd w:id="84"/>
-      <w:r>
-        <w:rPr>
-          <w:rFonts w:cs="Times New Roman"/>
-        </w:rPr>
-        <w:lastRenderedPageBreak/>
         <w:t>References</w:t>
       </w:r>
-      <w:bookmarkEnd w:id="87"/>
+      <w:bookmarkEnd w:id="86"/>
     </w:p>
     <w:p>
       <w:pPr>
@@ -8438,11 +9643,47 @@
       </w:pPr>
       <w:bookmarkStart w:id="88" w:name="ref-adomavicius2005"/>
       <w:bookmarkStart w:id="89" w:name="refs"/>
-      <w:r>
-        <w:rPr>
-          <w:rFonts w:ascii="Times New Roman" w:hAnsi="Times New Roman" w:cs="Times New Roman"/>
-        </w:rPr>
-        <w:t xml:space="preserve">Adomavicius, Gediminas, and Alexander Tuzhilin. 2005. “Toward the Next Generation of Recommender Systems: A Survey of the State-of-the-Art and Possible Extensions.” </w:t>
+      <w:proofErr w:type="spellStart"/>
+      <w:r>
+        <w:rPr>
+          <w:rFonts w:ascii="Times New Roman" w:hAnsi="Times New Roman" w:cs="Times New Roman"/>
+        </w:rPr>
+        <w:t>Adomavicius</w:t>
+      </w:r>
+      <w:proofErr w:type="spellEnd"/>
+      <w:r>
+        <w:rPr>
+          <w:rFonts w:ascii="Times New Roman" w:hAnsi="Times New Roman" w:cs="Times New Roman"/>
+        </w:rPr>
+        <w:t xml:space="preserve">, </w:t>
+      </w:r>
+      <w:proofErr w:type="spellStart"/>
+      <w:r>
+        <w:rPr>
+          <w:rFonts w:ascii="Times New Roman" w:hAnsi="Times New Roman" w:cs="Times New Roman"/>
+        </w:rPr>
+        <w:t>Gediminas</w:t>
+      </w:r>
+      <w:proofErr w:type="spellEnd"/>
+      <w:r>
+        <w:rPr>
+          <w:rFonts w:ascii="Times New Roman" w:hAnsi="Times New Roman" w:cs="Times New Roman"/>
+        </w:rPr>
+        <w:t xml:space="preserve">, and Alexander </w:t>
+      </w:r>
+      <w:proofErr w:type="spellStart"/>
+      <w:r>
+        <w:rPr>
+          <w:rFonts w:ascii="Times New Roman" w:hAnsi="Times New Roman" w:cs="Times New Roman"/>
+        </w:rPr>
+        <w:t>Tuzhilin</w:t>
+      </w:r>
+      <w:proofErr w:type="spellEnd"/>
+      <w:r>
+        <w:rPr>
+          <w:rFonts w:ascii="Times New Roman" w:hAnsi="Times New Roman" w:cs="Times New Roman"/>
+        </w:rPr>
+        <w:t xml:space="preserve">. 2005. “Toward the Next Generation of Recommender Systems: A Survey of the State-of-the-Art and Possible Extensions.” </w:t>
       </w:r>
       <w:r>
         <w:rPr>
@@ -8472,11 +9713,61 @@
       </w:pPr>
       <w:bookmarkStart w:id="90" w:name="ref-bao2012"/>
       <w:bookmarkEnd w:id="88"/>
-      <w:r>
-        <w:rPr>
-          <w:rFonts w:ascii="Times New Roman" w:hAnsi="Times New Roman" w:cs="Times New Roman"/>
-        </w:rPr>
-        <w:t xml:space="preserve">Bao, Jie, Yu Zheng, and Mohamed F. Mokbel. 2012. “Location-Based and Preference-Aware Recommendation Using Sparse Geo-Social Networking Data.” </w:t>
+      <w:proofErr w:type="spellStart"/>
+      <w:r>
+        <w:rPr>
+          <w:rFonts w:ascii="Times New Roman" w:hAnsi="Times New Roman" w:cs="Times New Roman"/>
+        </w:rPr>
+        <w:t>Bao</w:t>
+      </w:r>
+      <w:proofErr w:type="spellEnd"/>
+      <w:r>
+        <w:rPr>
+          <w:rFonts w:ascii="Times New Roman" w:hAnsi="Times New Roman" w:cs="Times New Roman"/>
+        </w:rPr>
+        <w:t xml:space="preserve">, </w:t>
+      </w:r>
+      <w:proofErr w:type="spellStart"/>
+      <w:r>
+        <w:rPr>
+          <w:rFonts w:ascii="Times New Roman" w:hAnsi="Times New Roman" w:cs="Times New Roman"/>
+        </w:rPr>
+        <w:t>Jie</w:t>
+      </w:r>
+      <w:proofErr w:type="spellEnd"/>
+      <w:r>
+        <w:rPr>
+          <w:rFonts w:ascii="Times New Roman" w:hAnsi="Times New Roman" w:cs="Times New Roman"/>
+        </w:rPr>
+        <w:t xml:space="preserve">, Yu </w:t>
+      </w:r>
+      <w:proofErr w:type="spellStart"/>
+      <w:r>
+        <w:rPr>
+          <w:rFonts w:ascii="Times New Roman" w:hAnsi="Times New Roman" w:cs="Times New Roman"/>
+        </w:rPr>
+        <w:t>Zheng</w:t>
+      </w:r>
+      <w:proofErr w:type="spellEnd"/>
+      <w:r>
+        <w:rPr>
+          <w:rFonts w:ascii="Times New Roman" w:hAnsi="Times New Roman" w:cs="Times New Roman"/>
+        </w:rPr>
+        <w:t xml:space="preserve">, and Mohamed F. </w:t>
+      </w:r>
+      <w:proofErr w:type="spellStart"/>
+      <w:r>
+        <w:rPr>
+          <w:rFonts w:ascii="Times New Roman" w:hAnsi="Times New Roman" w:cs="Times New Roman"/>
+        </w:rPr>
+        <w:t>Mokbel</w:t>
+      </w:r>
+      <w:proofErr w:type="spellEnd"/>
+      <w:r>
+        <w:rPr>
+          <w:rFonts w:ascii="Times New Roman" w:hAnsi="Times New Roman" w:cs="Times New Roman"/>
+        </w:rPr>
+        <w:t xml:space="preserve">. 2012. “Location-Based and Preference-Aware Recommendation Using Sparse Geo-Social Networking Data.” </w:t>
       </w:r>
       <w:r>
         <w:rPr>
@@ -8506,11 +9797,75 @@
       </w:pPr>
       <w:bookmarkStart w:id="91" w:name="ref-barta2023"/>
       <w:bookmarkEnd w:id="90"/>
-      <w:r>
-        <w:rPr>
-          <w:rFonts w:ascii="Times New Roman" w:hAnsi="Times New Roman" w:cs="Times New Roman"/>
-        </w:rPr>
-        <w:t xml:space="preserve">Barta, Sergio, Daniel Belanche, Ana Fernández, and Marta Flavián. 2023. “Influencer Marketing on TikTok: The Effectiveness of Humor and Followers’ Hedonic Experience.” </w:t>
+      <w:proofErr w:type="spellStart"/>
+      <w:r>
+        <w:rPr>
+          <w:rFonts w:ascii="Times New Roman" w:hAnsi="Times New Roman" w:cs="Times New Roman"/>
+        </w:rPr>
+        <w:t>Barta</w:t>
+      </w:r>
+      <w:proofErr w:type="spellEnd"/>
+      <w:r>
+        <w:rPr>
+          <w:rFonts w:ascii="Times New Roman" w:hAnsi="Times New Roman" w:cs="Times New Roman"/>
+        </w:rPr>
+        <w:t xml:space="preserve">, Sergio, Daniel </w:t>
+      </w:r>
+      <w:proofErr w:type="spellStart"/>
+      <w:r>
+        <w:rPr>
+          <w:rFonts w:ascii="Times New Roman" w:hAnsi="Times New Roman" w:cs="Times New Roman"/>
+        </w:rPr>
+        <w:t>Belanche</w:t>
+      </w:r>
+      <w:proofErr w:type="spellEnd"/>
+      <w:r>
+        <w:rPr>
+          <w:rFonts w:ascii="Times New Roman" w:hAnsi="Times New Roman" w:cs="Times New Roman"/>
+        </w:rPr>
+        <w:t xml:space="preserve">, Ana </w:t>
+      </w:r>
+      <w:proofErr w:type="spellStart"/>
+      <w:r>
+        <w:rPr>
+          <w:rFonts w:ascii="Times New Roman" w:hAnsi="Times New Roman" w:cs="Times New Roman"/>
+        </w:rPr>
+        <w:t>Fernández</w:t>
+      </w:r>
+      <w:proofErr w:type="spellEnd"/>
+      <w:r>
+        <w:rPr>
+          <w:rFonts w:ascii="Times New Roman" w:hAnsi="Times New Roman" w:cs="Times New Roman"/>
+        </w:rPr>
+        <w:t xml:space="preserve">, and Marta </w:t>
+      </w:r>
+      <w:proofErr w:type="spellStart"/>
+      <w:r>
+        <w:rPr>
+          <w:rFonts w:ascii="Times New Roman" w:hAnsi="Times New Roman" w:cs="Times New Roman"/>
+        </w:rPr>
+        <w:t>Flavián</w:t>
+      </w:r>
+      <w:proofErr w:type="spellEnd"/>
+      <w:r>
+        <w:rPr>
+          <w:rFonts w:ascii="Times New Roman" w:hAnsi="Times New Roman" w:cs="Times New Roman"/>
+        </w:rPr>
+        <w:t xml:space="preserve">. 2023. “Influencer Marketing on </w:t>
+      </w:r>
+      <w:proofErr w:type="spellStart"/>
+      <w:r>
+        <w:rPr>
+          <w:rFonts w:ascii="Times New Roman" w:hAnsi="Times New Roman" w:cs="Times New Roman"/>
+        </w:rPr>
+        <w:t>TikTok</w:t>
+      </w:r>
+      <w:proofErr w:type="spellEnd"/>
+      <w:r>
+        <w:rPr>
+          <w:rFonts w:ascii="Times New Roman" w:hAnsi="Times New Roman" w:cs="Times New Roman"/>
+        </w:rPr>
+        <w:t xml:space="preserve">: The Effectiveness of Humor and Followers’ Hedonic Experience.” </w:t>
       </w:r>
       <w:r>
         <w:rPr>
@@ -8544,7 +9899,21 @@
         <w:rPr>
           <w:rFonts w:ascii="Times New Roman" w:hAnsi="Times New Roman" w:cs="Times New Roman"/>
         </w:rPr>
-        <w:t xml:space="preserve">Cheung, Christy M. K., Matthew K. O. Lee, and Neil Rabjohn. 2009. “The Impact of Electronic Word-of-Mouth: The Adoption of Online Opinions in Online Customer Communities.” </w:t>
+        <w:t xml:space="preserve">Cheung, Christy M. K., Matthew K. O. Lee, and Neil </w:t>
+      </w:r>
+      <w:proofErr w:type="spellStart"/>
+      <w:r>
+        <w:rPr>
+          <w:rFonts w:ascii="Times New Roman" w:hAnsi="Times New Roman" w:cs="Times New Roman"/>
+        </w:rPr>
+        <w:t>Rabjohn</w:t>
+      </w:r>
+      <w:proofErr w:type="spellEnd"/>
+      <w:r>
+        <w:rPr>
+          <w:rFonts w:ascii="Times New Roman" w:hAnsi="Times New Roman" w:cs="Times New Roman"/>
+        </w:rPr>
+        <w:t xml:space="preserve">. 2009. “The Impact of Electronic Word-of-Mouth: The Adoption of Online Opinions in Online Customer Communities.” </w:t>
       </w:r>
       <w:r>
         <w:rPr>
@@ -8574,11 +9943,33 @@
       </w:pPr>
       <w:bookmarkStart w:id="93" w:name="ref-dellarocas2003"/>
       <w:bookmarkEnd w:id="92"/>
-      <w:r>
-        <w:rPr>
-          <w:rFonts w:ascii="Times New Roman" w:hAnsi="Times New Roman" w:cs="Times New Roman"/>
-        </w:rPr>
-        <w:t xml:space="preserve">Dellarocas, Chrysanthos. 2003. “The Digitization of Word of Mouth: Promise and Challenges of Online Feedback Mechanisms.” </w:t>
+      <w:proofErr w:type="spellStart"/>
+      <w:r>
+        <w:rPr>
+          <w:rFonts w:ascii="Times New Roman" w:hAnsi="Times New Roman" w:cs="Times New Roman"/>
+        </w:rPr>
+        <w:t>Dellarocas</w:t>
+      </w:r>
+      <w:proofErr w:type="spellEnd"/>
+      <w:r>
+        <w:rPr>
+          <w:rFonts w:ascii="Times New Roman" w:hAnsi="Times New Roman" w:cs="Times New Roman"/>
+        </w:rPr>
+        <w:t xml:space="preserve">, </w:t>
+      </w:r>
+      <w:proofErr w:type="spellStart"/>
+      <w:r>
+        <w:rPr>
+          <w:rFonts w:ascii="Times New Roman" w:hAnsi="Times New Roman" w:cs="Times New Roman"/>
+        </w:rPr>
+        <w:t>Chrysanthos</w:t>
+      </w:r>
+      <w:proofErr w:type="spellEnd"/>
+      <w:r>
+        <w:rPr>
+          <w:rFonts w:ascii="Times New Roman" w:hAnsi="Times New Roman" w:cs="Times New Roman"/>
+        </w:rPr>
+        <w:t xml:space="preserve">. 2003. “The Digitization of Word of Mouth: Promise and Challenges of Online Feedback Mechanisms.” </w:t>
       </w:r>
       <w:r>
         <w:rPr>
@@ -8608,11 +9999,33 @@
       </w:pPr>
       <w:bookmarkStart w:id="94" w:name="ref-dey2001"/>
       <w:bookmarkEnd w:id="93"/>
-      <w:r>
-        <w:rPr>
-          <w:rFonts w:ascii="Times New Roman" w:hAnsi="Times New Roman" w:cs="Times New Roman"/>
-        </w:rPr>
-        <w:t xml:space="preserve">Dey, Anind K. 2001. “Understanding and Using Context.” </w:t>
+      <w:proofErr w:type="spellStart"/>
+      <w:r>
+        <w:rPr>
+          <w:rFonts w:ascii="Times New Roman" w:hAnsi="Times New Roman" w:cs="Times New Roman"/>
+        </w:rPr>
+        <w:t>Dey</w:t>
+      </w:r>
+      <w:proofErr w:type="spellEnd"/>
+      <w:r>
+        <w:rPr>
+          <w:rFonts w:ascii="Times New Roman" w:hAnsi="Times New Roman" w:cs="Times New Roman"/>
+        </w:rPr>
+        <w:t xml:space="preserve">, </w:t>
+      </w:r>
+      <w:proofErr w:type="spellStart"/>
+      <w:r>
+        <w:rPr>
+          <w:rFonts w:ascii="Times New Roman" w:hAnsi="Times New Roman" w:cs="Times New Roman"/>
+        </w:rPr>
+        <w:t>Anind</w:t>
+      </w:r>
+      <w:proofErr w:type="spellEnd"/>
+      <w:r>
+        <w:rPr>
+          <w:rFonts w:ascii="Times New Roman" w:hAnsi="Times New Roman" w:cs="Times New Roman"/>
+        </w:rPr>
+        <w:t xml:space="preserve"> K. 2001. “Understanding and Using Context.” </w:t>
       </w:r>
       <w:r>
         <w:rPr>
@@ -8744,6 +10157,7 @@
         <w:rPr>
           <w:rFonts w:ascii="Times New Roman" w:hAnsi="Times New Roman" w:cs="Times New Roman"/>
         </w:rPr>
+        <w:lastRenderedPageBreak/>
         <w:t xml:space="preserve">Google LLC. 2024c. </w:t>
       </w:r>
       <w:r>
@@ -8842,8 +10256,21 @@
         <w:rPr>
           <w:rFonts w:ascii="Times New Roman" w:hAnsi="Times New Roman" w:cs="Times New Roman"/>
         </w:rPr>
-        <w:lastRenderedPageBreak/>
-        <w:t xml:space="preserve">Kaplan, Andreas M., and Michael Haenlein. 2010. “Users of the World, Unite! The Challenges and Opportunities of Social Media.” </w:t>
+        <w:t xml:space="preserve">Kaplan, Andreas M., and Michael </w:t>
+      </w:r>
+      <w:proofErr w:type="spellStart"/>
+      <w:r>
+        <w:rPr>
+          <w:rFonts w:ascii="Times New Roman" w:hAnsi="Times New Roman" w:cs="Times New Roman"/>
+        </w:rPr>
+        <w:t>Haenlein</w:t>
+      </w:r>
+      <w:proofErr w:type="spellEnd"/>
+      <w:r>
+        <w:rPr>
+          <w:rFonts w:ascii="Times New Roman" w:hAnsi="Times New Roman" w:cs="Times New Roman"/>
+        </w:rPr>
+        <w:t xml:space="preserve">. 2010. “Users of the World, Unite! The Challenges and Opportunities of Social Media.” </w:t>
       </w:r>
       <w:r>
         <w:rPr>
@@ -8891,7 +10318,35 @@
         <w:rPr>
           <w:rFonts w:ascii="Times New Roman" w:hAnsi="Times New Roman" w:cs="Times New Roman"/>
         </w:rPr>
-        <w:t>. DataReportal, in partnership with We Are Social and Meltwater.</w:t>
+        <w:t xml:space="preserve">. </w:t>
+      </w:r>
+      <w:proofErr w:type="spellStart"/>
+      <w:r>
+        <w:rPr>
+          <w:rFonts w:ascii="Times New Roman" w:hAnsi="Times New Roman" w:cs="Times New Roman"/>
+        </w:rPr>
+        <w:t>DataReportal</w:t>
+      </w:r>
+      <w:proofErr w:type="spellEnd"/>
+      <w:r>
+        <w:rPr>
+          <w:rFonts w:ascii="Times New Roman" w:hAnsi="Times New Roman" w:cs="Times New Roman"/>
+        </w:rPr>
+        <w:t xml:space="preserve">, in partnership with We Are Social and </w:t>
+      </w:r>
+      <w:proofErr w:type="spellStart"/>
+      <w:r>
+        <w:rPr>
+          <w:rFonts w:ascii="Times New Roman" w:hAnsi="Times New Roman" w:cs="Times New Roman"/>
+        </w:rPr>
+        <w:t>Meltwater</w:t>
+      </w:r>
+      <w:proofErr w:type="spellEnd"/>
+      <w:r>
+        <w:rPr>
+          <w:rFonts w:ascii="Times New Roman" w:hAnsi="Times New Roman" w:cs="Times New Roman"/>
+        </w:rPr>
+        <w:t>.</w:t>
       </w:r>
     </w:p>
     <w:p>
@@ -8907,11 +10362,61 @@
       </w:pPr>
       <w:bookmarkStart w:id="101" w:name="ref-montag2021"/>
       <w:bookmarkEnd w:id="100"/>
-      <w:r>
-        <w:rPr>
-          <w:rFonts w:ascii="Times New Roman" w:hAnsi="Times New Roman" w:cs="Times New Roman"/>
-        </w:rPr>
-        <w:t xml:space="preserve">Montag, Christian, Haibo Yang, and Jon D. Elhai. 2021. “On the Psychology of TikTok Use: A First Glimpse from Empirical Findings.” </w:t>
+      <w:proofErr w:type="spellStart"/>
+      <w:r>
+        <w:rPr>
+          <w:rFonts w:ascii="Times New Roman" w:hAnsi="Times New Roman" w:cs="Times New Roman"/>
+        </w:rPr>
+        <w:t>Montag</w:t>
+      </w:r>
+      <w:proofErr w:type="spellEnd"/>
+      <w:r>
+        <w:rPr>
+          <w:rFonts w:ascii="Times New Roman" w:hAnsi="Times New Roman" w:cs="Times New Roman"/>
+        </w:rPr>
+        <w:t xml:space="preserve">, Christian, </w:t>
+      </w:r>
+      <w:proofErr w:type="spellStart"/>
+      <w:r>
+        <w:rPr>
+          <w:rFonts w:ascii="Times New Roman" w:hAnsi="Times New Roman" w:cs="Times New Roman"/>
+        </w:rPr>
+        <w:t>Haibo</w:t>
+      </w:r>
+      <w:proofErr w:type="spellEnd"/>
+      <w:r>
+        <w:rPr>
+          <w:rFonts w:ascii="Times New Roman" w:hAnsi="Times New Roman" w:cs="Times New Roman"/>
+        </w:rPr>
+        <w:t xml:space="preserve"> Yang, and Jon D. </w:t>
+      </w:r>
+      <w:proofErr w:type="spellStart"/>
+      <w:r>
+        <w:rPr>
+          <w:rFonts w:ascii="Times New Roman" w:hAnsi="Times New Roman" w:cs="Times New Roman"/>
+        </w:rPr>
+        <w:t>Elhai</w:t>
+      </w:r>
+      <w:proofErr w:type="spellEnd"/>
+      <w:r>
+        <w:rPr>
+          <w:rFonts w:ascii="Times New Roman" w:hAnsi="Times New Roman" w:cs="Times New Roman"/>
+        </w:rPr>
+        <w:t xml:space="preserve">. 2021. “On the Psychology of </w:t>
+      </w:r>
+      <w:proofErr w:type="spellStart"/>
+      <w:r>
+        <w:rPr>
+          <w:rFonts w:ascii="Times New Roman" w:hAnsi="Times New Roman" w:cs="Times New Roman"/>
+        </w:rPr>
+        <w:t>TikTok</w:t>
+      </w:r>
+      <w:proofErr w:type="spellEnd"/>
+      <w:r>
+        <w:rPr>
+          <w:rFonts w:ascii="Times New Roman" w:hAnsi="Times New Roman" w:cs="Times New Roman"/>
+        </w:rPr>
+        <w:t xml:space="preserve"> Use: A First Glimpse from Empirical Findings.” </w:t>
       </w:r>
       <w:r>
         <w:rPr>
@@ -8945,7 +10450,21 @@
         <w:rPr>
           <w:rFonts w:ascii="Times New Roman" w:hAnsi="Times New Roman" w:cs="Times New Roman"/>
         </w:rPr>
-        <w:t xml:space="preserve">Nielsen, Jakob. 1994. </w:t>
+        <w:t xml:space="preserve">Nielsen, </w:t>
+      </w:r>
+      <w:proofErr w:type="spellStart"/>
+      <w:r>
+        <w:rPr>
+          <w:rFonts w:ascii="Times New Roman" w:hAnsi="Times New Roman" w:cs="Times New Roman"/>
+        </w:rPr>
+        <w:t>Jakob</w:t>
+      </w:r>
+      <w:proofErr w:type="spellEnd"/>
+      <w:r>
+        <w:rPr>
+          <w:rFonts w:ascii="Times New Roman" w:hAnsi="Times New Roman" w:cs="Times New Roman"/>
+        </w:rPr>
+        <w:t xml:space="preserve">. 1994. </w:t>
       </w:r>
       <w:r>
         <w:rPr>
@@ -8979,7 +10498,49 @@
         <w:rPr>
           <w:rFonts w:ascii="Times New Roman" w:hAnsi="Times New Roman" w:cs="Times New Roman"/>
         </w:rPr>
-        <w:t xml:space="preserve">Schiller, Jochen, and Agnès Voisard. 2004. </w:t>
+        <w:t xml:space="preserve">Schiller, </w:t>
+      </w:r>
+      <w:proofErr w:type="spellStart"/>
+      <w:r>
+        <w:rPr>
+          <w:rFonts w:ascii="Times New Roman" w:hAnsi="Times New Roman" w:cs="Times New Roman"/>
+        </w:rPr>
+        <w:t>Jochen</w:t>
+      </w:r>
+      <w:proofErr w:type="spellEnd"/>
+      <w:r>
+        <w:rPr>
+          <w:rFonts w:ascii="Times New Roman" w:hAnsi="Times New Roman" w:cs="Times New Roman"/>
+        </w:rPr>
+        <w:t xml:space="preserve">, and </w:t>
+      </w:r>
+      <w:proofErr w:type="spellStart"/>
+      <w:r>
+        <w:rPr>
+          <w:rFonts w:ascii="Times New Roman" w:hAnsi="Times New Roman" w:cs="Times New Roman"/>
+        </w:rPr>
+        <w:t>Agnès</w:t>
+      </w:r>
+      <w:proofErr w:type="spellEnd"/>
+      <w:r>
+        <w:rPr>
+          <w:rFonts w:ascii="Times New Roman" w:hAnsi="Times New Roman" w:cs="Times New Roman"/>
+        </w:rPr>
+        <w:t xml:space="preserve"> </w:t>
+      </w:r>
+      <w:proofErr w:type="spellStart"/>
+      <w:r>
+        <w:rPr>
+          <w:rFonts w:ascii="Times New Roman" w:hAnsi="Times New Roman" w:cs="Times New Roman"/>
+        </w:rPr>
+        <w:t>Voisard</w:t>
+      </w:r>
+      <w:proofErr w:type="spellEnd"/>
+      <w:r>
+        <w:rPr>
+          <w:rFonts w:ascii="Times New Roman" w:hAnsi="Times New Roman" w:cs="Times New Roman"/>
+        </w:rPr>
+        <w:t xml:space="preserve">. 2004. </w:t>
       </w:r>
       <w:r>
         <w:rPr>
@@ -9029,7 +10590,7 @@
         </w:rPr>
         <w:t>, 397–400.</w:t>
       </w:r>
-      <w:bookmarkEnd w:id="86"/>
+      <w:bookmarkEnd w:id="87"/>
       <w:bookmarkEnd w:id="89"/>
       <w:bookmarkEnd w:id="104"/>
     </w:p>
@@ -11548,7 +13109,7 @@
 </file>
 
 <file path=customXml/itemProps1.xml><?xml version="1.0" encoding="utf-8"?>
-<ds:datastoreItem xmlns:ds="http://schemas.openxmlformats.org/officeDocument/2006/customXml" ds:itemID="{B25D6C2F-A274-45E4-91EB-D5BB60246393}">
+<ds:datastoreItem xmlns:ds="http://schemas.openxmlformats.org/officeDocument/2006/customXml" ds:itemID="{D45034AB-E172-4A08-8BCF-21E0626F1198}">
   <ds:schemaRefs>
     <ds:schemaRef ds:uri="http://schemas.openxmlformats.org/officeDocument/2006/bibliography"/>
   </ds:schemaRefs>

</xml_diff>